<commit_message>
Solution document: team details and PDF
</commit_message>
<xml_diff>
--- a/docs/solution/FleetPulse_Solution_Document.docx
+++ b/docs/solution/FleetPulse_Solution_Document.docx
@@ -55,7 +55,7 @@
           <w:b/>
           <w:bCs/>
         </w:rPr>
-        <w:t>To be Submitted by: [Team Name]</w:t>
+        <w:t>To be Submitted by: Jeevan Sarasram S S (solo entry)</w:t>
       </w:r>
     </w:p>
     <w:p>
@@ -67,7 +67,7 @@
           <w:b/>
           <w:bCs/>
         </w:rPr>
-        <w:t>Team Members &amp; Roles: Jeevan Sarasram S S – [role] – jeevansiva2005@gmail.com; Sharish – [role] – [email]</w:t>
+        <w:t>Team Members &amp; Roles: Jeevan Sarasram S S (Reg. No. RA2311056010035), solo developer: problem framing, architecture, backend, data engineering, ML, DevOps and testing; js9882@srmist.edu.in, jeevansiva2005@gmail.com</w:t>
       </w:r>
     </w:p>
     <w:p>

</xml_diff>

<commit_message>
Four processor replicas, copilot help reply, docs synced with what runs
- docker compose runs 4 processors so capacity exceeds the 3x burst;
  critical-alert p95 7.0 s -> 2.6 s (evidence/alert_latency.txt)
- Copilot answers greetings/help with what it can do instead of the
  risk list
- README, ADR-0002, diagrams, demo script and the Solution Document
  (docx + Word PDF) updated: hourly partitions and incremental rollup,
  new latency figures, BDD/contract/ZAP test rows, declarations
- fill_template.py finds the repo root on Windows too
</commit_message>
<xml_diff>
--- a/docs/solution/FleetPulse_Solution_Document.docx
+++ b/docs/solution/FleetPulse_Solution_Document.docx
@@ -746,7 +746,10 @@
         <w:t xml:space="preserve">Results (measured on the submitted code). </w:t>
       </w:r>
       <w:r>
-        <w:t>100,000 simulated vehicles across 3 tenants and 2 OEM payload formats; ~5,000 events/s sustained end to end on a 4-vCPU machine with two processor replicas (CPU hot path 33.9K events/s per core); critical alert vehicle → screen p50 1.38 s (target &lt; 5 s); 100,000 vehicles scored in 14.9 s; risk model ROC-AUC 0.878 vs 0.688 for the mileage-since-service baseline and 4.2x the baseline's precision on the top 2% of the fleet; API p95 71 ms at 10 concurrent users; slowest query 174 ms → 0.58 ms; recovery from killing both processors and restarting the broker with zero data loss.</w:t>
+        <w:t xml:space="preserve">100,000 simulated vehicles across 3 tenants and 2 OEM payload formats; ~5,000 events/s sustained end to end with 3x bursts every two minutes on four processor replicas (CPU hot path 33.9K events/s per core); critical alert vehicle → screen p50 0.17 s and p95 2.6 s even through a 3x burst (target &lt; 5 s); 100,000 vehicles scored in ~10 s; risk model ROC-AUC 0.878 vs 0.688 for the mileage-since-service baseline and 4.2x the baseline's precision on the top 2% of the fleet; API p95 71 ms at 10 concurrent users; </w:t>
+      </w:r>
+      <w:r>
+        <w:t>slowest query 174 ms → 0.58 ms; recovery from killing both processors and restarting the broker with zero data loss.</w:t>
       </w:r>
     </w:p>
     <w:p>
@@ -859,6 +862,7 @@
         <w:rPr>
           <w:b/>
         </w:rPr>
+        <w:lastRenderedPageBreak/>
         <w:t xml:space="preserve">Primary user: </w:t>
       </w:r>
       <w:r>
@@ -946,15 +950,7 @@
         <w:t xml:space="preserve">Existing Alternatives: </w:t>
       </w:r>
       <w:r>
-        <w:t xml:space="preserve">Aftermarket dongles, OEM portals, </w:t>
-      </w:r>
-      <w:proofErr w:type="spellStart"/>
-      <w:r>
-        <w:t>Motorq</w:t>
-      </w:r>
-      <w:proofErr w:type="spellEnd"/>
-      <w:r>
-        <w:t xml:space="preserve"> Fuse, other telematics tools — and why they fall short</w:t>
+        <w:t>Aftermarket dongles, OEM portals, Motorq Fuse, other telematics tools — and why they fall short</w:t>
       </w:r>
     </w:p>
     <w:tbl>
@@ -981,12 +977,6 @@
         <w:gridCol w:w="1404"/>
       </w:tblGrid>
       <w:tr>
-        <w:tblPrEx>
-          <w:tblCellMar>
-            <w:top w:w="0" w:type="dxa"/>
-            <w:bottom w:w="0" w:type="dxa"/>
-          </w:tblCellMar>
-        </w:tblPrEx>
         <w:trPr>
           <w:tblHeader/>
         </w:trPr>
@@ -1128,12 +1118,6 @@
         </w:tc>
       </w:tr>
       <w:tr>
-        <w:tblPrEx>
-          <w:tblCellMar>
-            <w:top w:w="0" w:type="dxa"/>
-            <w:bottom w:w="0" w:type="dxa"/>
-          </w:tblCellMar>
-        </w:tblPrEx>
         <w:trPr>
           <w:cantSplit/>
         </w:trPr>
@@ -1247,12 +1231,6 @@
         </w:tc>
       </w:tr>
       <w:tr>
-        <w:tblPrEx>
-          <w:tblCellMar>
-            <w:top w:w="0" w:type="dxa"/>
-            <w:bottom w:w="0" w:type="dxa"/>
-          </w:tblCellMar>
-        </w:tblPrEx>
         <w:trPr>
           <w:cantSplit/>
         </w:trPr>
@@ -1366,12 +1344,6 @@
         </w:tc>
       </w:tr>
       <w:tr>
-        <w:tblPrEx>
-          <w:tblCellMar>
-            <w:top w:w="0" w:type="dxa"/>
-            <w:bottom w:w="0" w:type="dxa"/>
-          </w:tblCellMar>
-        </w:tblPrEx>
         <w:trPr>
           <w:cantSplit/>
         </w:trPr>
@@ -1485,12 +1457,6 @@
         </w:tc>
       </w:tr>
       <w:tr>
-        <w:tblPrEx>
-          <w:tblCellMar>
-            <w:top w:w="0" w:type="dxa"/>
-            <w:bottom w:w="0" w:type="dxa"/>
-          </w:tblCellMar>
-        </w:tblPrEx>
         <w:trPr>
           <w:cantSplit/>
         </w:trPr>
@@ -1604,12 +1570,6 @@
         </w:tc>
       </w:tr>
       <w:tr>
-        <w:tblPrEx>
-          <w:tblCellMar>
-            <w:top w:w="0" w:type="dxa"/>
-            <w:bottom w:w="0" w:type="dxa"/>
-          </w:tblCellMar>
-        </w:tblPrEx>
         <w:trPr>
           <w:cantSplit/>
         </w:trPr>
@@ -1777,12 +1737,6 @@
         <w:gridCol w:w="2970"/>
       </w:tblGrid>
       <w:tr>
-        <w:tblPrEx>
-          <w:tblCellMar>
-            <w:top w:w="0" w:type="dxa"/>
-            <w:bottom w:w="0" w:type="dxa"/>
-          </w:tblCellMar>
-        </w:tblPrEx>
         <w:trPr>
           <w:tblHeader/>
         </w:trPr>
@@ -1924,12 +1878,6 @@
         </w:tc>
       </w:tr>
       <w:tr>
-        <w:tblPrEx>
-          <w:tblCellMar>
-            <w:top w:w="0" w:type="dxa"/>
-            <w:bottom w:w="0" w:type="dxa"/>
-          </w:tblCellMar>
-        </w:tblPrEx>
         <w:trPr>
           <w:cantSplit/>
         </w:trPr>
@@ -2037,18 +1985,12 @@
               <w:spacing w:line="260" w:lineRule="auto"/>
             </w:pPr>
             <w:r>
-              <w:t>Measured p50 1.38 s via WebSocket timestamps</w:t>
+              <w:t>Measured p50 0.17 s, p95 2.6 s via WebSocket timestamps</w:t>
             </w:r>
           </w:p>
         </w:tc>
       </w:tr>
       <w:tr>
-        <w:tblPrEx>
-          <w:tblCellMar>
-            <w:top w:w="0" w:type="dxa"/>
-            <w:bottom w:w="0" w:type="dxa"/>
-          </w:tblCellMar>
-        </w:tblPrEx>
         <w:trPr>
           <w:cantSplit/>
         </w:trPr>
@@ -2162,12 +2104,6 @@
         </w:tc>
       </w:tr>
       <w:tr>
-        <w:tblPrEx>
-          <w:tblCellMar>
-            <w:top w:w="0" w:type="dxa"/>
-            <w:bottom w:w="0" w:type="dxa"/>
-          </w:tblCellMar>
-        </w:tblPrEx>
         <w:trPr>
           <w:cantSplit/>
         </w:trPr>
@@ -2281,12 +2217,6 @@
         </w:tc>
       </w:tr>
       <w:tr>
-        <w:tblPrEx>
-          <w:tblCellMar>
-            <w:top w:w="0" w:type="dxa"/>
-            <w:bottom w:w="0" w:type="dxa"/>
-          </w:tblCellMar>
-        </w:tblPrEx>
         <w:trPr>
           <w:cantSplit/>
         </w:trPr>
@@ -2439,7 +2369,6 @@
           <w:b/>
           <w:bCs/>
         </w:rPr>
-        <w:lastRenderedPageBreak/>
         <w:t xml:space="preserve">Wider Impact: </w:t>
       </w:r>
       <w:r>
@@ -2567,7 +2496,11 @@
         <w:spacing w:before="60" w:after="200" w:line="300" w:lineRule="auto"/>
       </w:pPr>
       <w:r>
-        <w:t>User journey: (1) a Borealis van reports coolant at 119 °C and code P0217 in OEM-specific JSON; (2) the processor normalises it, validates the VIN check digit, drops duplicates and evaluates sliding-window rules; (3) an OVERHEAT_TREND / CRITICAL_DTC alert is written idempotently and pushed over WebSocket, appearing on the dashboard ~1.4 s after the vehicle timestamp; (4) the manager opens the vehicle: 73% 7-day risk, reasons “overdue for service, coolant running hot, 12 V battery voltage low”, the coolant trend and recent alerts; (5) they click Propose work order (or ask the copilot); (6) the work order appears as proposed and a manager approves it; every step is in the audit log.</w:t>
+        <w:t xml:space="preserve">User journey: (1) a Borealis van reports coolant at 119 °C and code P0217 in OEM-specific JSON; (2) the processor normalises it, validates the VIN check digit, drops duplicates and evaluates sliding-window rules; (3) an OVERHEAT_TREND / CRITICAL_DTC alert is written idempotently and pushed over WebSocket, appearing on the dashboard ~0.2 s after the vehicle timestamp; (4) the manager opens the </w:t>
+      </w:r>
+      <w:r>
+        <w:lastRenderedPageBreak/>
+        <w:t>vehicle: 73% 7-day risk, reasons “overdue for service, coolant running hot, 12 V battery voltage low”, the coolant trend and recent alerts; (5) they click Propose work order (or ask the copilot); (6) the work order appears as proposed and a manager approves it; every step is in the audit log.</w:t>
       </w:r>
     </w:p>
     <w:p>
@@ -2575,22 +2508,26 @@
         <w:spacing w:before="60" w:after="200" w:line="300" w:lineRule="auto"/>
       </w:pPr>
       <w:r>
+        <w:rPr>
+          <w:noProof/>
+        </w:rPr>
         <w:drawing>
-          <wp:inline xmlns:a="http://schemas.openxmlformats.org/drawingml/2006/main" xmlns:pic="http://schemas.openxmlformats.org/drawingml/2006/picture">
+          <wp:inline distT="0" distB="0" distL="0" distR="0" wp14:anchorId="6B4D0280" wp14:editId="0465D72C">
             <wp:extent cx="5760720" cy="4492562"/>
+            <wp:effectExtent l="0" t="0" r="0" b="0"/>
             <wp:docPr id="1" name="Picture 1"/>
             <wp:cNvGraphicFramePr>
-              <a:graphicFrameLocks noChangeAspect="1"/>
+              <a:graphicFrameLocks xmlns:a="http://schemas.openxmlformats.org/drawingml/2006/main" noChangeAspect="1"/>
             </wp:cNvGraphicFramePr>
-            <a:graphic>
+            <a:graphic xmlns:a="http://schemas.openxmlformats.org/drawingml/2006/main">
               <a:graphicData uri="http://schemas.openxmlformats.org/drawingml/2006/picture">
-                <pic:pic>
+                <pic:pic xmlns:pic="http://schemas.openxmlformats.org/drawingml/2006/picture">
                   <pic:nvPicPr>
                     <pic:cNvPr id="0" name="dashboard.png"/>
                     <pic:cNvPicPr/>
                   </pic:nvPicPr>
                   <pic:blipFill>
-                    <a:blip r:embed="rId11"/>
+                    <a:blip r:embed="rId7"/>
                     <a:stretch>
                       <a:fillRect/>
                     </a:stretch>
@@ -2600,7 +2537,9 @@
                       <a:off x="0" y="0"/>
                       <a:ext cx="5760720" cy="4492562"/>
                     </a:xfrm>
-                    <a:prstGeom prst="rect"/>
+                    <a:prstGeom prst="rect">
+                      <a:avLst/>
+                    </a:prstGeom>
                   </pic:spPr>
                 </pic:pic>
               </a:graphicData>
@@ -2614,22 +2553,27 @@
         <w:spacing w:before="60" w:after="200" w:line="300" w:lineRule="auto"/>
       </w:pPr>
       <w:r>
+        <w:rPr>
+          <w:noProof/>
+        </w:rPr>
+        <w:lastRenderedPageBreak/>
         <w:drawing>
-          <wp:inline xmlns:a="http://schemas.openxmlformats.org/drawingml/2006/main" xmlns:pic="http://schemas.openxmlformats.org/drawingml/2006/picture">
+          <wp:inline distT="0" distB="0" distL="0" distR="0" wp14:anchorId="51FC7166" wp14:editId="5C973BA8">
             <wp:extent cx="5760720" cy="4000500"/>
+            <wp:effectExtent l="0" t="0" r="0" b="0"/>
             <wp:docPr id="2" name="Picture 2"/>
             <wp:cNvGraphicFramePr>
-              <a:graphicFrameLocks noChangeAspect="1"/>
+              <a:graphicFrameLocks xmlns:a="http://schemas.openxmlformats.org/drawingml/2006/main" noChangeAspect="1"/>
             </wp:cNvGraphicFramePr>
-            <a:graphic>
+            <a:graphic xmlns:a="http://schemas.openxmlformats.org/drawingml/2006/main">
               <a:graphicData uri="http://schemas.openxmlformats.org/drawingml/2006/picture">
-                <pic:pic>
+                <pic:pic xmlns:pic="http://schemas.openxmlformats.org/drawingml/2006/picture">
                   <pic:nvPicPr>
                     <pic:cNvPr id="0" name="vehicle_drawer.png"/>
                     <pic:cNvPicPr/>
                   </pic:nvPicPr>
                   <pic:blipFill>
-                    <a:blip r:embed="rId12"/>
+                    <a:blip r:embed="rId8"/>
                     <a:stretch>
                       <a:fillRect/>
                     </a:stretch>
@@ -2639,7 +2583,9 @@
                       <a:off x="0" y="0"/>
                       <a:ext cx="5760720" cy="4000500"/>
                     </a:xfrm>
-                    <a:prstGeom prst="rect"/>
+                    <a:prstGeom prst="rect">
+                      <a:avLst/>
+                    </a:prstGeom>
                   </pic:spPr>
                 </pic:pic>
               </a:graphicData>
@@ -2872,6 +2818,7 @@
         <w:rPr>
           <w:b/>
         </w:rPr>
+        <w:lastRenderedPageBreak/>
         <w:t xml:space="preserve">1. Effectively-once without distributed transactions. </w:t>
       </w:r>
       <w:r>
@@ -2926,25 +2873,7 @@
           <w:sz w:val="20"/>
           <w:szCs w:val="20"/>
         </w:rPr>
-        <w:t xml:space="preserve">Every feature must be traceable to code. Priority uses </w:t>
-      </w:r>
-      <w:proofErr w:type="spellStart"/>
-      <w:r>
-        <w:rPr>
-          <w:color w:val="595959"/>
-          <w:sz w:val="20"/>
-          <w:szCs w:val="20"/>
-        </w:rPr>
-        <w:t>MoSCoW</w:t>
-      </w:r>
-      <w:proofErr w:type="spellEnd"/>
-      <w:r>
-        <w:rPr>
-          <w:color w:val="595959"/>
-          <w:sz w:val="20"/>
-          <w:szCs w:val="20"/>
-        </w:rPr>
-        <w:t xml:space="preserve"> (Must / Should / Could / Won’t). Status: Done / Partial / Planned. Give the demo video timestamp for Done features.</w:t>
+        <w:t>Every feature must be traceable to code. Priority uses MoSCoW (Must / Should / Could / Won’t). Status: Done / Partial / Planned. Give the demo video timestamp for Done features.</w:t>
       </w:r>
     </w:p>
     <w:tbl>
@@ -2965,21 +2894,15 @@
         <w:tblLook w:val="0000" w:firstRow="0" w:lastRow="0" w:firstColumn="0" w:lastColumn="0" w:noHBand="0" w:noVBand="0"/>
       </w:tblPr>
       <w:tblGrid>
-        <w:gridCol w:w="671"/>
-        <w:gridCol w:w="1840"/>
-        <w:gridCol w:w="2505"/>
-        <w:gridCol w:w="929"/>
-        <w:gridCol w:w="928"/>
-        <w:gridCol w:w="1589"/>
-        <w:gridCol w:w="844"/>
+        <w:gridCol w:w="454"/>
+        <w:gridCol w:w="1991"/>
+        <w:gridCol w:w="1304"/>
+        <w:gridCol w:w="843"/>
+        <w:gridCol w:w="946"/>
+        <w:gridCol w:w="2830"/>
+        <w:gridCol w:w="938"/>
       </w:tblGrid>
       <w:tr>
-        <w:tblPrEx>
-          <w:tblCellMar>
-            <w:top w:w="0" w:type="dxa"/>
-            <w:bottom w:w="0" w:type="dxa"/>
-          </w:tblCellMar>
-        </w:tblPrEx>
         <w:trPr>
           <w:tblHeader/>
         </w:trPr>
@@ -3013,6 +2936,7 @@
                 <w:sz w:val="20"/>
                 <w:szCs w:val="20"/>
               </w:rPr>
+              <w:lastRenderedPageBreak/>
               <w:t>ID</w:t>
             </w:r>
           </w:p>
@@ -3223,12 +3147,6 @@
         </w:tc>
       </w:tr>
       <w:tr>
-        <w:tblPrEx>
-          <w:tblCellMar>
-            <w:top w:w="0" w:type="dxa"/>
-            <w:bottom w:w="0" w:type="dxa"/>
-          </w:tblCellMar>
-        </w:tblPrEx>
         <w:trPr>
           <w:cantSplit/>
         </w:trPr>
@@ -3423,12 +3341,6 @@
         </w:tc>
       </w:tr>
       <w:tr>
-        <w:tblPrEx>
-          <w:tblCellMar>
-            <w:top w:w="0" w:type="dxa"/>
-            <w:bottom w:w="0" w:type="dxa"/>
-          </w:tblCellMar>
-        </w:tblPrEx>
         <w:trPr>
           <w:cantSplit/>
         </w:trPr>
@@ -3623,12 +3535,6 @@
         </w:tc>
       </w:tr>
       <w:tr>
-        <w:tblPrEx>
-          <w:tblCellMar>
-            <w:top w:w="0" w:type="dxa"/>
-            <w:bottom w:w="0" w:type="dxa"/>
-          </w:tblCellMar>
-        </w:tblPrEx>
         <w:trPr>
           <w:cantSplit/>
         </w:trPr>
@@ -3823,12 +3729,6 @@
         </w:tc>
       </w:tr>
       <w:tr>
-        <w:tblPrEx>
-          <w:tblCellMar>
-            <w:top w:w="0" w:type="dxa"/>
-            <w:bottom w:w="0" w:type="dxa"/>
-          </w:tblCellMar>
-        </w:tblPrEx>
         <w:trPr>
           <w:cantSplit/>
         </w:trPr>
@@ -4023,12 +3923,6 @@
         </w:tc>
       </w:tr>
       <w:tr>
-        <w:tblPrEx>
-          <w:tblCellMar>
-            <w:top w:w="0" w:type="dxa"/>
-            <w:bottom w:w="0" w:type="dxa"/>
-          </w:tblCellMar>
-        </w:tblPrEx>
         <w:trPr>
           <w:cantSplit/>
         </w:trPr>
@@ -4223,12 +4117,6 @@
         </w:tc>
       </w:tr>
       <w:tr>
-        <w:tblPrEx>
-          <w:tblCellMar>
-            <w:top w:w="0" w:type="dxa"/>
-            <w:bottom w:w="0" w:type="dxa"/>
-          </w:tblCellMar>
-        </w:tblPrEx>
         <w:trPr>
           <w:cantSplit/>
         </w:trPr>
@@ -4255,6 +4143,7 @@
               <w:spacing w:line="260" w:lineRule="auto"/>
             </w:pPr>
             <w:r>
+              <w:lastRenderedPageBreak/>
               <w:t>F-06</w:t>
             </w:r>
           </w:p>
@@ -4423,12 +4312,6 @@
         </w:tc>
       </w:tr>
       <w:tr>
-        <w:tblPrEx>
-          <w:tblCellMar>
-            <w:top w:w="0" w:type="dxa"/>
-            <w:bottom w:w="0" w:type="dxa"/>
-          </w:tblCellMar>
-        </w:tblPrEx>
         <w:trPr>
           <w:cantSplit/>
         </w:trPr>
@@ -4623,12 +4506,6 @@
         </w:tc>
       </w:tr>
       <w:tr>
-        <w:tblPrEx>
-          <w:tblCellMar>
-            <w:top w:w="0" w:type="dxa"/>
-            <w:bottom w:w="0" w:type="dxa"/>
-          </w:tblCellMar>
-        </w:tblPrEx>
         <w:trPr>
           <w:cantSplit/>
         </w:trPr>
@@ -4823,12 +4700,6 @@
         </w:tc>
       </w:tr>
       <w:tr>
-        <w:tblPrEx>
-          <w:tblCellMar>
-            <w:top w:w="0" w:type="dxa"/>
-            <w:bottom w:w="0" w:type="dxa"/>
-          </w:tblCellMar>
-        </w:tblPrEx>
         <w:trPr>
           <w:cantSplit/>
         </w:trPr>
@@ -5023,12 +4894,6 @@
         </w:tc>
       </w:tr>
       <w:tr>
-        <w:tblPrEx>
-          <w:tblCellMar>
-            <w:top w:w="0" w:type="dxa"/>
-            <w:bottom w:w="0" w:type="dxa"/>
-          </w:tblCellMar>
-        </w:tblPrEx>
         <w:trPr>
           <w:cantSplit/>
         </w:trPr>
@@ -5223,12 +5088,6 @@
         </w:tc>
       </w:tr>
       <w:tr>
-        <w:tblPrEx>
-          <w:tblCellMar>
-            <w:top w:w="0" w:type="dxa"/>
-            <w:bottom w:w="0" w:type="dxa"/>
-          </w:tblCellMar>
-        </w:tblPrEx>
         <w:trPr>
           <w:cantSplit/>
         </w:trPr>
@@ -5486,15 +5345,7 @@
         <w:t xml:space="preserve">Container Diagram: </w:t>
       </w:r>
       <w:r>
-        <w:t xml:space="preserve">C4 level 2 — every service, data store and broker, with the protocol on each arrow (MQTT, HTTPS, </w:t>
-      </w:r>
-      <w:proofErr w:type="spellStart"/>
-      <w:r>
-        <w:t>gRPC</w:t>
-      </w:r>
-      <w:proofErr w:type="spellEnd"/>
-      <w:r>
-        <w:t>, Kafka)</w:t>
+        <w:t>C4 level 2 — every service, data store and broker, with the protocol on each arrow (MQTT, HTTPS, gRPC, Kafka)</w:t>
       </w:r>
     </w:p>
     <w:p>
@@ -5542,7 +5393,7 @@
         <w:t xml:space="preserve">Container view (C4 L2) and data flow: </w:t>
       </w:r>
       <w:r>
-        <w:t>see diagram. One telemetry event: vehicle → Kafka (~20 ms producer linger) → processor batch (0.3–0.8 s incl. Postgres upsert) → Redis pub/sub → WebSocket (&lt; 50 ms) → screen. Measured p50 1.38 s vehicle timestamp to screen.</w:t>
+        <w:t>see diagram. One telemetry event: vehicle → Kafka (~20 ms producer linger) → processor batch (0.1–0.2 s; alerts are written and pushed before the bulk telemetry upsert) → Redis pub/sub → WebSocket (&lt; 50 ms) → screen. Measured p50 0.17 s, p95 2.6 s vehicle timestamp to screen across a 3x burst.</w:t>
       </w:r>
     </w:p>
     <w:p>
@@ -5550,22 +5401,26 @@
         <w:spacing w:before="60" w:after="200" w:line="300" w:lineRule="auto"/>
       </w:pPr>
       <w:r>
+        <w:rPr>
+          <w:noProof/>
+        </w:rPr>
         <w:drawing>
-          <wp:inline xmlns:a="http://schemas.openxmlformats.org/drawingml/2006/main" xmlns:pic="http://schemas.openxmlformats.org/drawingml/2006/picture">
+          <wp:inline distT="0" distB="0" distL="0" distR="0" wp14:anchorId="30D8818F" wp14:editId="7CEF2981">
             <wp:extent cx="5943600" cy="2971800"/>
+            <wp:effectExtent l="0" t="0" r="0" b="0"/>
             <wp:docPr id="3" name="Picture 3"/>
             <wp:cNvGraphicFramePr>
-              <a:graphicFrameLocks noChangeAspect="1"/>
+              <a:graphicFrameLocks xmlns:a="http://schemas.openxmlformats.org/drawingml/2006/main" noChangeAspect="1"/>
             </wp:cNvGraphicFramePr>
-            <a:graphic>
+            <a:graphic xmlns:a="http://schemas.openxmlformats.org/drawingml/2006/main">
               <a:graphicData uri="http://schemas.openxmlformats.org/drawingml/2006/picture">
-                <pic:pic>
+                <pic:pic xmlns:pic="http://schemas.openxmlformats.org/drawingml/2006/picture">
                   <pic:nvPicPr>
                     <pic:cNvPr id="0" name="arch.png"/>
                     <pic:cNvPicPr/>
                   </pic:nvPicPr>
                   <pic:blipFill>
-                    <a:blip r:embed="rId13"/>
+                    <a:blip r:embed="rId9"/>
                     <a:stretch>
                       <a:fillRect/>
                     </a:stretch>
@@ -5575,7 +5430,9 @@
                       <a:off x="0" y="0"/>
                       <a:ext cx="5943600" cy="2971800"/>
                     </a:xfrm>
-                    <a:prstGeom prst="rect"/>
+                    <a:prstGeom prst="rect">
+                      <a:avLst/>
+                    </a:prstGeom>
                   </pic:spPr>
                 </pic:pic>
               </a:graphicData>
@@ -5590,6 +5447,7 @@
       </w:pPr>
       <w:bookmarkStart w:id="12" w:name="s13"/>
       <w:r>
+        <w:lastRenderedPageBreak/>
         <w:t>5.2 Technology Stack &amp; Justification</w:t>
       </w:r>
       <w:bookmarkEnd w:id="12"/>
@@ -5612,17 +5470,11 @@
         <w:tblLook w:val="0000" w:firstRow="0" w:lastRow="0" w:firstColumn="0" w:lastColumn="0" w:noHBand="0" w:noVBand="0"/>
       </w:tblPr>
       <w:tblGrid>
-        <w:gridCol w:w="2792"/>
-        <w:gridCol w:w="2047"/>
-        <w:gridCol w:w="4467"/>
+        <w:gridCol w:w="2763"/>
+        <w:gridCol w:w="2135"/>
+        <w:gridCol w:w="4408"/>
       </w:tblGrid>
       <w:tr>
-        <w:tblPrEx>
-          <w:tblCellMar>
-            <w:top w:w="0" w:type="dxa"/>
-            <w:bottom w:w="0" w:type="dxa"/>
-          </w:tblCellMar>
-        </w:tblPrEx>
         <w:trPr>
           <w:tblHeader/>
         </w:trPr>
@@ -5730,12 +5582,6 @@
         </w:tc>
       </w:tr>
       <w:tr>
-        <w:tblPrEx>
-          <w:tblCellMar>
-            <w:top w:w="0" w:type="dxa"/>
-            <w:bottom w:w="0" w:type="dxa"/>
-          </w:tblCellMar>
-        </w:tblPrEx>
         <w:trPr>
           <w:cantSplit/>
         </w:trPr>
@@ -5822,12 +5668,6 @@
         </w:tc>
       </w:tr>
       <w:tr>
-        <w:tblPrEx>
-          <w:tblCellMar>
-            <w:top w:w="0" w:type="dxa"/>
-            <w:bottom w:w="0" w:type="dxa"/>
-          </w:tblCellMar>
-        </w:tblPrEx>
         <w:trPr>
           <w:cantSplit/>
         </w:trPr>
@@ -5881,7 +5721,7 @@
               <w:spacing w:line="260" w:lineRule="auto"/>
             </w:pPr>
             <w:r>
-              <w:t>Python consumer with batch upserts; batch scorer + materialised view</w:t>
+              <w:t>Python consumer with batch upserts; batch scorer + incremental rollup</w:t>
             </w:r>
           </w:p>
         </w:tc>
@@ -5914,12 +5754,6 @@
         </w:tc>
       </w:tr>
       <w:tr>
-        <w:tblPrEx>
-          <w:tblCellMar>
-            <w:top w:w="0" w:type="dxa"/>
-            <w:bottom w:w="0" w:type="dxa"/>
-          </w:tblCellMar>
-        </w:tblPrEx>
         <w:trPr>
           <w:cantSplit/>
         </w:trPr>
@@ -6006,12 +5840,6 @@
         </w:tc>
       </w:tr>
       <w:tr>
-        <w:tblPrEx>
-          <w:tblCellMar>
-            <w:top w:w="0" w:type="dxa"/>
-            <w:bottom w:w="0" w:type="dxa"/>
-          </w:tblCellMar>
-        </w:tblPrEx>
         <w:trPr>
           <w:cantSplit/>
         </w:trPr>
@@ -6098,12 +5926,6 @@
         </w:tc>
       </w:tr>
       <w:tr>
-        <w:tblPrEx>
-          <w:tblCellMar>
-            <w:top w:w="0" w:type="dxa"/>
-            <w:bottom w:w="0" w:type="dxa"/>
-          </w:tblCellMar>
-        </w:tblPrEx>
         <w:trPr>
           <w:cantSplit/>
         </w:trPr>
@@ -6190,12 +6012,6 @@
         </w:tc>
       </w:tr>
       <w:tr>
-        <w:tblPrEx>
-          <w:tblCellMar>
-            <w:top w:w="0" w:type="dxa"/>
-            <w:bottom w:w="0" w:type="dxa"/>
-          </w:tblCellMar>
-        </w:tblPrEx>
         <w:trPr>
           <w:cantSplit/>
         </w:trPr>
@@ -6276,7 +6092,7 @@
               <w:spacing w:line="260" w:lineRule="auto"/>
             </w:pPr>
             <w:r>
-              <w:t>Portable across clouds by configuration; CI runs lint, tests, SAST, image scan, e2e and chaos</w:t>
+              <w:t>Portable across clouds by configuration; CI runs lint, unit tests with coverage gate, SAST, e2e (integration, contract, BDD), ZAP DAST, image scan and chaos</w:t>
             </w:r>
           </w:p>
         </w:tc>
@@ -6314,15 +6130,7 @@
         <w:t xml:space="preserve">ER Diagram: </w:t>
       </w:r>
       <w:r>
-        <w:t xml:space="preserve">Relational core normalised to 3NF; list any deliberate </w:t>
-      </w:r>
-      <w:proofErr w:type="spellStart"/>
-      <w:r>
-        <w:t>denormalisation</w:t>
-      </w:r>
-      <w:proofErr w:type="spellEnd"/>
-      <w:r>
-        <w:t xml:space="preserve"> and why</w:t>
+        <w:t>Relational core normalised to 3NF; list any deliberate denormalisation and why</w:t>
       </w:r>
     </w:p>
     <w:p>
@@ -6409,12 +6217,6 @@
         <w:gridCol w:w="3629"/>
       </w:tblGrid>
       <w:tr>
-        <w:tblPrEx>
-          <w:tblCellMar>
-            <w:top w:w="0" w:type="dxa"/>
-            <w:bottom w:w="0" w:type="dxa"/>
-          </w:tblCellMar>
-        </w:tblPrEx>
         <w:trPr>
           <w:tblHeader/>
         </w:trPr>
@@ -6448,6 +6250,7 @@
                 <w:sz w:val="20"/>
                 <w:szCs w:val="20"/>
               </w:rPr>
+              <w:lastRenderedPageBreak/>
               <w:t>Query</w:t>
             </w:r>
           </w:p>
@@ -6482,9 +6285,33 @@
                 <w:sz w:val="20"/>
                 <w:szCs w:val="20"/>
               </w:rPr>
-              <w:t>Before (</w:t>
-            </w:r>
-            <w:proofErr w:type="spellStart"/>
+              <w:t>Before (ms)</w:t>
+            </w:r>
+          </w:p>
+        </w:tc>
+        <w:tc>
+          <w:tcPr>
+            <w:tcW w:w="1210" w:type="dxa"/>
+            <w:tcBorders>
+              <w:top w:val="single" w:sz="4" w:space="0" w:color="BFBFBF"/>
+              <w:left w:val="single" w:sz="4" w:space="0" w:color="BFBFBF"/>
+              <w:bottom w:val="single" w:sz="4" w:space="0" w:color="BFBFBF"/>
+              <w:right w:val="single" w:sz="4" w:space="0" w:color="BFBFBF"/>
+            </w:tcBorders>
+            <w:shd w:val="clear" w:color="auto" w:fill="F2F2F2"/>
+            <w:tcMar>
+              <w:top w:w="80" w:type="dxa"/>
+              <w:left w:w="110" w:type="dxa"/>
+              <w:bottom w:w="80" w:type="dxa"/>
+              <w:right w:w="110" w:type="dxa"/>
+            </w:tcMar>
+          </w:tcPr>
+          <w:p>
+            <w:pPr>
+              <w:keepNext/>
+              <w:keepLines/>
+              <w:spacing w:line="260" w:lineRule="auto"/>
+            </w:pPr>
             <w:r>
               <w:rPr>
                 <w:b/>
@@ -6492,71 +6319,7 @@
                 <w:sz w:val="20"/>
                 <w:szCs w:val="20"/>
               </w:rPr>
-              <w:t>ms</w:t>
-            </w:r>
-            <w:proofErr w:type="spellEnd"/>
-            <w:r>
-              <w:rPr>
-                <w:b/>
-                <w:bCs/>
-                <w:sz w:val="20"/>
-                <w:szCs w:val="20"/>
-              </w:rPr>
-              <w:t>)</w:t>
-            </w:r>
-          </w:p>
-        </w:tc>
-        <w:tc>
-          <w:tcPr>
-            <w:tcW w:w="1210" w:type="dxa"/>
-            <w:tcBorders>
-              <w:top w:val="single" w:sz="4" w:space="0" w:color="BFBFBF"/>
-              <w:left w:val="single" w:sz="4" w:space="0" w:color="BFBFBF"/>
-              <w:bottom w:val="single" w:sz="4" w:space="0" w:color="BFBFBF"/>
-              <w:right w:val="single" w:sz="4" w:space="0" w:color="BFBFBF"/>
-            </w:tcBorders>
-            <w:shd w:val="clear" w:color="auto" w:fill="F2F2F2"/>
-            <w:tcMar>
-              <w:top w:w="80" w:type="dxa"/>
-              <w:left w:w="110" w:type="dxa"/>
-              <w:bottom w:w="80" w:type="dxa"/>
-              <w:right w:w="110" w:type="dxa"/>
-            </w:tcMar>
-          </w:tcPr>
-          <w:p>
-            <w:pPr>
-              <w:keepNext/>
-              <w:keepLines/>
-              <w:spacing w:line="260" w:lineRule="auto"/>
-            </w:pPr>
-            <w:r>
-              <w:rPr>
-                <w:b/>
-                <w:bCs/>
-                <w:sz w:val="20"/>
-                <w:szCs w:val="20"/>
-              </w:rPr>
-              <w:t>After (</w:t>
-            </w:r>
-            <w:proofErr w:type="spellStart"/>
-            <w:r>
-              <w:rPr>
-                <w:b/>
-                <w:bCs/>
-                <w:sz w:val="20"/>
-                <w:szCs w:val="20"/>
-              </w:rPr>
-              <w:t>ms</w:t>
-            </w:r>
-            <w:proofErr w:type="spellEnd"/>
-            <w:r>
-              <w:rPr>
-                <w:b/>
-                <w:bCs/>
-                <w:sz w:val="20"/>
-                <w:szCs w:val="20"/>
-              </w:rPr>
-              <w:t>)</w:t>
+              <w:t>After (ms)</w:t>
             </w:r>
           </w:p>
         </w:tc>
@@ -6596,12 +6359,6 @@
         </w:tc>
       </w:tr>
       <w:tr>
-        <w:tblPrEx>
-          <w:tblCellMar>
-            <w:top w:w="0" w:type="dxa"/>
-            <w:bottom w:w="0" w:type="dxa"/>
-          </w:tblCellMar>
-        </w:tblPrEx>
         <w:trPr>
           <w:cantSplit/>
         </w:trPr>
@@ -6715,12 +6472,6 @@
         </w:tc>
       </w:tr>
       <w:tr>
-        <w:tblPrEx>
-          <w:tblCellMar>
-            <w:top w:w="0" w:type="dxa"/>
-            <w:bottom w:w="0" w:type="dxa"/>
-          </w:tblCellMar>
-        </w:tblPrEx>
         <w:trPr>
           <w:cantSplit/>
         </w:trPr>
@@ -6834,12 +6585,6 @@
         </w:tc>
       </w:tr>
       <w:tr>
-        <w:tblPrEx>
-          <w:tblCellMar>
-            <w:top w:w="0" w:type="dxa"/>
-            <w:bottom w:w="0" w:type="dxa"/>
-          </w:tblCellMar>
-        </w:tblPrEx>
         <w:trPr>
           <w:cantSplit/>
         </w:trPr>
@@ -6955,22 +6700,26 @@
     </w:tbl>
     <w:p>
       <w:r>
+        <w:rPr>
+          <w:noProof/>
+        </w:rPr>
         <w:drawing>
-          <wp:inline xmlns:a="http://schemas.openxmlformats.org/drawingml/2006/main" xmlns:pic="http://schemas.openxmlformats.org/drawingml/2006/picture">
+          <wp:inline distT="0" distB="0" distL="0" distR="0" wp14:anchorId="7E1842E7" wp14:editId="03CBA0AB">
             <wp:extent cx="5943600" cy="2971800"/>
+            <wp:effectExtent l="0" t="0" r="0" b="0"/>
             <wp:docPr id="4" name="Picture 4"/>
             <wp:cNvGraphicFramePr>
-              <a:graphicFrameLocks noChangeAspect="1"/>
+              <a:graphicFrameLocks xmlns:a="http://schemas.openxmlformats.org/drawingml/2006/main" noChangeAspect="1"/>
             </wp:cNvGraphicFramePr>
-            <a:graphic>
+            <a:graphic xmlns:a="http://schemas.openxmlformats.org/drawingml/2006/main">
               <a:graphicData uri="http://schemas.openxmlformats.org/drawingml/2006/picture">
-                <pic:pic>
+                <pic:pic xmlns:pic="http://schemas.openxmlformats.org/drawingml/2006/picture">
                   <pic:nvPicPr>
                     <pic:cNvPr id="0" name="er.png"/>
                     <pic:cNvPicPr/>
                   </pic:nvPicPr>
                   <pic:blipFill>
-                    <a:blip r:embed="rId14"/>
+                    <a:blip r:embed="rId10"/>
                     <a:stretch>
                       <a:fillRect/>
                     </a:stretch>
@@ -6980,7 +6729,9 @@
                       <a:off x="0" y="0"/>
                       <a:ext cx="5943600" cy="2971800"/>
                     </a:xfrm>
-                    <a:prstGeom prst="rect"/>
+                    <a:prstGeom prst="rect">
+                      <a:avLst/>
+                    </a:prstGeom>
                   </pic:spPr>
                 </pic:pic>
               </a:graphicData>
@@ -7008,7 +6759,10 @@
         <w:t xml:space="preserve">Capacity: </w:t>
       </w:r>
       <w:r>
-        <w:t>100K vehicles × 1 event/s = 100K events/s, ~0.5 KB JSON (~120 B per stored row) → 8.6 TB/day raw JSON, ~1 TB/day as rows; ~0.3 TB/day compressed in a columnar cold tier. Kafka partition key VIN (uniform hash, no hot spots); telemetry partitioned by day (time) with (vin, ts) indexes. Hot: Redis latest state (minutes). Warm: Postgres/ClickHouse 90 days (~25 TB compressed at full scale). Cold: Parquet on S3 7 years (~US$0.023/GB-month → ~US$2.5K/month per PB-year).</w:t>
+        <w:t>100K vehicles × 1 event/s = 100K events/s, ~0.5 KB JSON (~120 B per stored row) → 8.6 TB/day raw JSON, ~1 TB/day as rows; ~0.3 TB/day compressed in a columnar cold tier. Kafka partition key VIN (uniform hash, no hot spots); telemetry partitioned by hour with (vin, ts) indexes. Hot: Redis latest state (minutes) and raw Postgres partitions (2 h locally, configurable). Warm: Postgres/ClickHouse 90 days (~25 TB compressed at full scale). Cold: Parquet on S3 7 years (~US$0.023/GB-month → ~US$2.5K/month per PB-ye</w:t>
+      </w:r>
+      <w:r>
+        <w:t>ar).</w:t>
       </w:r>
     </w:p>
     <w:p>
@@ -7082,7 +6836,11 @@
         <w:spacing w:before="60" w:after="200" w:line="300" w:lineRule="auto"/>
       </w:pPr>
       <w:r>
-        <w:t>Kubernetes namespace fleetpulse (pod-security restricted): api Deployment (3 replicas, HPA 3–20 on CPU, PDB minAvailable 2, zone topology spread), processor Deployment (6 replicas ≤ partitions; KEDA on consumer lag in production), risk-scoring CronJob every 5 minutes, default-deny NetworkPolicy, TLS Ingress via cert-manager. Containers run as non-root with read-only root filesystems and dropped capabilities. Secrets come from a K8s Secret synced from Vault / cloud secret manager (infra/k8s/fleetpulse.yaml).</w:t>
+        <w:t xml:space="preserve">Kubernetes namespace fleetpulse (pod-security restricted): api Deployment (3 replicas, HPA 3–20 on CPU, PDB minAvailable 2, zone topology spread), processor Deployment (6 replicas ≤ partitions; KEDA </w:t>
+      </w:r>
+      <w:r>
+        <w:lastRenderedPageBreak/>
+        <w:t>on consumer lag in production), risk-scoring CronJob every 5 minutes, default-deny NetworkPolicy, TLS Ingress via cert-manager. Containers run as non-root with read-only root filesystems and dropped capabilities. Secrets come from a K8s Secret synced from Vault / cloud secret manager (infra/k8s/fleetpulse.yaml).</w:t>
       </w:r>
     </w:p>
     <w:p>
@@ -7196,12 +6954,6 @@
         <w:gridCol w:w="2978"/>
       </w:tblGrid>
       <w:tr>
-        <w:tblPrEx>
-          <w:tblCellMar>
-            <w:top w:w="0" w:type="dxa"/>
-            <w:bottom w:w="0" w:type="dxa"/>
-          </w:tblCellMar>
-        </w:tblPrEx>
         <w:trPr>
           <w:tblHeader/>
         </w:trPr>
@@ -7309,12 +7061,6 @@
         </w:tc>
       </w:tr>
       <w:tr>
-        <w:tblPrEx>
-          <w:tblCellMar>
-            <w:top w:w="0" w:type="dxa"/>
-            <w:bottom w:w="0" w:type="dxa"/>
-          </w:tblCellMar>
-        </w:tblPrEx>
         <w:trPr>
           <w:cantSplit/>
         </w:trPr>
@@ -7401,12 +7147,6 @@
         </w:tc>
       </w:tr>
       <w:tr>
-        <w:tblPrEx>
-          <w:tblCellMar>
-            <w:top w:w="0" w:type="dxa"/>
-            <w:bottom w:w="0" w:type="dxa"/>
-          </w:tblCellMar>
-        </w:tblPrEx>
         <w:trPr>
           <w:cantSplit/>
         </w:trPr>
@@ -7493,12 +7233,6 @@
         </w:tc>
       </w:tr>
       <w:tr>
-        <w:tblPrEx>
-          <w:tblCellMar>
-            <w:top w:w="0" w:type="dxa"/>
-            <w:bottom w:w="0" w:type="dxa"/>
-          </w:tblCellMar>
-        </w:tblPrEx>
         <w:trPr>
           <w:cantSplit/>
         </w:trPr>
@@ -7585,12 +7319,6 @@
         </w:tc>
       </w:tr>
       <w:tr>
-        <w:tblPrEx>
-          <w:tblCellMar>
-            <w:top w:w="0" w:type="dxa"/>
-            <w:bottom w:w="0" w:type="dxa"/>
-          </w:tblCellMar>
-        </w:tblPrEx>
         <w:trPr>
           <w:cantSplit/>
         </w:trPr>
@@ -7684,7 +7412,7 @@
     </w:p>
     <w:p>
       <w:r>
-        <w:t>Folder structure: fleetpulse/{core, simulator, processor, ml, agent, api} · web/ · db/ · infra/{k8s, terraform/aws, grafana} · tests/{unit, integration, load} · docs/{adr, diagrams, evidence, solution} · .github/workflows/</w:t>
+        <w:t>Folder structure: fleetpulse/{core, simulator, processor, ml, agent, api} · web/ · db/ · infra/{k8s, terraform/aws, grafana} · tests/{unit, integration, contract, acceptance, load} · docs/{adr, diagrams, evidence, solution} · .github/workflows/</w:t>
       </w:r>
     </w:p>
     <w:p>
@@ -7698,6 +7426,7 @@
       </w:pPr>
       <w:bookmarkStart w:id="17" w:name="s18"/>
       <w:r>
+        <w:lastRenderedPageBreak/>
         <w:t>6.2 Design Principles Applied</w:t>
       </w:r>
       <w:bookmarkEnd w:id="17"/>
@@ -7769,17 +7498,11 @@
         <w:tblLook w:val="0000" w:firstRow="0" w:lastRow="0" w:firstColumn="0" w:lastColumn="0" w:noHBand="0" w:noVBand="0"/>
       </w:tblPr>
       <w:tblGrid>
-        <w:gridCol w:w="2978"/>
-        <w:gridCol w:w="4095"/>
-        <w:gridCol w:w="2233"/>
+        <w:gridCol w:w="2718"/>
+        <w:gridCol w:w="3726"/>
+        <w:gridCol w:w="2862"/>
       </w:tblGrid>
       <w:tr>
-        <w:tblPrEx>
-          <w:tblCellMar>
-            <w:top w:w="0" w:type="dxa"/>
-            <w:bottom w:w="0" w:type="dxa"/>
-          </w:tblCellMar>
-        </w:tblPrEx>
         <w:trPr>
           <w:tblHeader/>
         </w:trPr>
@@ -7887,12 +7610,6 @@
         </w:tc>
       </w:tr>
       <w:tr>
-        <w:tblPrEx>
-          <w:tblCellMar>
-            <w:top w:w="0" w:type="dxa"/>
-            <w:bottom w:w="0" w:type="dxa"/>
-          </w:tblCellMar>
-        </w:tblPrEx>
         <w:trPr>
           <w:cantSplit/>
         </w:trPr>
@@ -7979,12 +7696,6 @@
         </w:tc>
       </w:tr>
       <w:tr>
-        <w:tblPrEx>
-          <w:tblCellMar>
-            <w:top w:w="0" w:type="dxa"/>
-            <w:bottom w:w="0" w:type="dxa"/>
-          </w:tblCellMar>
-        </w:tblPrEx>
         <w:trPr>
           <w:cantSplit/>
         </w:trPr>
@@ -8071,12 +7782,6 @@
         </w:tc>
       </w:tr>
       <w:tr>
-        <w:tblPrEx>
-          <w:tblCellMar>
-            <w:top w:w="0" w:type="dxa"/>
-            <w:bottom w:w="0" w:type="dxa"/>
-          </w:tblCellMar>
-        </w:tblPrEx>
         <w:trPr>
           <w:cantSplit/>
         </w:trPr>
@@ -8163,12 +7868,6 @@
         </w:tc>
       </w:tr>
       <w:tr>
-        <w:tblPrEx>
-          <w:tblCellMar>
-            <w:top w:w="0" w:type="dxa"/>
-            <w:bottom w:w="0" w:type="dxa"/>
-          </w:tblCellMar>
-        </w:tblPrEx>
         <w:trPr>
           <w:cantSplit/>
         </w:trPr>
@@ -8222,7 +7921,7 @@
               <w:spacing w:line="260" w:lineRule="auto"/>
             </w:pPr>
             <w:r>
-              <w:t>Writes go through Kafka/processor; reads from Redis hot state, materialised view and risk table</w:t>
+              <w:t>Writes go through Kafka/processor; reads from Redis hot state, the incremental vehicle_daily rollup and the risk table</w:t>
             </w:r>
           </w:p>
         </w:tc>
@@ -8255,12 +7954,6 @@
         </w:tc>
       </w:tr>
       <w:tr>
-        <w:tblPrEx>
-          <w:tblCellMar>
-            <w:top w:w="0" w:type="dxa"/>
-            <w:bottom w:w="0" w:type="dxa"/>
-          </w:tblCellMar>
-        </w:tblPrEx>
         <w:trPr>
           <w:cantSplit/>
         </w:trPr>
@@ -8347,12 +8040,6 @@
         </w:tc>
       </w:tr>
       <w:tr>
-        <w:tblPrEx>
-          <w:tblCellMar>
-            <w:top w:w="0" w:type="dxa"/>
-            <w:bottom w:w="0" w:type="dxa"/>
-          </w:tblCellMar>
-        </w:tblPrEx>
         <w:trPr>
           <w:cantSplit/>
         </w:trPr>
@@ -8439,12 +8126,6 @@
         </w:tc>
       </w:tr>
       <w:tr>
-        <w:tblPrEx>
-          <w:tblCellMar>
-            <w:top w:w="0" w:type="dxa"/>
-            <w:bottom w:w="0" w:type="dxa"/>
-          </w:tblCellMar>
-        </w:tblPrEx>
         <w:trPr>
           <w:cantSplit/>
         </w:trPr>
@@ -8498,7 +8179,7 @@
               <w:spacing w:line="260" w:lineRule="auto"/>
             </w:pPr>
             <w:r>
-              <w:t>Rate limiter fails open; map works without tile CDN; copilot falls back from LLM</w:t>
+              <w:t>Rate limiter fails open; map falls back from Esri to OpenStreetMap tiles and works without any tile CDN; pollers survive API restarts; copilot falls back from LLM</w:t>
             </w:r>
           </w:p>
         </w:tc>
@@ -8562,21 +8243,8 @@
         </w:rPr>
         <w:t xml:space="preserve">API Contract: </w:t>
       </w:r>
-      <w:proofErr w:type="spellStart"/>
-      <w:r>
-        <w:t>OpenAPI</w:t>
-      </w:r>
-      <w:proofErr w:type="spellEnd"/>
-      <w:r>
-        <w:t xml:space="preserve"> / </w:t>
-      </w:r>
-      <w:proofErr w:type="spellStart"/>
-      <w:r>
-        <w:t>AsyncAPI</w:t>
-      </w:r>
-      <w:proofErr w:type="spellEnd"/>
-      <w:r>
-        <w:t xml:space="preserve"> link; versioning, pagination, error format, rate limits</w:t>
+      <w:r>
+        <w:t>OpenAPI / AsyncAPI link; versioning, pagination, error format, rate limits</w:t>
       </w:r>
     </w:p>
     <w:p>
@@ -8593,18 +8261,11 @@
           <w:b/>
           <w:bCs/>
         </w:rPr>
+        <w:lastRenderedPageBreak/>
         <w:t xml:space="preserve">Event Schemas: </w:t>
       </w:r>
       <w:r>
-        <w:t xml:space="preserve">Topics, keys, schema format (Avro / </w:t>
-      </w:r>
-      <w:proofErr w:type="spellStart"/>
-      <w:r>
-        <w:t>Protobuf</w:t>
-      </w:r>
-      <w:proofErr w:type="spellEnd"/>
-      <w:r>
-        <w:t xml:space="preserve"> / JSON Schema), schema evolution</w:t>
+        <w:t>Topics, keys, schema format (Avro / Protobuf / JSON Schema), schema evolution</w:t>
       </w:r>
     </w:p>
     <w:p>
@@ -8621,7 +8282,6 @@
           <w:b/>
           <w:bCs/>
         </w:rPr>
-        <w:lastRenderedPageBreak/>
         <w:t xml:space="preserve">Sequence Diagrams: </w:t>
       </w:r>
       <w:r>
@@ -8823,12 +8483,6 @@
         <w:gridCol w:w="1404"/>
       </w:tblGrid>
       <w:tr>
-        <w:tblPrEx>
-          <w:tblCellMar>
-            <w:top w:w="0" w:type="dxa"/>
-            <w:bottom w:w="0" w:type="dxa"/>
-          </w:tblCellMar>
-        </w:tblPrEx>
         <w:trPr>
           <w:tblHeader/>
         </w:trPr>
@@ -8862,6 +8516,7 @@
                 <w:sz w:val="20"/>
                 <w:szCs w:val="20"/>
               </w:rPr>
+              <w:lastRenderedPageBreak/>
               <w:t>Problem</w:t>
             </w:r>
           </w:p>
@@ -8970,12 +8625,6 @@
         </w:tc>
       </w:tr>
       <w:tr>
-        <w:tblPrEx>
-          <w:tblCellMar>
-            <w:top w:w="0" w:type="dxa"/>
-            <w:bottom w:w="0" w:type="dxa"/>
-          </w:tblCellMar>
-        </w:tblPrEx>
         <w:trPr>
           <w:cantSplit/>
         </w:trPr>
@@ -9089,12 +8738,6 @@
         </w:tc>
       </w:tr>
       <w:tr>
-        <w:tblPrEx>
-          <w:tblCellMar>
-            <w:top w:w="0" w:type="dxa"/>
-            <w:bottom w:w="0" w:type="dxa"/>
-          </w:tblCellMar>
-        </w:tblPrEx>
         <w:trPr>
           <w:cantSplit/>
         </w:trPr>
@@ -9208,12 +8851,6 @@
         </w:tc>
       </w:tr>
       <w:tr>
-        <w:tblPrEx>
-          <w:tblCellMar>
-            <w:top w:w="0" w:type="dxa"/>
-            <w:bottom w:w="0" w:type="dxa"/>
-          </w:tblCellMar>
-        </w:tblPrEx>
         <w:trPr>
           <w:cantSplit/>
         </w:trPr>
@@ -9327,12 +8964,6 @@
         </w:tc>
       </w:tr>
       <w:tr>
-        <w:tblPrEx>
-          <w:tblCellMar>
-            <w:top w:w="0" w:type="dxa"/>
-            <w:bottom w:w="0" w:type="dxa"/>
-          </w:tblCellMar>
-        </w:tblPrEx>
         <w:trPr>
           <w:cantSplit/>
         </w:trPr>
@@ -9446,12 +9077,6 @@
         </w:tc>
       </w:tr>
       <w:tr>
-        <w:tblPrEx>
-          <w:tblCellMar>
-            <w:top w:w="0" w:type="dxa"/>
-            <w:bottom w:w="0" w:type="dxa"/>
-          </w:tblCellMar>
-        </w:tblPrEx>
         <w:trPr>
           <w:cantSplit/>
         </w:trPr>
@@ -9565,12 +9190,6 @@
         </w:tc>
       </w:tr>
       <w:tr>
-        <w:tblPrEx>
-          <w:tblCellMar>
-            <w:top w:w="0" w:type="dxa"/>
-            <w:bottom w:w="0" w:type="dxa"/>
-          </w:tblCellMar>
-        </w:tblPrEx>
         <w:trPr>
           <w:cantSplit/>
         </w:trPr>
@@ -9684,12 +9303,6 @@
         </w:tc>
       </w:tr>
       <w:tr>
-        <w:tblPrEx>
-          <w:tblCellMar>
-            <w:top w:w="0" w:type="dxa"/>
-            <w:bottom w:w="0" w:type="dxa"/>
-          </w:tblCellMar>
-        </w:tblPrEx>
         <w:trPr>
           <w:cantSplit/>
         </w:trPr>
@@ -9803,12 +9416,6 @@
         </w:tc>
       </w:tr>
       <w:tr>
-        <w:tblPrEx>
-          <w:tblCellMar>
-            <w:top w:w="0" w:type="dxa"/>
-            <w:bottom w:w="0" w:type="dxa"/>
-          </w:tblCellMar>
-        </w:tblPrEx>
         <w:trPr>
           <w:cantSplit/>
         </w:trPr>
@@ -9922,12 +9529,6 @@
         </w:tc>
       </w:tr>
       <w:tr>
-        <w:tblPrEx>
-          <w:tblCellMar>
-            <w:top w:w="0" w:type="dxa"/>
-            <w:bottom w:w="0" w:type="dxa"/>
-          </w:tblCellMar>
-        </w:tblPrEx>
         <w:trPr>
           <w:cantSplit/>
         </w:trPr>
@@ -10041,12 +9642,6 @@
         </w:tc>
       </w:tr>
       <w:tr>
-        <w:tblPrEx>
-          <w:tblCellMar>
-            <w:top w:w="0" w:type="dxa"/>
-            <w:bottom w:w="0" w:type="dxa"/>
-          </w:tblCellMar>
-        </w:tblPrEx>
         <w:trPr>
           <w:cantSplit/>
         </w:trPr>
@@ -10178,6 +9773,7 @@
         <w:spacing w:before="60" w:after="200" w:line="300" w:lineRule="auto"/>
       </w:pPr>
       <w:r>
+        <w:lastRenderedPageBreak/>
         <w:t>Measured: hot path (parse → normalise → VIN → Bloom → rules) 200,000 events in 5.90 s = 33.9K events/s on one core (tests/load/processor_bench.py).</w:t>
       </w:r>
     </w:p>
@@ -10187,6 +9783,7 @@
       </w:pPr>
       <w:bookmarkStart w:id="21" w:name="s22"/>
       <w:r>
+        <w:lastRenderedPageBreak/>
         <w:t>7. Non-Functional Requirements &amp; Performance Benchmarks</w:t>
       </w:r>
       <w:bookmarkEnd w:id="21"/>
@@ -10215,12 +9812,6 @@
         <w:gridCol w:w="2606"/>
       </w:tblGrid>
       <w:tr>
-        <w:tblPrEx>
-          <w:tblCellMar>
-            <w:top w:w="0" w:type="dxa"/>
-            <w:bottom w:w="0" w:type="dxa"/>
-          </w:tblCellMar>
-        </w:tblPrEx>
         <w:trPr>
           <w:tblHeader/>
         </w:trPr>
@@ -10362,12 +9953,6 @@
         </w:tc>
       </w:tr>
       <w:tr>
-        <w:tblPrEx>
-          <w:tblCellMar>
-            <w:top w:w="0" w:type="dxa"/>
-            <w:bottom w:w="0" w:type="dxa"/>
-          </w:tblCellMar>
-        </w:tblPrEx>
         <w:trPr>
           <w:cantSplit/>
         </w:trPr>
@@ -10481,12 +10066,6 @@
         </w:tc>
       </w:tr>
       <w:tr>
-        <w:tblPrEx>
-          <w:tblCellMar>
-            <w:top w:w="0" w:type="dxa"/>
-            <w:bottom w:w="0" w:type="dxa"/>
-          </w:tblCellMar>
-        </w:tblPrEx>
         <w:trPr>
           <w:cantSplit/>
         </w:trPr>
@@ -10567,7 +10146,7 @@
               <w:spacing w:line="260" w:lineRule="auto"/>
             </w:pPr>
             <w:r>
-              <w:t>Alert p50 1.38 s; dashboard KPIs refresh every 3 s</w:t>
+              <w:t>Critical alert p50 0.17 s, p95 2.6 s, max 3.2 s through a 3x burst; dashboard KPIs refresh every 3 s</w:t>
             </w:r>
           </w:p>
         </w:tc>
@@ -10600,12 +10179,6 @@
         </w:tc>
       </w:tr>
       <w:tr>
-        <w:tblPrEx>
-          <w:tblCellMar>
-            <w:top w:w="0" w:type="dxa"/>
-            <w:bottom w:w="0" w:type="dxa"/>
-          </w:tblCellMar>
-        </w:tblPrEx>
         <w:trPr>
           <w:cantSplit/>
         </w:trPr>
@@ -10719,12 +10292,6 @@
         </w:tc>
       </w:tr>
       <w:tr>
-        <w:tblPrEx>
-          <w:tblCellMar>
-            <w:top w:w="0" w:type="dxa"/>
-            <w:bottom w:w="0" w:type="dxa"/>
-          </w:tblCellMar>
-        </w:tblPrEx>
         <w:trPr>
           <w:cantSplit/>
         </w:trPr>
@@ -10838,12 +10405,6 @@
         </w:tc>
       </w:tr>
       <w:tr>
-        <w:tblPrEx>
-          <w:tblCellMar>
-            <w:top w:w="0" w:type="dxa"/>
-            <w:bottom w:w="0" w:type="dxa"/>
-          </w:tblCellMar>
-        </w:tblPrEx>
         <w:trPr>
           <w:cantSplit/>
         </w:trPr>
@@ -11007,7 +10568,11 @@
         <w:spacing w:before="60" w:after="200" w:line="300" w:lineRule="auto"/>
       </w:pPr>
       <w:r>
-        <w:t>Load test setup: everything on one 4-vCPU cloud VM under docker compose (Redpanda, Postgres 16, Redis, 2 processors, simulator, batch, API) with 100K vehicles at a 5,000 events/s base rate and 3x bursts for 10 s every 2 minutes. API load: tests/load/api_load.py (async httpx) against 4 uvicorn workers, rate limiter raised for the test. Processor CPU benchmark: tests/load/processor_bench.py. Raw outputs in docs/evidence/.</w:t>
+        <w:lastRenderedPageBreak/>
+        <w:t>Load test setup: everything on one 4-vCPU cloud VM under docker compose (Redpanda, Postgres 16, Redis, 2 processors, simulator, batch, API) with 100K vehicles at a 5,000 events/s base rate and 3x bursts for 10 s every 2 minutes. API load: tests/load/api_load.py (async httpx) against 4 uvicorn workers, rate limiter raised for the test. Processor CPU benchmark: tests/load/processor_bench.py. Alert latency was re-measured after hardening on a 16-vCPU laptop with 4 processor replicas (docs/evidence/alert_latenc</w:t>
+      </w:r>
+      <w:r>
+        <w:t>y.txt). Raw outputs in docs/evidence/.</w:t>
       </w:r>
     </w:p>
     <w:p>
@@ -11084,13 +10649,8 @@
         </w:rPr>
         <w:t xml:space="preserve">Device Identity &amp; Encryption: </w:t>
       </w:r>
-      <w:proofErr w:type="spellStart"/>
-      <w:r>
-        <w:t>mTLS</w:t>
-      </w:r>
-      <w:proofErr w:type="spellEnd"/>
-      <w:r>
-        <w:t>, TLS in transit, encryption at rest, secrets management</w:t>
+      <w:r>
+        <w:t>mTLS, TLS in transit, encryption at rest, secrets management</w:t>
       </w:r>
     </w:p>
     <w:p>
@@ -11162,12 +10722,6 @@
         <w:gridCol w:w="1404"/>
       </w:tblGrid>
       <w:tr>
-        <w:tblPrEx>
-          <w:tblCellMar>
-            <w:top w:w="0" w:type="dxa"/>
-            <w:bottom w:w="0" w:type="dxa"/>
-          </w:tblCellMar>
-        </w:tblPrEx>
         <w:trPr>
           <w:tblHeader/>
         </w:trPr>
@@ -11201,6 +10755,7 @@
                 <w:sz w:val="20"/>
                 <w:szCs w:val="20"/>
               </w:rPr>
+              <w:lastRenderedPageBreak/>
               <w:t>#</w:t>
             </w:r>
           </w:p>
@@ -11309,12 +10864,6 @@
         </w:tc>
       </w:tr>
       <w:tr>
-        <w:tblPrEx>
-          <w:tblCellMar>
-            <w:top w:w="0" w:type="dxa"/>
-            <w:bottom w:w="0" w:type="dxa"/>
-          </w:tblCellMar>
-        </w:tblPrEx>
         <w:trPr>
           <w:cantSplit/>
         </w:trPr>
@@ -11428,12 +10977,6 @@
         </w:tc>
       </w:tr>
       <w:tr>
-        <w:tblPrEx>
-          <w:tblCellMar>
-            <w:top w:w="0" w:type="dxa"/>
-            <w:bottom w:w="0" w:type="dxa"/>
-          </w:tblCellMar>
-        </w:tblPrEx>
         <w:trPr>
           <w:cantSplit/>
         </w:trPr>
@@ -11547,12 +11090,6 @@
         </w:tc>
       </w:tr>
       <w:tr>
-        <w:tblPrEx>
-          <w:tblCellMar>
-            <w:top w:w="0" w:type="dxa"/>
-            <w:bottom w:w="0" w:type="dxa"/>
-          </w:tblCellMar>
-        </w:tblPrEx>
         <w:trPr>
           <w:cantSplit/>
         </w:trPr>
@@ -11666,12 +11203,6 @@
         </w:tc>
       </w:tr>
       <w:tr>
-        <w:tblPrEx>
-          <w:tblCellMar>
-            <w:top w:w="0" w:type="dxa"/>
-            <w:bottom w:w="0" w:type="dxa"/>
-          </w:tblCellMar>
-        </w:tblPrEx>
         <w:trPr>
           <w:cantSplit/>
         </w:trPr>
@@ -11785,12 +11316,6 @@
         </w:tc>
       </w:tr>
       <w:tr>
-        <w:tblPrEx>
-          <w:tblCellMar>
-            <w:top w:w="0" w:type="dxa"/>
-            <w:bottom w:w="0" w:type="dxa"/>
-          </w:tblCellMar>
-        </w:tblPrEx>
         <w:trPr>
           <w:cantSplit/>
         </w:trPr>
@@ -11904,12 +11429,6 @@
         </w:tc>
       </w:tr>
       <w:tr>
-        <w:tblPrEx>
-          <w:tblCellMar>
-            <w:top w:w="0" w:type="dxa"/>
-            <w:bottom w:w="0" w:type="dxa"/>
-          </w:tblCellMar>
-        </w:tblPrEx>
         <w:trPr>
           <w:cantSplit/>
         </w:trPr>
@@ -12113,19 +11632,13 @@
         <w:tblLook w:val="0000" w:firstRow="0" w:lastRow="0" w:firstColumn="0" w:lastColumn="0" w:noHBand="0" w:noVBand="0"/>
       </w:tblPr>
       <w:tblGrid>
-        <w:gridCol w:w="3071"/>
-        <w:gridCol w:w="1675"/>
-        <w:gridCol w:w="1210"/>
-        <w:gridCol w:w="2420"/>
-        <w:gridCol w:w="930"/>
+        <w:gridCol w:w="2456"/>
+        <w:gridCol w:w="2710"/>
+        <w:gridCol w:w="1155"/>
+        <w:gridCol w:w="2104"/>
+        <w:gridCol w:w="881"/>
       </w:tblGrid>
       <w:tr>
-        <w:tblPrEx>
-          <w:tblCellMar>
-            <w:top w:w="0" w:type="dxa"/>
-            <w:bottom w:w="0" w:type="dxa"/>
-          </w:tblCellMar>
-        </w:tblPrEx>
         <w:trPr>
           <w:tblHeader/>
         </w:trPr>
@@ -12301,12 +11814,6 @@
         </w:tc>
       </w:tr>
       <w:tr>
-        <w:tblPrEx>
-          <w:tblCellMar>
-            <w:top w:w="0" w:type="dxa"/>
-            <w:bottom w:w="0" w:type="dxa"/>
-          </w:tblCellMar>
-        </w:tblPrEx>
         <w:trPr>
           <w:cantSplit/>
         </w:trPr>
@@ -12447,12 +11954,6 @@
         </w:tc>
       </w:tr>
       <w:tr>
-        <w:tblPrEx>
-          <w:tblCellMar>
-            <w:top w:w="0" w:type="dxa"/>
-            <w:bottom w:w="0" w:type="dxa"/>
-          </w:tblCellMar>
-        </w:tblPrEx>
         <w:trPr>
           <w:cantSplit/>
         </w:trPr>
@@ -12506,7 +12007,7 @@
               <w:spacing w:line="260" w:lineRule="auto"/>
             </w:pPr>
             <w:r>
-              <w:t>pytest + httpx against docker compose</w:t>
+              <w:t>pytest + httpx against docker compose; consumer-driven contracts (dashboard as consumer) verified against the live API and its OpenAPI</w:t>
             </w:r>
           </w:p>
         </w:tc>
@@ -12533,7 +12034,7 @@
               <w:spacing w:line="260" w:lineRule="auto"/>
             </w:pPr>
             <w:r>
-              <w:t>8</w:t>
+              <w:t>8 + 10</w:t>
             </w:r>
           </w:p>
         </w:tc>
@@ -12560,7 +12061,7 @@
               <w:spacing w:line="260" w:lineRule="auto"/>
             </w:pPr>
             <w:r>
-              <w:t>auth, tenant isolation, RBAC, masking, pagination, erasure, guardrail: all pass</w:t>
+              <w:t>auth, tenant isolation, RBAC, masking, pagination, erasure, guardrail, response contracts: all pass</w:t>
             </w:r>
           </w:p>
         </w:tc>
@@ -12593,12 +12094,6 @@
         </w:tc>
       </w:tr>
       <w:tr>
-        <w:tblPrEx>
-          <w:tblCellMar>
-            <w:top w:w="0" w:type="dxa"/>
-            <w:bottom w:w="0" w:type="dxa"/>
-          </w:tblCellMar>
-        </w:tblPrEx>
         <w:trPr>
           <w:cantSplit/>
         </w:trPr>
@@ -12652,7 +12147,7 @@
               <w:spacing w:line="260" w:lineRule="auto"/>
             </w:pPr>
             <w:r>
-              <w:t>Given/When/Then integration scenarios</w:t>
+              <w:t>pytest-bdd Gherkin features (tests/acceptance/features)</w:t>
             </w:r>
           </w:p>
         </w:tc>
@@ -12679,7 +12174,7 @@
               <w:spacing w:line="260" w:lineRule="auto"/>
             </w:pPr>
             <w:r>
-              <w:t>8</w:t>
+              <w:t>6 scenarios</w:t>
             </w:r>
           </w:p>
         </w:tc>
@@ -12706,7 +12201,7 @@
               <w:spacing w:line="260" w:lineRule="auto"/>
             </w:pPr>
             <w:r>
-              <w:t>All passed; Gherkin/behave files planned</w:t>
+              <w:t>risk list, alert ack + audit, copilot work order + human approval, analyst masking, tenant isolation, erasure: all pass</w:t>
             </w:r>
           </w:p>
         </w:tc>
@@ -12733,18 +12228,12 @@
               <w:spacing w:line="260" w:lineRule="auto"/>
             </w:pPr>
             <w:r>
-              <w:t>Yes</w:t>
+              <w:t>Yes (e2e job)</w:t>
             </w:r>
           </w:p>
         </w:tc>
       </w:tr>
       <w:tr>
-        <w:tblPrEx>
-          <w:tblCellMar>
-            <w:top w:w="0" w:type="dxa"/>
-            <w:bottom w:w="0" w:type="dxa"/>
-          </w:tblCellMar>
-        </w:tblPrEx>
         <w:trPr>
           <w:cantSplit/>
         </w:trPr>
@@ -12885,12 +12374,6 @@
         </w:tc>
       </w:tr>
       <w:tr>
-        <w:tblPrEx>
-          <w:tblCellMar>
-            <w:top w:w="0" w:type="dxa"/>
-            <w:bottom w:w="0" w:type="dxa"/>
-          </w:tblCellMar>
-        </w:tblPrEx>
         <w:trPr>
           <w:cantSplit/>
         </w:trPr>
@@ -12944,7 +12427,7 @@
               <w:spacing w:line="260" w:lineRule="auto"/>
             </w:pPr>
             <w:r>
-              <w:t>Semgrep, Bandit, pip-audit, Trivy</w:t>
+              <w:t>Semgrep, Bandit, pip-audit, Trivy, OWASP ZAP baseline</w:t>
             </w:r>
           </w:p>
         </w:tc>
@@ -12971,7 +12454,7 @@
               <w:spacing w:line="260" w:lineRule="auto"/>
             </w:pPr>
             <w:r>
-              <w:t>4 jobs</w:t>
+              <w:t>5</w:t>
             </w:r>
           </w:p>
         </w:tc>
@@ -12998,7 +12481,7 @@
               <w:spacing w:line="260" w:lineRule="auto"/>
             </w:pPr>
             <w:r>
-              <w:t>Configured in CI; results in the CI run</w:t>
+              <w:t>Bandit clean (0 medium/high); ZAP and Trivy reports in the CI run</w:t>
             </w:r>
           </w:p>
         </w:tc>
@@ -13031,12 +12514,6 @@
         </w:tc>
       </w:tr>
       <w:tr>
-        <w:tblPrEx>
-          <w:tblCellMar>
-            <w:top w:w="0" w:type="dxa"/>
-            <w:bottom w:w="0" w:type="dxa"/>
-          </w:tblCellMar>
-        </w:tblPrEx>
         <w:trPr>
           <w:cantSplit/>
         </w:trPr>
@@ -13272,6 +12749,7 @@
         <w:rPr>
           <w:b/>
         </w:rPr>
+        <w:lastRenderedPageBreak/>
         <w:t xml:space="preserve">Sample: </w:t>
       </w:r>
       <w:r>
@@ -13293,7 +12771,7 @@
         <w:t xml:space="preserve">Reports: </w:t>
       </w:r>
       <w:r>
-        <w:t>coverage (pytest --cov, uploaded by CI), docs/evidence/api_load.txt, processor_bench.txt, explain_analyze.txt, chaos.txt; Semgrep/Bandit/pip-audit/Trivy output in the GitHub Actions run.</w:t>
+        <w:t>coverage (pytest --cov, uploaded by CI), docs/evidence/api_load.txt, processor_bench.txt, explain_analyze.txt, chaos.txt; Semgrep/Bandit/pip-audit/Trivy/ZAP output and the e2e JUnit report in the GitHub Actions run.</w:t>
       </w:r>
     </w:p>
     <w:p>
@@ -13359,7 +12837,10 @@
         <w:spacing w:before="60" w:after="200" w:line="300" w:lineRule="auto"/>
       </w:pPr>
       <w:r>
-        <w:t>Troubleshooting a latency spike: (1) Grafana: is fp_api_latency p95 up for one route or all? (2) If all, check pod CPU and the Postgres connection pool; if one route, run EXPLAIN ANALYZE on its query (as in 5.3). (3) For alert latency, compare fp_ingest_latency with consumer lag: rising lag means processors are saturated, so scale replicas up to the partition count; flat lag but slow batches (fp_batch_seconds) points to Postgres writes. (4) Correlate with simulator burst logs. OpenTelemetry tracing across services is the next step.</w:t>
+        <w:t>Troubleshooting a latency spike: (1) Grafana: is fp_api_latency p95 up for one route or all? (2) If all, check pod CPU and the Postgres connection pool; if one route, run EXPLAIN ANALYZE on its query (as in 5.3). (3) For alert latency, compare fp_ingest_latency with consumer lag: rising lag means processors are saturated, so scale replicas up to the partition count; flat lag but slow batches (fp_batch_seconds) points to Postgres writes. (4) Correlate with simulator burst logs. OpenTelemetry tracing across s</w:t>
+      </w:r>
+      <w:r>
+        <w:t>ervices is the next step.</w:t>
       </w:r>
     </w:p>
     <w:p>
@@ -13497,7 +12978,14 @@
         <w:t xml:space="preserve">Data and features: </w:t>
       </w:r>
       <w:r>
-        <w:t>100,000 simulated vehicle-weeks from the same wear model as the live simulator; features: service-overdue ratio, age, odometer, max coolant (7 d), min 12 V (7 d), fault-code events (7 d), harsh brakes (7 d), EV / hybrid flags. Live features come from the vehicle_daily rollup. Leakage check: the label is drawn from a hazard on the hidden wear, which is never a feature; only noisy symptoms are.</w:t>
+        <w:t xml:space="preserve">100,000 simulated vehicle-weeks from the same wear model as the live simulator; features: service-overdue ratio, age, odometer, max coolant (7 d), min 12 V (7 d), fault-code events (7 </w:t>
+      </w:r>
+      <w:r>
+        <w:lastRenderedPageBreak/>
+        <w:t>d), harsh brakes (7 d), EV / hybrid flags. Live features come from the vehicle_daily rollup, which the batch job maintains incrementally (only rows since the last watermark are read, each counted exactly once). Leakage check: the label is drawn from a hazard on the hidden wear, which is never a feature; only noisy symptoms are</w:t>
+      </w:r>
+      <w:r>
+        <w:t>.</w:t>
       </w:r>
     </w:p>
     <w:p>
@@ -13538,12 +13026,6 @@
         <w:gridCol w:w="1404"/>
       </w:tblGrid>
       <w:tr>
-        <w:tblPrEx>
-          <w:tblCellMar>
-            <w:top w:w="0" w:type="dxa"/>
-            <w:bottom w:w="0" w:type="dxa"/>
-          </w:tblCellMar>
-        </w:tblPrEx>
         <w:trPr>
           <w:tblHeader/>
         </w:trPr>
@@ -13685,12 +13167,6 @@
         </w:tc>
       </w:tr>
       <w:tr>
-        <w:tblPrEx>
-          <w:tblCellMar>
-            <w:top w:w="0" w:type="dxa"/>
-            <w:bottom w:w="0" w:type="dxa"/>
-          </w:tblCellMar>
-        </w:tblPrEx>
         <w:trPr>
           <w:cantSplit/>
         </w:trPr>
@@ -13804,12 +13280,6 @@
         </w:tc>
       </w:tr>
       <w:tr>
-        <w:tblPrEx>
-          <w:tblCellMar>
-            <w:top w:w="0" w:type="dxa"/>
-            <w:bottom w:w="0" w:type="dxa"/>
-          </w:tblCellMar>
-        </w:tblPrEx>
         <w:trPr>
           <w:cantSplit/>
         </w:trPr>
@@ -13923,12 +13393,6 @@
         </w:tc>
       </w:tr>
       <w:tr>
-        <w:tblPrEx>
-          <w:tblCellMar>
-            <w:top w:w="0" w:type="dxa"/>
-            <w:bottom w:w="0" w:type="dxa"/>
-          </w:tblCellMar>
-        </w:tblPrEx>
         <w:trPr>
           <w:cantSplit/>
         </w:trPr>
@@ -14105,7 +13569,6 @@
           <w:b/>
           <w:bCs/>
         </w:rPr>
-        <w:lastRenderedPageBreak/>
         <w:t xml:space="preserve">Risks &amp; Technical Debt: </w:t>
       </w:r>
       <w:r>
@@ -14180,6 +13643,7 @@
       </w:pPr>
       <w:bookmarkStart w:id="27" w:name="s28"/>
       <w:r>
+        <w:lastRenderedPageBreak/>
         <w:t>13. Demo Video (5 Minutes Maximum)</w:t>
       </w:r>
       <w:bookmarkEnd w:id="27"/>
@@ -14220,12 +13684,6 @@
         <w:gridCol w:w="5956"/>
       </w:tblGrid>
       <w:tr>
-        <w:tblPrEx>
-          <w:tblCellMar>
-            <w:top w:w="0" w:type="dxa"/>
-            <w:bottom w:w="0" w:type="dxa"/>
-          </w:tblCellMar>
-        </w:tblPrEx>
         <w:trPr>
           <w:tblHeader/>
         </w:trPr>
@@ -14333,12 +13791,6 @@
         </w:tc>
       </w:tr>
       <w:tr>
-        <w:tblPrEx>
-          <w:tblCellMar>
-            <w:top w:w="0" w:type="dxa"/>
-            <w:bottom w:w="0" w:type="dxa"/>
-          </w:tblCellMar>
-        </w:tblPrEx>
         <w:trPr>
           <w:cantSplit/>
         </w:trPr>
@@ -14425,12 +13877,6 @@
         </w:tc>
       </w:tr>
       <w:tr>
-        <w:tblPrEx>
-          <w:tblCellMar>
-            <w:top w:w="0" w:type="dxa"/>
-            <w:bottom w:w="0" w:type="dxa"/>
-          </w:tblCellMar>
-        </w:tblPrEx>
         <w:trPr>
           <w:cantSplit/>
         </w:trPr>
@@ -14517,12 +13963,6 @@
         </w:tc>
       </w:tr>
       <w:tr>
-        <w:tblPrEx>
-          <w:tblCellMar>
-            <w:top w:w="0" w:type="dxa"/>
-            <w:bottom w:w="0" w:type="dxa"/>
-          </w:tblCellMar>
-        </w:tblPrEx>
         <w:trPr>
           <w:cantSplit/>
         </w:trPr>
@@ -14609,12 +14049,6 @@
         </w:tc>
       </w:tr>
       <w:tr>
-        <w:tblPrEx>
-          <w:tblCellMar>
-            <w:top w:w="0" w:type="dxa"/>
-            <w:bottom w:w="0" w:type="dxa"/>
-          </w:tblCellMar>
-        </w:tblPrEx>
         <w:trPr>
           <w:cantSplit/>
         </w:trPr>
@@ -14701,12 +14135,6 @@
         </w:tc>
       </w:tr>
       <w:tr>
-        <w:tblPrEx>
-          <w:tblCellMar>
-            <w:top w:w="0" w:type="dxa"/>
-            <w:bottom w:w="0" w:type="dxa"/>
-          </w:tblCellMar>
-        </w:tblPrEx>
         <w:trPr>
           <w:cantSplit/>
         </w:trPr>
@@ -14918,15 +14346,7 @@
         <w:t xml:space="preserve">Hygiene: </w:t>
       </w:r>
       <w:r>
-        <w:t>No secrets committed, .</w:t>
-      </w:r>
-      <w:proofErr w:type="spellStart"/>
-      <w:r>
-        <w:t>env.example</w:t>
-      </w:r>
-      <w:proofErr w:type="spellEnd"/>
-      <w:r>
-        <w:t xml:space="preserve"> provided, commits from all members</w:t>
+        <w:t>No secrets committed, .env.example provided, commits from all members</w:t>
       </w:r>
     </w:p>
     <w:p>
@@ -15003,7 +14423,11 @@
         <w:spacing w:before="60" w:after="200" w:line="300" w:lineRule="auto"/>
       </w:pPr>
       <w:r>
-        <w:t>Key learnings: idempotent sinks make at-least-once delivery safe and are far simpler than distributed transactions; partitioning by time turns retention into a metadata operation; most API latency wins came from indexes that match the query's filter and order.</w:t>
+        <w:t xml:space="preserve">Key learnings: idempotent sinks make at-least-once delivery safe and are far simpler than distributed transactions; partitioning by time turns retention into a metadata operation, but only if the rollups are incremental (our first materialised-view version re-scanned all history every minute and grew ~5 </w:t>
+      </w:r>
+      <w:r>
+        <w:lastRenderedPageBreak/>
+        <w:t>GB/hour until we replaced it); most API latency wins came from indexes that match the query's filter and order.</w:t>
       </w:r>
     </w:p>
     <w:p>
@@ -15028,7 +14452,6 @@
       </w:pPr>
       <w:bookmarkStart w:id="30" w:name="s31"/>
       <w:r>
-        <w:lastRenderedPageBreak/>
         <w:t>16. Declarations</w:t>
       </w:r>
       <w:bookmarkEnd w:id="30"/>
@@ -15104,7 +14527,7 @@
         <w:t xml:space="preserve">Open-source components: </w:t>
       </w:r>
       <w:r>
-        <w:t>FastAPI (MIT), Uvicorn (BSD), Pydantic (MIT), psycopg 3 (LGPL), redis-py (MIT), confluent-kafka / librdkafka (Apache-2.0 / BSD), scikit-learn (BSD), NumPy (BSD), joblib (BSD), PyJWT (MIT), prometheus-client (Apache-2.0), anthropic SDK (MIT), Leaflet (BSD-2), PostgreSQL (PostgreSQL licence), pgvector (PostgreSQL licence), Redis 7 (BSD), Redpanda (BSL, dev only), Prometheus and Grafana (Apache-2.0 / AGPL).</w:t>
+        <w:t>FastAPI (MIT), Uvicorn (BSD), Pydantic (MIT), psycopg 3 (LGPL), redis-py (MIT), confluent-kafka / librdkafka (Apache-2.0 / BSD), scikit-learn (BSD), NumPy (BSD), joblib (BSD), PyJWT (MIT), prometheus-client (Apache-2.0), anthropic SDK (MIT), Leaflet (BSD-2), pytest-bdd (MIT), Esri World Dark Gray Canvas map tiles (Esri terms, attributed in the UI), PostgreSQL (PostgreSQL licence), pgvector (PostgreSQL licence), Redis 7 (BSD), Redpanda (BSL, dev only), Prometheus and Grafana (Apache-2.0 / AGPL).</w:t>
       </w:r>
     </w:p>
     <w:p>
@@ -15141,6 +14564,7 @@
       </w:pPr>
       <w:bookmarkStart w:id="31" w:name="s32"/>
       <w:r>
+        <w:lastRenderedPageBreak/>
         <w:t>17. Appendix (if any)</w:t>
       </w:r>
       <w:bookmarkEnd w:id="31"/>
@@ -15210,22 +14634,26 @@
         <w:spacing w:after="90" w:line="290" w:lineRule="auto"/>
       </w:pPr>
       <w:r>
+        <w:rPr>
+          <w:noProof/>
+        </w:rPr>
         <w:drawing>
-          <wp:inline xmlns:a="http://schemas.openxmlformats.org/drawingml/2006/main" xmlns:pic="http://schemas.openxmlformats.org/drawingml/2006/picture">
+          <wp:inline distT="0" distB="0" distL="0" distR="0" wp14:anchorId="35DF6044" wp14:editId="557CE79E">
             <wp:extent cx="5943600" cy="2971800"/>
+            <wp:effectExtent l="0" t="0" r="0" b="0"/>
             <wp:docPr id="5" name="Picture 5"/>
             <wp:cNvGraphicFramePr>
-              <a:graphicFrameLocks noChangeAspect="1"/>
+              <a:graphicFrameLocks xmlns:a="http://schemas.openxmlformats.org/drawingml/2006/main" noChangeAspect="1"/>
             </wp:cNvGraphicFramePr>
-            <a:graphic>
+            <a:graphic xmlns:a="http://schemas.openxmlformats.org/drawingml/2006/main">
               <a:graphicData uri="http://schemas.openxmlformats.org/drawingml/2006/picture">
-                <pic:pic>
+                <pic:pic xmlns:pic="http://schemas.openxmlformats.org/drawingml/2006/picture">
                   <pic:nvPicPr>
                     <pic:cNvPr id="0" name="er.png"/>
                     <pic:cNvPicPr/>
                   </pic:nvPicPr>
                   <pic:blipFill>
-                    <a:blip r:embed="rId14"/>
+                    <a:blip r:embed="rId10"/>
                     <a:stretch>
                       <a:fillRect/>
                     </a:stretch>
@@ -15235,7 +14663,9 @@
                       <a:off x="0" y="0"/>
                       <a:ext cx="5943600" cy="2971800"/>
                     </a:xfrm>
-                    <a:prstGeom prst="rect"/>
+                    <a:prstGeom prst="rect">
+                      <a:avLst/>
+                    </a:prstGeom>
                   </pic:spPr>
                 </pic:pic>
               </a:graphicData>
@@ -15258,8 +14688,8 @@
       </w:r>
     </w:p>
     <w:sectPr>
-      <w:headerReference w:type="default" r:id="rId7"/>
-      <w:footerReference w:type="default" r:id="rId8"/>
+      <w:headerReference w:type="default" r:id="rId11"/>
+      <w:footerReference w:type="default" r:id="rId12"/>
       <w:pgSz w:w="11906" w:h="16838"/>
       <w:pgMar w:top="1440" w:right="1300" w:bottom="1300" w:left="1300" w:header="600" w:footer="600" w:gutter="0"/>
       <w:cols w:space="720"/>
@@ -15390,7 +14820,7 @@
           <wp:extent cx="1336675" cy="265430"/>
           <wp:effectExtent l="0" t="0" r="0" b="1270"/>
           <wp:wrapSquare wrapText="bothSides"/>
-          <wp:docPr id="1" name="Picture 1" descr="A black background with orange letters&#10;&#10;AI-generated content may be incorrect."/>
+          <wp:docPr id="789132067" name="Picture 789132067" descr="A black background with orange letters&#10;&#10;AI-generated content may be incorrect."/>
           <wp:cNvGraphicFramePr>
             <a:graphicFrameLocks xmlns:a="http://schemas.openxmlformats.org/drawingml/2006/main" noChangeAspect="1"/>
           </wp:cNvGraphicFramePr>

</xml_diff>

<commit_message>
Soak results, narrated explainer script, docs and solution document refreshed
- docs/evidence/soak.txt: 45-minute soak (15.8M events, no restarts,
  freshness p50 0.19 s; bursts back up after ~25 min as the hourly
  partition outgrows cache) with the full sample log
- docs/demo-script.md: 9.5-minute narrated script with words, clicks and
  prep steps
- README, PROJECT_CONTEXT, Grafana screenshot and the Solution Document
  (docx + PDF) updated with the load, API, freshness, soak and K8s results
</commit_message>
<xml_diff>
--- a/docs/solution/FleetPulse_Solution_Document.docx
+++ b/docs/solution/FleetPulse_Solution_Document.docx
@@ -103,7 +103,7 @@
           <w:b/>
           <w:bCs/>
         </w:rPr>
-        <w:t>Demo Video URL (≤ 5 min): [Link]</w:t>
+        <w:t>Demo Video URL (explainer, ≤ 10 min): [Link]</w:t>
       </w:r>
     </w:p>
     <w:p>
@@ -746,10 +746,10 @@
         <w:t xml:space="preserve">Results (measured on the submitted code). </w:t>
       </w:r>
       <w:r>
-        <w:t xml:space="preserve">100,000 simulated vehicles across 3 tenants and 2 OEM payload formats; ~5,000 events/s sustained end to end with 3x bursts every two minutes on four processor replicas (CPU hot path 33.9K events/s per core); critical alert vehicle → screen p50 0.17 s and p95 2.6 s even through a 3x burst (target &lt; 5 s); 100,000 vehicles scored in ~10 s; risk model ROC-AUC 0.878 vs 0.688 for the mileage-since-service baseline and 4.2x the baseline's precision on the top 2% of the fleet; API p95 71 ms at 10 concurrent users; </w:t>
-      </w:r>
-      <w:r>
-        <w:t>slowest query 174 ms → 0.58 ms; recovery from killing both processors and restarting the broker with zero data loss.</w:t>
+        <w:t xml:space="preserve">100,000 simulated vehicles across 3 tenants and 2 OEM payload formats; load-tested end to end at up to ~25,000 events/s with 3x bursts and zero data loss (every unique event written), ~5,000 events/s in the default demo (CPU hot path 33.9K events/s per core); data freshness vehicle → dashboard ~0.15 s; critical alert vehicle → screen p50 0.17 s and p95 2.6 s even through a 3x burst (target &lt; 5 s); 100,000 vehicles scored in ~10 s; risk model ROC-AUC 0.878 vs 0.688 for the mileage-since-service baseline and </w:t>
+      </w:r>
+      <w:r>
+        <w:t>4.2x the baseline's precision on the top 2% of the fleet; API p95 110 ms at 50 concurrent users; slowest query 174 ms → 0.58 ms; recovery from killing the processors and restarting the broker in ~26 s with zero data loss; the production Kubernetes manifests deploy unchanged (config only) on a kind cluster in CI.</w:t>
       </w:r>
     </w:p>
     <w:p>
@@ -851,7 +851,11 @@
         <w:spacing w:before="60" w:after="200" w:line="300" w:lineRule="auto"/>
       </w:pPr>
       <w:r>
-        <w:t>“A fleet manager needs a way to know which vehicles will fail in the next week and act before they do, because breakdowns are discovered only when a driver is stranded, which today costs roughly US$2,400 per incident in towing, emergency repair and two days of lost vehicle utilisation (our working assumption, see 2.2).”</w:t>
+        <w:t xml:space="preserve">“A fleet manager needs a way to know which vehicles will fail in the next week and act before they do, because breakdowns are discovered only when a driver is stranded, which today costs roughly </w:t>
+      </w:r>
+      <w:r>
+        <w:lastRenderedPageBreak/>
+        <w:t>US$2,400 per incident in towing, emergency repair and two days of lost vehicle utilisation (our working assumption, see 2.2).”</w:t>
       </w:r>
     </w:p>
     <w:p>
@@ -862,7 +866,6 @@
         <w:rPr>
           <w:b/>
         </w:rPr>
-        <w:lastRenderedPageBreak/>
         <w:t xml:space="preserve">Primary user: </w:t>
       </w:r>
       <w:r>
@@ -1695,6 +1698,7 @@
     </w:p>
     <w:p>
       <w:r>
+        <w:lastRenderedPageBreak/>
         <w:t>Existing alternatives: aftermarket OBD dongles (hardware cost and install, one data format); OEM portals (one brand per portal, alerts after the fault); rule-only telematics (alerts on a code, no ranking of who fails next); Motorq Fuse (AI recommendations on OEM data, commercial). FleetPulse combines device-free multi-OEM ingestion, sub-5-second alerts and an explainable 7-day forecast in one view.</w:t>
       </w:r>
     </w:p>
@@ -2496,11 +2500,11 @@
         <w:spacing w:before="60" w:after="200" w:line="300" w:lineRule="auto"/>
       </w:pPr>
       <w:r>
-        <w:t xml:space="preserve">User journey: (1) a Borealis van reports coolant at 119 °C and code P0217 in OEM-specific JSON; (2) the processor normalises it, validates the VIN check digit, drops duplicates and evaluates sliding-window rules; (3) an OVERHEAT_TREND / CRITICAL_DTC alert is written idempotently and pushed over WebSocket, appearing on the dashboard ~0.2 s after the vehicle timestamp; (4) the manager opens the </w:t>
-      </w:r>
-      <w:r>
         <w:lastRenderedPageBreak/>
-        <w:t>vehicle: 73% 7-day risk, reasons “overdue for service, coolant running hot, 12 V battery voltage low”, the coolant trend and recent alerts; (5) they click Propose work order (or ask the copilot); (6) the work order appears as proposed and a manager approves it; every step is in the audit log.</w:t>
+        <w:t>User journey: (1) a Borealis van reports coolant at 119 °C and code P0217 in OEM-specific JSON; (2) the processor normalises it, validates the VIN check digit, drops duplicates and evaluates sliding-window rules; (3) an OVERHEAT_TREND / CRITICAL_DTC alert is written idempotently and pushed over WebSocket, appearing on the dashboard ~0.2 s after the vehicle timestamp; (4) the manager opens the vehicle: 73% 7-day risk, reasons “overdue for service, coolant running hot, 12 V battery voltage low”, the coolant t</w:t>
+      </w:r>
+      <w:r>
+        <w:t>rend and recent alerts; (5) they click Propose work order (or ask the copilot); (6) the work order appears as proposed and a manager approves it; every step is in the audit log.</w:t>
       </w:r>
     </w:p>
     <w:p>
@@ -2512,7 +2516,7 @@
           <w:noProof/>
         </w:rPr>
         <w:drawing>
-          <wp:inline distT="0" distB="0" distL="0" distR="0" wp14:anchorId="6B4D0280" wp14:editId="0465D72C">
+          <wp:inline distT="0" distB="0" distL="0" distR="0" wp14:anchorId="68EFC275" wp14:editId="5103FFB5">
             <wp:extent cx="5760720" cy="4492562"/>
             <wp:effectExtent l="0" t="0" r="0" b="0"/>
             <wp:docPr id="1" name="Picture 1"/>
@@ -2558,7 +2562,7 @@
         </w:rPr>
         <w:lastRenderedPageBreak/>
         <w:drawing>
-          <wp:inline distT="0" distB="0" distL="0" distR="0" wp14:anchorId="51FC7166" wp14:editId="5C973BA8">
+          <wp:inline distT="0" distB="0" distL="0" distR="0" wp14:anchorId="2175B09A" wp14:editId="3B04C25C">
             <wp:extent cx="5760720" cy="4000500"/>
             <wp:effectExtent l="0" t="0" r="0" b="0"/>
             <wp:docPr id="2" name="Picture 2"/>
@@ -5405,7 +5409,7 @@
           <w:noProof/>
         </w:rPr>
         <w:drawing>
-          <wp:inline distT="0" distB="0" distL="0" distR="0" wp14:anchorId="30D8818F" wp14:editId="7CEF2981">
+          <wp:inline distT="0" distB="0" distL="0" distR="0" wp14:anchorId="40A12906" wp14:editId="01AFB0B6">
             <wp:extent cx="5943600" cy="2971800"/>
             <wp:effectExtent l="0" t="0" r="0" b="0"/>
             <wp:docPr id="3" name="Picture 3"/>
@@ -6092,7 +6096,7 @@
               <w:spacing w:line="260" w:lineRule="auto"/>
             </w:pPr>
             <w:r>
-              <w:t>Portable across clouds by configuration; CI runs lint, unit tests with coverage gate, SAST, e2e (integration, contract, BDD), ZAP DAST, image scan and chaos</w:t>
+              <w:t>Portable across clouds by configuration (proven on kind in CI); CI runs lint, unit tests with coverage gate, SAST, e2e (integration, contract, BDD), ZAP DAST, image scan and chaos</w:t>
             </w:r>
           </w:p>
         </w:tc>
@@ -6704,7 +6708,7 @@
           <w:noProof/>
         </w:rPr>
         <w:drawing>
-          <wp:inline distT="0" distB="0" distL="0" distR="0" wp14:anchorId="7E1842E7" wp14:editId="03CBA0AB">
+          <wp:inline distT="0" distB="0" distL="0" distR="0" wp14:anchorId="4C1AEE50" wp14:editId="403555BF">
             <wp:extent cx="5943600" cy="2971800"/>
             <wp:effectExtent l="0" t="0" r="0" b="0"/>
             <wp:docPr id="4" name="Picture 4"/>
@@ -6848,7 +6852,10 @@
         <w:spacing w:before="60" w:after="200" w:line="300" w:lineRule="auto"/>
       </w:pPr>
       <w:r>
-        <w:t>Cloud-agnostic approach: the application only reads KAFKA_BOOTSTRAP, PG_DSN, REDIS_URL and JWT_SECRET from the environment (12-factor). Terraform for AWS (infra/terraform/aws: VPC, EKS, MSK, RDS Multi-AZ, ElastiCache, all encrypted) provisions the backing services; the same manifests run on GKE/AKS with Confluent/Event Hubs, Cloud SQL/Flexible Server and Memorystore/Azure Cache, or locally on kind/k3d and docker compose, with no code change.</w:t>
+        <w:t>Portability proof: a CI job deploys these exact manifests on a kind Kubernetes cluster through a kustomize overlay that changes configuration only (image, Secret, replica counts; Ingress omitted), under the restricted Pod Security profile, then smoke-tests login and live streaming through the Service. Cloud-agnostic approach: the application only reads KAFKA_BOOTSTRAP, PG_DSN, REDIS_URL and JWT_SECRET from the environment (12-factor). Terraform for AWS (infra/terraform/aws: VPC, EKS, MSK, RDS Multi-AZ, Elas</w:t>
+      </w:r>
+      <w:r>
+        <w:t>tiCache, all encrypted) provisions the backing services; the same manifests run on GKE/AKS with Confluent/Event Hubs, Cloud SQL/Flexible Server and Memorystore/Azure Cache, or locally on kind/k3d and docker compose, with no code change.</w:t>
       </w:r>
     </w:p>
     <w:p>
@@ -9806,10 +9813,10 @@
         <w:tblLook w:val="0000" w:firstRow="0" w:lastRow="0" w:firstColumn="0" w:lastColumn="0" w:noHBand="0" w:noVBand="0"/>
       </w:tblPr>
       <w:tblGrid>
-        <w:gridCol w:w="2233"/>
-        <w:gridCol w:w="2978"/>
-        <w:gridCol w:w="1489"/>
-        <w:gridCol w:w="2606"/>
+        <w:gridCol w:w="1966"/>
+        <w:gridCol w:w="2494"/>
+        <w:gridCol w:w="1410"/>
+        <w:gridCol w:w="3436"/>
       </w:tblGrid>
       <w:tr>
         <w:trPr>
@@ -9845,6 +9852,7 @@
                 <w:sz w:val="20"/>
                 <w:szCs w:val="20"/>
               </w:rPr>
+              <w:lastRenderedPageBreak/>
               <w:t>NFR</w:t>
             </w:r>
           </w:p>
@@ -10006,7 +10014,7 @@
               <w:spacing w:line="260" w:lineRule="auto"/>
             </w:pPr>
             <w:r>
-              <w:t>100K+ events/sec</w:t>
+              <w:t>100K+ events/sec; 3x burst for 5 min without loss</w:t>
             </w:r>
           </w:p>
         </w:tc>
@@ -10033,7 +10041,7 @@
               <w:spacing w:line="260" w:lineRule="auto"/>
             </w:pPr>
             <w:r>
-              <w:t>~5K/s sustained on 4 vCPUs (2 replicas); 33.9K/s per core CPU path</w:t>
+              <w:t>Zero loss at 12.8K/s and 25.7K/s offered with 3x bursts (rows written = unique events sent); Kafka accepted 69K/s, processing ceiling ~24K/s on one laptop Postgres (scale-out path in ADR-0002); 33.9K/s per core CPU path</w:t>
             </w:r>
           </w:p>
         </w:tc>
@@ -10060,7 +10068,7 @@
               <w:spacing w:line="260" w:lineRule="auto"/>
             </w:pPr>
             <w:r>
-              <w:t>Simulator + processor logs; processor_bench.py</w:t>
+              <w:t>tests/load/pipeline_load.py; docs/evidence/processor_bench.txt</w:t>
             </w:r>
           </w:p>
         </w:tc>
@@ -10146,7 +10154,7 @@
               <w:spacing w:line="260" w:lineRule="auto"/>
             </w:pPr>
             <w:r>
-              <w:t>Critical alert p50 0.17 s, p95 2.6 s, max 3.2 s through a 3x burst; dashboard KPIs refresh every 3 s</w:t>
+              <w:t>Data freshness vehicle → dashboard p50 ~0.15 s (KPIs poll every 1 s); critical alert p50 0.17 s, p95 2.6 s, max 3.2 s through a 3x burst</w:t>
             </w:r>
           </w:p>
         </w:tc>
@@ -10205,6 +10213,7 @@
               <w:spacing w:line="260" w:lineRule="auto"/>
             </w:pPr>
             <w:r>
+              <w:lastRenderedPageBreak/>
               <w:t>API Latency</w:t>
             </w:r>
           </w:p>
@@ -10259,7 +10268,7 @@
               <w:spacing w:line="260" w:lineRule="auto"/>
             </w:pPr>
             <w:r>
-              <w:t>p95 71 ms, p99 110 ms @10 conc.; p95 456 ms @50 conc. on shared box</w:t>
+              <w:t>p95 18 ms @10, p95 110 ms / p99 132 ms @50, p95 224 ms @100 concurrent users, with the pipeline running on the same box</w:t>
             </w:r>
           </w:p>
         </w:tc>
@@ -10372,7 +10381,7 @@
               <w:spacing w:line="260" w:lineRule="auto"/>
             </w:pPr>
             <w:r>
-              <w:t>Recovered: processors killed + broker restarted, backlog drained at ~9K/s, no duplicates</w:t>
+              <w:t>Processors killed + broker restarted: flow resumes ~26 s after the restart (10 s consumer session timeout), zero loss, no duplicates; proven in CI on every push</w:t>
             </w:r>
           </w:p>
         </w:tc>
@@ -10568,11 +10577,11 @@
         <w:spacing w:before="60" w:after="200" w:line="300" w:lineRule="auto"/>
       </w:pPr>
       <w:r>
+        <w:t xml:space="preserve">Original load test setup: everything on one 4-vCPU cloud VM under docker compose (Redpanda, Postgres 16, Redis, 2 processors, simulator, batch, API) with 100K vehicles at a 5,000 events/s base rate and 3x bursts for 10 s every 2 minutes. API load: tests/load/api_load.py (async httpx) against 4 uvicorn workers, rate limiter raised for the test. Processor CPU benchmark: tests/load/processor_bench.py. </w:t>
+      </w:r>
+      <w:r>
         <w:lastRenderedPageBreak/>
-        <w:t>Load test setup: everything on one 4-vCPU cloud VM under docker compose (Redpanda, Postgres 16, Redis, 2 processors, simulator, batch, API) with 100K vehicles at a 5,000 events/s base rate and 3x bursts for 10 s every 2 minutes. API load: tests/load/api_load.py (async httpx) against 4 uvicorn workers, rate limiter raised for the test. Processor CPU benchmark: tests/load/processor_bench.py. Alert latency was re-measured after hardening on a 16-vCPU laptop with 4 processor replicas (docs/evidence/alert_latenc</w:t>
-      </w:r>
-      <w:r>
-        <w:t>y.txt). Raw outputs in docs/evidence/.</w:t>
+        <w:t>After hardening, everything was re-measured on a 16-vCPU laptop: alert latency with 4 processor replicas (docs/evidence/alert_latency.txt); end-to-end throughput with tests/load/pipeline_load.py (parallel producers, 3x bursts, zero-loss check); API latency with a multi-process client inside the compose network (api_load.txt); and a 45-minute soak (soak.txt). Raw outputs in docs/evidence/.</w:t>
       </w:r>
     </w:p>
     <w:p>
@@ -11632,11 +11641,11 @@
         <w:tblLook w:val="0000" w:firstRow="0" w:lastRow="0" w:firstColumn="0" w:lastColumn="0" w:noHBand="0" w:noVBand="0"/>
       </w:tblPr>
       <w:tblGrid>
-        <w:gridCol w:w="2456"/>
+        <w:gridCol w:w="2433"/>
         <w:gridCol w:w="2710"/>
-        <w:gridCol w:w="1155"/>
-        <w:gridCol w:w="2104"/>
-        <w:gridCol w:w="881"/>
+        <w:gridCol w:w="1152"/>
+        <w:gridCol w:w="2092"/>
+        <w:gridCol w:w="919"/>
       </w:tblGrid>
       <w:tr>
         <w:trPr>
@@ -11921,7 +11930,7 @@
               <w:spacing w:line="260" w:lineRule="auto"/>
             </w:pPr>
             <w:r>
-              <w:t>99% line coverage on core, rules, guardrails, features</w:t>
+              <w:t>98% line coverage on all domain modules (algorithms, rules, guardrails, features, fleet generator); I/O entrypoints covered by the live-stack suites</w:t>
             </w:r>
           </w:p>
         </w:tc>
@@ -11948,7 +11957,7 @@
               <w:spacing w:line="260" w:lineRule="auto"/>
             </w:pPr>
             <w:r>
-              <w:t>Yes</w:t>
+              <w:t>Yes (80% gate)</w:t>
             </w:r>
           </w:p>
         </w:tc>
@@ -12287,7 +12296,7 @@
               <w:spacing w:line="260" w:lineRule="auto"/>
             </w:pPr>
             <w:r>
-              <w:t>api_load.py, processor_bench.py, 15+ min continuous run</w:t>
+              <w:t>pipeline_load.py (zero-loss check, parallel producers, 3x bursts), api_load.py (multi-process client), soak.py (45 min), processor_bench.py</w:t>
             </w:r>
           </w:p>
         </w:tc>
@@ -12314,7 +12323,7 @@
               <w:spacing w:line="260" w:lineRule="auto"/>
             </w:pPr>
             <w:r>
-              <w:t>3</w:t>
+              <w:t>4</w:t>
             </w:r>
           </w:p>
         </w:tc>
@@ -12341,7 +12350,7 @@
               <w:spacing w:line="260" w:lineRule="auto"/>
             </w:pPr>
             <w:r>
-              <w:t>p95 71 ms @10; 33.9K ev/s/core; ~5.4M events over the soak</w:t>
+              <w:t>Zero loss at 25.7K ev/s offered; API p95 110 ms @50; soak 15.8M events, freshness p50 0.19 s, burst backlog grows after ~25 min (p95 7.9 s) as the hourly partition outgrows cache</w:t>
             </w:r>
           </w:p>
         </w:tc>
@@ -12368,7 +12377,7 @@
               <w:spacing w:line="260" w:lineRule="auto"/>
             </w:pPr>
             <w:r>
-              <w:t>Partial</w:t>
+              <w:t>Manual (needs a 16-vCPU host)</w:t>
             </w:r>
           </w:p>
         </w:tc>
@@ -12621,7 +12630,7 @@
               <w:spacing w:line="260" w:lineRule="auto"/>
             </w:pPr>
             <w:r>
-              <w:t>Audit row on erase; recovery with no data loss</w:t>
+              <w:t>Audit row on erase; flow resumes ~26 s after a broker restart, no data loss</w:t>
             </w:r>
           </w:p>
         </w:tc>
@@ -12749,7 +12758,6 @@
         <w:rPr>
           <w:b/>
         </w:rPr>
-        <w:lastRenderedPageBreak/>
         <w:t xml:space="preserve">Sample: </w:t>
       </w:r>
       <w:r>
@@ -12829,7 +12837,10 @@
         <w:spacing w:before="60" w:after="200" w:line="300" w:lineRule="auto"/>
       </w:pPr>
       <w:r>
-        <w:t>Every service exposes Prometheus metrics: fp_events_total{outcome=ok|late|duplicate|dlq}, fp_ingest_latency_seconds (vehicle timestamp → processed), fp_alerts_total{rule}, fp_batch_seconds, fp_api_latency_seconds{route}. docker compose --profile observability starts Prometheus and Grafana. Consumer lag comes from rpk group describe / the Kafka exporter. Logs are structured stdout collected by the platform (Loki/ELK). The dashboard itself shows live events/s and measured alert latency.</w:t>
+        <w:t xml:space="preserve">Every service exposes Prometheus metrics: fp_events_total{outcome=ok|late|duplicate|dlq}, fp_ingest_latency_seconds (vehicle timestamp → processed), fp_alerts_total{rule}, fp_batch_seconds, fp_api_latency_seconds{route}. docker compose --profile observability starts Prometheus and Grafana with a provisioned “FleetPulse pipeline” dashboard (events/s by outcome, ingest latency p50/p95/p99, alerts by rule, batch time, API p95 by route, Kafka ingest rate). Consumer lag comes from rpk group describe / the Kafka </w:t>
+      </w:r>
+      <w:r>
+        <w:t>exporter. Logs are structured stdout collected by the platform (Loki/ELK). The dashboard itself shows live events/s and measured alert latency.</w:t>
       </w:r>
     </w:p>
     <w:p>
@@ -12887,6 +12898,7 @@
           <w:b/>
           <w:bCs/>
         </w:rPr>
+        <w:lastRenderedPageBreak/>
         <w:t xml:space="preserve">Data &amp; Features: </w:t>
       </w:r>
       <w:r>
@@ -12978,11 +12990,7 @@
         <w:t xml:space="preserve">Data and features: </w:t>
       </w:r>
       <w:r>
-        <w:t xml:space="preserve">100,000 simulated vehicle-weeks from the same wear model as the live simulator; features: service-overdue ratio, age, odometer, max coolant (7 d), min 12 V (7 d), fault-code events (7 </w:t>
-      </w:r>
-      <w:r>
-        <w:lastRenderedPageBreak/>
-        <w:t>d), harsh brakes (7 d), EV / hybrid flags. Live features come from the vehicle_daily rollup, which the batch job maintains incrementally (only rows since the last watermark are read, each counted exactly once). Leakage check: the label is drawn from a hazard on the hidden wear, which is never a feature; only noisy symptoms are</w:t>
+        <w:t>100,000 simulated vehicle-weeks from the same wear model as the live simulator; features: service-overdue ratio, age, odometer, max coolant (7 d), min 12 V (7 d), fault-code events (7 d), harsh brakes (7 d), EV / hybrid flags. Live features come from the vehicle_daily rollup, which the batch job maintains incrementally (only rows since the last watermark are read, each counted exactly once). Leakage check: the label is drawn from a hazard on the hidden wear, which is never a feature; only noisy symptoms are</w:t>
       </w:r>
       <w:r>
         <w:t>.</w:t>
@@ -13603,6 +13611,7 @@
         <w:rPr>
           <w:b/>
         </w:rPr>
+        <w:lastRenderedPageBreak/>
         <w:t xml:space="preserve">ADRs (docs/adr): </w:t>
       </w:r>
       <w:r>
@@ -13620,7 +13629,7 @@
         <w:t xml:space="preserve">Risks and shortcuts: </w:t>
       </w:r>
       <w:r>
-        <w:t>100K events/s not proven end to end (measured 5K/s on 4 vCPUs; ~34K/s per core CPU path implies 4–6 processor replicas plus a telemetry store beyond a single Postgres primary). mTLS, OIDC and Vault are designed, not running. The model is validated on simulated data only. Terraform is unapplied. Bloom state is per process and lost on restart (DB constraints keep correctness).</w:t>
+        <w:t>100K events/s not proven end to end: on one laptop the pipeline sustains ~24K events/s with zero loss and Kafka absorbs 69K/s, with a single Postgres primary as the ceiling; 100K/s needs the telemetry store beyond one Postgres primary (ADR-0002). mTLS, OIDC and Vault are designed, not running. The model is validated on simulated data only. Terraform is unapplied. Bloom state is per process and lost on restart (DB constraints keep correctness).</w:t>
       </w:r>
     </w:p>
     <w:p>
@@ -13643,7 +13652,6 @@
       </w:pPr>
       <w:bookmarkStart w:id="27" w:name="s28"/>
       <w:r>
-        <w:lastRenderedPageBreak/>
         <w:t>13. Demo Video (5 Minutes Maximum)</w:t>
       </w:r>
       <w:bookmarkEnd w:id="27"/>
@@ -13717,6 +13725,7 @@
                 <w:sz w:val="20"/>
                 <w:szCs w:val="20"/>
               </w:rPr>
+              <w:lastRenderedPageBreak/>
               <w:t>Time</w:t>
             </w:r>
           </w:p>
@@ -13817,7 +13826,7 @@
               <w:spacing w:line="260" w:lineRule="auto"/>
             </w:pPr>
             <w:r>
-              <w:t>0:00 – 0:30</w:t>
+              <w:t>0:00 – 0:45</w:t>
             </w:r>
           </w:p>
         </w:tc>
@@ -13871,7 +13880,7 @@
               <w:spacing w:line="260" w:lineRule="auto"/>
             </w:pPr>
             <w:r>
-              <w:t>Stranded van, US$2,400 per breakdown, 2,800 breakdowns/week at 100K vehicles</w:t>
+              <w:t>US$2,400 per breakdown, ~2,800 breakdowns a week at 100K vehicles, mixed ICE/EV fleets, one format per OEM</w:t>
             </w:r>
           </w:p>
         </w:tc>
@@ -13903,7 +13912,7 @@
               <w:spacing w:line="260" w:lineRule="auto"/>
             </w:pPr>
             <w:r>
-              <w:t>0:30 – 1:00</w:t>
+              <w:t>0:45 – 1:45</w:t>
             </w:r>
           </w:p>
         </w:tc>
@@ -13930,7 +13939,7 @@
               <w:spacing w:line="260" w:lineRule="auto"/>
             </w:pPr>
             <w:r>
-              <w:t>Solution</w:t>
+              <w:t>Architecture</w:t>
             </w:r>
           </w:p>
         </w:tc>
@@ -13957,7 +13966,7 @@
               <w:spacing w:line="260" w:lineRule="auto"/>
             </w:pPr>
             <w:r>
-              <w:t>“FleetPulse tells you who breaks down this week, why, and what it saves”</w:t>
+              <w:t>Simulator → Kafka → processors (normalise, VIN check, Bloom dedup, rules) → Postgres/Redis/pgvector; batch rollup + ML; FastAPI</w:t>
             </w:r>
           </w:p>
         </w:tc>
@@ -13989,7 +13998,7 @@
               <w:spacing w:line="260" w:lineRule="auto"/>
             </w:pPr>
             <w:r>
-              <w:t>1:00 – 3:00</w:t>
+              <w:t>1:45 – 2:45</w:t>
             </w:r>
           </w:p>
         </w:tc>
@@ -14016,7 +14025,7 @@
               <w:spacing w:line="260" w:lineRule="auto"/>
             </w:pPr>
             <w:r>
-              <w:t>Live Demo</w:t>
+              <w:t>Live dashboard</w:t>
             </w:r>
           </w:p>
         </w:tc>
@@ -14043,7 +14052,7 @@
               <w:spacing w:line="260" w:lineRule="auto"/>
             </w:pPr>
             <w:r>
-              <w:t>Login, live KPIs, critical alert arriving, open vehicle (73% risk + reasons), copilot questions, propose and approve work order, analyst login shows masked map</w:t>
+              <w:t>Manager login; live KPIs incl. alert latency (~0.2 s) and data freshness (~0.15 s); map of 8 depots; alerts over WebSocket</w:t>
             </w:r>
           </w:p>
         </w:tc>
@@ -14075,7 +14084,7 @@
               <w:spacing w:line="260" w:lineRule="auto"/>
             </w:pPr>
             <w:r>
-              <w:t>3:00 – 4:15</w:t>
+              <w:t>2:45 – 3:45</w:t>
             </w:r>
           </w:p>
         </w:tc>
@@ -14102,7 +14111,7 @@
               <w:spacing w:line="260" w:lineRule="auto"/>
             </w:pPr>
             <w:r>
-              <w:t>Under the Hood</w:t>
+              <w:t>Predicting breakdowns</w:t>
             </w:r>
           </w:p>
         </w:tc>
@@ -14129,7 +14138,7 @@
               <w:spacing w:line="260" w:lineRule="auto"/>
             </w:pPr>
             <w:r>
-              <w:t>Architecture slide, docker compose ps, kill processors and broker live, lag drains; query plans; model vs baseline</w:t>
+              <w:t>Top-risk vehicle: risk %, reasons, trends, alerts; model 0.88 vs 0.69 ROC-AUC, 4.2x precision; propose work order</w:t>
             </w:r>
           </w:p>
         </w:tc>
@@ -14161,7 +14170,7 @@
               <w:spacing w:line="260" w:lineRule="auto"/>
             </w:pPr>
             <w:r>
-              <w:t>4:15 – 5:00</w:t>
+              <w:t>3:45 – 4:45</w:t>
             </w:r>
           </w:p>
         </w:tc>
@@ -14188,7 +14197,7 @@
               <w:spacing w:line="260" w:lineRule="auto"/>
             </w:pPr>
             <w:r>
-              <w:t>Impact &amp; Next Steps</w:t>
+              <w:t>AI copilot</w:t>
             </w:r>
           </w:p>
         </w:tc>
@@ -14215,7 +14224,437 @@
               <w:spacing w:line="260" w:lineRule="auto"/>
             </w:pPr>
             <w:r>
-              <w:t>US$63K/week net for one tenant, 4.2x precision, honest gaps, roadmap, team</w:t>
+              <w:t>Tenant-scoped tool calls, savings estimate, prompt injection refused, human approval, audit log</w:t>
+            </w:r>
+          </w:p>
+        </w:tc>
+      </w:tr>
+      <w:tr>
+        <w:trPr>
+          <w:cantSplit/>
+        </w:trPr>
+        <w:tc>
+          <w:tcPr>
+            <w:tcW w:w="1489" w:type="dxa"/>
+            <w:tcBorders>
+              <w:top w:val="single" w:sz="4" w:space="0" w:color="BFBFBF"/>
+              <w:left w:val="single" w:sz="4" w:space="0" w:color="BFBFBF"/>
+              <w:bottom w:val="single" w:sz="4" w:space="0" w:color="BFBFBF"/>
+              <w:right w:val="single" w:sz="4" w:space="0" w:color="BFBFBF"/>
+            </w:tcBorders>
+            <w:tcMar>
+              <w:top w:w="80" w:type="dxa"/>
+              <w:left w:w="110" w:type="dxa"/>
+              <w:bottom w:w="80" w:type="dxa"/>
+              <w:right w:w="110" w:type="dxa"/>
+            </w:tcMar>
+          </w:tcPr>
+          <w:p>
+            <w:pPr>
+              <w:keepNext/>
+              <w:keepLines/>
+              <w:spacing w:line="260" w:lineRule="auto"/>
+            </w:pPr>
+            <w:r>
+              <w:t>4:45 – 5:20</w:t>
+            </w:r>
+          </w:p>
+        </w:tc>
+        <w:tc>
+          <w:tcPr>
+            <w:tcW w:w="1861" w:type="dxa"/>
+            <w:tcBorders>
+              <w:top w:val="single" w:sz="4" w:space="0" w:color="BFBFBF"/>
+              <w:left w:val="single" w:sz="4" w:space="0" w:color="BFBFBF"/>
+              <w:bottom w:val="single" w:sz="4" w:space="0" w:color="BFBFBF"/>
+              <w:right w:val="single" w:sz="4" w:space="0" w:color="BFBFBF"/>
+            </w:tcBorders>
+            <w:tcMar>
+              <w:top w:w="80" w:type="dxa"/>
+              <w:left w:w="110" w:type="dxa"/>
+              <w:bottom w:w="80" w:type="dxa"/>
+              <w:right w:w="110" w:type="dxa"/>
+            </w:tcMar>
+          </w:tcPr>
+          <w:p>
+            <w:pPr>
+              <w:keepNext/>
+              <w:keepLines/>
+              <w:spacing w:line="260" w:lineRule="auto"/>
+            </w:pPr>
+            <w:r>
+              <w:t>Privacy</w:t>
+            </w:r>
+          </w:p>
+        </w:tc>
+        <w:tc>
+          <w:tcPr>
+            <w:tcW w:w="5956" w:type="dxa"/>
+            <w:tcBorders>
+              <w:top w:val="single" w:sz="4" w:space="0" w:color="BFBFBF"/>
+              <w:left w:val="single" w:sz="4" w:space="0" w:color="BFBFBF"/>
+              <w:bottom w:val="single" w:sz="4" w:space="0" w:color="BFBFBF"/>
+              <w:right w:val="single" w:sz="4" w:space="0" w:color="BFBFBF"/>
+            </w:tcBorders>
+            <w:tcMar>
+              <w:top w:w="80" w:type="dxa"/>
+              <w:left w:w="110" w:type="dxa"/>
+              <w:bottom w:w="80" w:type="dxa"/>
+              <w:right w:w="110" w:type="dxa"/>
+            </w:tcMar>
+          </w:tcPr>
+          <w:p>
+            <w:pPr>
+              <w:keepNext/>
+              <w:keepLines/>
+              <w:spacing w:line="260" w:lineRule="auto"/>
+            </w:pPr>
+            <w:r>
+              <w:t>Analyst masked map and no actions; cross-tenant VIN returns 404; audited erasure (GDPR/DPDP)</w:t>
+            </w:r>
+          </w:p>
+        </w:tc>
+      </w:tr>
+      <w:tr>
+        <w:trPr>
+          <w:cantSplit/>
+        </w:trPr>
+        <w:tc>
+          <w:tcPr>
+            <w:tcW w:w="1489" w:type="dxa"/>
+            <w:tcBorders>
+              <w:top w:val="single" w:sz="4" w:space="0" w:color="BFBFBF"/>
+              <w:left w:val="single" w:sz="4" w:space="0" w:color="BFBFBF"/>
+              <w:bottom w:val="single" w:sz="4" w:space="0" w:color="BFBFBF"/>
+              <w:right w:val="single" w:sz="4" w:space="0" w:color="BFBFBF"/>
+            </w:tcBorders>
+            <w:tcMar>
+              <w:top w:w="80" w:type="dxa"/>
+              <w:left w:w="110" w:type="dxa"/>
+              <w:bottom w:w="80" w:type="dxa"/>
+              <w:right w:w="110" w:type="dxa"/>
+            </w:tcMar>
+          </w:tcPr>
+          <w:p>
+            <w:pPr>
+              <w:keepNext/>
+              <w:keepLines/>
+              <w:spacing w:line="260" w:lineRule="auto"/>
+            </w:pPr>
+            <w:r>
+              <w:t>5:20 – 6:00</w:t>
+            </w:r>
+          </w:p>
+        </w:tc>
+        <w:tc>
+          <w:tcPr>
+            <w:tcW w:w="1861" w:type="dxa"/>
+            <w:tcBorders>
+              <w:top w:val="single" w:sz="4" w:space="0" w:color="BFBFBF"/>
+              <w:left w:val="single" w:sz="4" w:space="0" w:color="BFBFBF"/>
+              <w:bottom w:val="single" w:sz="4" w:space="0" w:color="BFBFBF"/>
+              <w:right w:val="single" w:sz="4" w:space="0" w:color="BFBFBF"/>
+            </w:tcBorders>
+            <w:tcMar>
+              <w:top w:w="80" w:type="dxa"/>
+              <w:left w:w="110" w:type="dxa"/>
+              <w:bottom w:w="80" w:type="dxa"/>
+              <w:right w:w="110" w:type="dxa"/>
+            </w:tcMar>
+          </w:tcPr>
+          <w:p>
+            <w:pPr>
+              <w:keepNext/>
+              <w:keepLines/>
+              <w:spacing w:line="260" w:lineRule="auto"/>
+            </w:pPr>
+            <w:r>
+              <w:t>Observability</w:t>
+            </w:r>
+          </w:p>
+        </w:tc>
+        <w:tc>
+          <w:tcPr>
+            <w:tcW w:w="5956" w:type="dxa"/>
+            <w:tcBorders>
+              <w:top w:val="single" w:sz="4" w:space="0" w:color="BFBFBF"/>
+              <w:left w:val="single" w:sz="4" w:space="0" w:color="BFBFBF"/>
+              <w:bottom w:val="single" w:sz="4" w:space="0" w:color="BFBFBF"/>
+              <w:right w:val="single" w:sz="4" w:space="0" w:color="BFBFBF"/>
+            </w:tcBorders>
+            <w:tcMar>
+              <w:top w:w="80" w:type="dxa"/>
+              <w:left w:w="110" w:type="dxa"/>
+              <w:bottom w:w="80" w:type="dxa"/>
+              <w:right w:w="110" w:type="dxa"/>
+            </w:tcMar>
+          </w:tcPr>
+          <w:p>
+            <w:pPr>
+              <w:keepNext/>
+              <w:keepLines/>
+              <w:spacing w:line="260" w:lineRule="auto"/>
+            </w:pPr>
+            <w:r>
+              <w:t>Grafana: events by outcome, ingest latency percentiles, alerts by rule, batch time, API p95, Kafka rate</w:t>
+            </w:r>
+          </w:p>
+        </w:tc>
+      </w:tr>
+      <w:tr>
+        <w:trPr>
+          <w:cantSplit/>
+        </w:trPr>
+        <w:tc>
+          <w:tcPr>
+            <w:tcW w:w="1489" w:type="dxa"/>
+            <w:tcBorders>
+              <w:top w:val="single" w:sz="4" w:space="0" w:color="BFBFBF"/>
+              <w:left w:val="single" w:sz="4" w:space="0" w:color="BFBFBF"/>
+              <w:bottom w:val="single" w:sz="4" w:space="0" w:color="BFBFBF"/>
+              <w:right w:val="single" w:sz="4" w:space="0" w:color="BFBFBF"/>
+            </w:tcBorders>
+            <w:tcMar>
+              <w:top w:w="80" w:type="dxa"/>
+              <w:left w:w="110" w:type="dxa"/>
+              <w:bottom w:w="80" w:type="dxa"/>
+              <w:right w:w="110" w:type="dxa"/>
+            </w:tcMar>
+          </w:tcPr>
+          <w:p>
+            <w:pPr>
+              <w:keepNext/>
+              <w:keepLines/>
+              <w:spacing w:line="260" w:lineRule="auto"/>
+            </w:pPr>
+            <w:r>
+              <w:t>6:00 – 7:00</w:t>
+            </w:r>
+          </w:p>
+        </w:tc>
+        <w:tc>
+          <w:tcPr>
+            <w:tcW w:w="1861" w:type="dxa"/>
+            <w:tcBorders>
+              <w:top w:val="single" w:sz="4" w:space="0" w:color="BFBFBF"/>
+              <w:left w:val="single" w:sz="4" w:space="0" w:color="BFBFBF"/>
+              <w:bottom w:val="single" w:sz="4" w:space="0" w:color="BFBFBF"/>
+              <w:right w:val="single" w:sz="4" w:space="0" w:color="BFBFBF"/>
+            </w:tcBorders>
+            <w:tcMar>
+              <w:top w:w="80" w:type="dxa"/>
+              <w:left w:w="110" w:type="dxa"/>
+              <w:bottom w:w="80" w:type="dxa"/>
+              <w:right w:w="110" w:type="dxa"/>
+            </w:tcMar>
+          </w:tcPr>
+          <w:p>
+            <w:pPr>
+              <w:keepNext/>
+              <w:keepLines/>
+              <w:spacing w:line="260" w:lineRule="auto"/>
+            </w:pPr>
+            <w:r>
+              <w:t>Resilience (live)</w:t>
+            </w:r>
+          </w:p>
+        </w:tc>
+        <w:tc>
+          <w:tcPr>
+            <w:tcW w:w="5956" w:type="dxa"/>
+            <w:tcBorders>
+              <w:top w:val="single" w:sz="4" w:space="0" w:color="BFBFBF"/>
+              <w:left w:val="single" w:sz="4" w:space="0" w:color="BFBFBF"/>
+              <w:bottom w:val="single" w:sz="4" w:space="0" w:color="BFBFBF"/>
+              <w:right w:val="single" w:sz="4" w:space="0" w:color="BFBFBF"/>
+            </w:tcBorders>
+            <w:tcMar>
+              <w:top w:w="80" w:type="dxa"/>
+              <w:left w:w="110" w:type="dxa"/>
+              <w:bottom w:w="80" w:type="dxa"/>
+              <w:right w:w="110" w:type="dxa"/>
+            </w:tcMar>
+          </w:tcPr>
+          <w:p>
+            <w:pPr>
+              <w:keepNext/>
+              <w:keepLines/>
+              <w:spacing w:line="260" w:lineRule="auto"/>
+            </w:pPr>
+            <w:r>
+              <w:t>Kill all processors + restart the broker; flow resumes in ~30 s, zero loss, no duplicates</w:t>
+            </w:r>
+          </w:p>
+        </w:tc>
+      </w:tr>
+      <w:tr>
+        <w:trPr>
+          <w:cantSplit/>
+        </w:trPr>
+        <w:tc>
+          <w:tcPr>
+            <w:tcW w:w="1489" w:type="dxa"/>
+            <w:tcBorders>
+              <w:top w:val="single" w:sz="4" w:space="0" w:color="BFBFBF"/>
+              <w:left w:val="single" w:sz="4" w:space="0" w:color="BFBFBF"/>
+              <w:bottom w:val="single" w:sz="4" w:space="0" w:color="BFBFBF"/>
+              <w:right w:val="single" w:sz="4" w:space="0" w:color="BFBFBF"/>
+            </w:tcBorders>
+            <w:tcMar>
+              <w:top w:w="80" w:type="dxa"/>
+              <w:left w:w="110" w:type="dxa"/>
+              <w:bottom w:w="80" w:type="dxa"/>
+              <w:right w:w="110" w:type="dxa"/>
+            </w:tcMar>
+          </w:tcPr>
+          <w:p>
+            <w:pPr>
+              <w:keepNext/>
+              <w:keepLines/>
+              <w:spacing w:line="260" w:lineRule="auto"/>
+            </w:pPr>
+            <w:r>
+              <w:t>7:00 – 8:45</w:t>
+            </w:r>
+          </w:p>
+        </w:tc>
+        <w:tc>
+          <w:tcPr>
+            <w:tcW w:w="1861" w:type="dxa"/>
+            <w:tcBorders>
+              <w:top w:val="single" w:sz="4" w:space="0" w:color="BFBFBF"/>
+              <w:left w:val="single" w:sz="4" w:space="0" w:color="BFBFBF"/>
+              <w:bottom w:val="single" w:sz="4" w:space="0" w:color="BFBFBF"/>
+              <w:right w:val="single" w:sz="4" w:space="0" w:color="BFBFBF"/>
+            </w:tcBorders>
+            <w:tcMar>
+              <w:top w:w="80" w:type="dxa"/>
+              <w:left w:w="110" w:type="dxa"/>
+              <w:bottom w:w="80" w:type="dxa"/>
+              <w:right w:w="110" w:type="dxa"/>
+            </w:tcMar>
+          </w:tcPr>
+          <w:p>
+            <w:pPr>
+              <w:keepNext/>
+              <w:keepLines/>
+              <w:spacing w:line="260" w:lineRule="auto"/>
+            </w:pPr>
+            <w:r>
+              <w:t>Evidence</w:t>
+            </w:r>
+          </w:p>
+        </w:tc>
+        <w:tc>
+          <w:tcPr>
+            <w:tcW w:w="5956" w:type="dxa"/>
+            <w:tcBorders>
+              <w:top w:val="single" w:sz="4" w:space="0" w:color="BFBFBF"/>
+              <w:left w:val="single" w:sz="4" w:space="0" w:color="BFBFBF"/>
+              <w:bottom w:val="single" w:sz="4" w:space="0" w:color="BFBFBF"/>
+              <w:right w:val="single" w:sz="4" w:space="0" w:color="BFBFBF"/>
+            </w:tcBorders>
+            <w:tcMar>
+              <w:top w:w="80" w:type="dxa"/>
+              <w:left w:w="110" w:type="dxa"/>
+              <w:bottom w:w="80" w:type="dxa"/>
+              <w:right w:w="110" w:type="dxa"/>
+            </w:tcMar>
+          </w:tcPr>
+          <w:p>
+            <w:pPr>
+              <w:keepNext/>
+              <w:keepLines/>
+              <w:spacing w:line="260" w:lineRule="auto"/>
+            </w:pPr>
+            <w:r>
+              <w:t>Green CI (unit 98%, integration, contract, BDD, ZAP, Trivy, chaos, K8s on kind); 25K/s zero-loss load test; API p95 110 ms @50; 45-min soak; 174 → 0.58 ms query</w:t>
+            </w:r>
+          </w:p>
+        </w:tc>
+      </w:tr>
+      <w:tr>
+        <w:trPr>
+          <w:cantSplit/>
+        </w:trPr>
+        <w:tc>
+          <w:tcPr>
+            <w:tcW w:w="1489" w:type="dxa"/>
+            <w:tcBorders>
+              <w:top w:val="single" w:sz="4" w:space="0" w:color="BFBFBF"/>
+              <w:left w:val="single" w:sz="4" w:space="0" w:color="BFBFBF"/>
+              <w:bottom w:val="single" w:sz="4" w:space="0" w:color="BFBFBF"/>
+              <w:right w:val="single" w:sz="4" w:space="0" w:color="BFBFBF"/>
+            </w:tcBorders>
+            <w:tcMar>
+              <w:top w:w="80" w:type="dxa"/>
+              <w:left w:w="110" w:type="dxa"/>
+              <w:bottom w:w="80" w:type="dxa"/>
+              <w:right w:w="110" w:type="dxa"/>
+            </w:tcMar>
+          </w:tcPr>
+          <w:p>
+            <w:pPr>
+              <w:keepNext/>
+              <w:keepLines/>
+              <w:spacing w:line="260" w:lineRule="auto"/>
+            </w:pPr>
+            <w:r>
+              <w:t>8:45 – 9:30</w:t>
+            </w:r>
+          </w:p>
+        </w:tc>
+        <w:tc>
+          <w:tcPr>
+            <w:tcW w:w="1861" w:type="dxa"/>
+            <w:tcBorders>
+              <w:top w:val="single" w:sz="4" w:space="0" w:color="BFBFBF"/>
+              <w:left w:val="single" w:sz="4" w:space="0" w:color="BFBFBF"/>
+              <w:bottom w:val="single" w:sz="4" w:space="0" w:color="BFBFBF"/>
+              <w:right w:val="single" w:sz="4" w:space="0" w:color="BFBFBF"/>
+            </w:tcBorders>
+            <w:tcMar>
+              <w:top w:w="80" w:type="dxa"/>
+              <w:left w:w="110" w:type="dxa"/>
+              <w:bottom w:w="80" w:type="dxa"/>
+              <w:right w:w="110" w:type="dxa"/>
+            </w:tcMar>
+          </w:tcPr>
+          <w:p>
+            <w:pPr>
+              <w:keepNext/>
+              <w:keepLines/>
+              <w:spacing w:line="260" w:lineRule="auto"/>
+            </w:pPr>
+            <w:r>
+              <w:t>Impact &amp; next steps</w:t>
+            </w:r>
+          </w:p>
+        </w:tc>
+        <w:tc>
+          <w:tcPr>
+            <w:tcW w:w="5956" w:type="dxa"/>
+            <w:tcBorders>
+              <w:top w:val="single" w:sz="4" w:space="0" w:color="BFBFBF"/>
+              <w:left w:val="single" w:sz="4" w:space="0" w:color="BFBFBF"/>
+              <w:bottom w:val="single" w:sz="4" w:space="0" w:color="BFBFBF"/>
+              <w:right w:val="single" w:sz="4" w:space="0" w:color="BFBFBF"/>
+            </w:tcBorders>
+            <w:tcMar>
+              <w:top w:w="80" w:type="dxa"/>
+              <w:left w:w="110" w:type="dxa"/>
+              <w:bottom w:w="80" w:type="dxa"/>
+              <w:right w:w="110" w:type="dxa"/>
+            </w:tcMar>
+          </w:tcPr>
+          <w:p>
+            <w:pPr>
+              <w:keepNext/>
+              <w:keepLines/>
+              <w:spacing w:line="260" w:lineRule="auto"/>
+            </w:pPr>
+            <w:r>
+              <w:t>Tens of thousands of US$ saved per week per fleet; ClickHouse for 100K/s, OIDC + mTLS, real-fleet retraining</w:t>
             </w:r>
           </w:p>
         </w:tc>
@@ -14375,6 +14814,7 @@
       </w:pPr>
       <w:bookmarkStart w:id="29" w:name="s30"/>
       <w:r>
+        <w:lastRenderedPageBreak/>
         <w:t>15. Conclusion</w:t>
       </w:r>
       <w:bookmarkEnd w:id="29"/>
@@ -14423,11 +14863,7 @@
         <w:spacing w:before="60" w:after="200" w:line="300" w:lineRule="auto"/>
       </w:pPr>
       <w:r>
-        <w:t xml:space="preserve">Key learnings: idempotent sinks make at-least-once delivery safe and are far simpler than distributed transactions; partitioning by time turns retention into a metadata operation, but only if the rollups are incremental (our first materialised-view version re-scanned all history every minute and grew ~5 </w:t>
-      </w:r>
-      <w:r>
-        <w:lastRenderedPageBreak/>
-        <w:t>GB/hour until we replaced it); most API latency wins came from indexes that match the query's filter and order.</w:t>
+        <w:t>Key learnings: idempotent sinks make at-least-once delivery safe and are far simpler than distributed transactions; partitioning by time turns retention into a metadata operation, but only if the rollups are incremental (our first materialised-view version re-scanned all history every minute and grew ~5 GB/hour until we replaced it); most API latency wins came from indexes that match the query's filter and order.</w:t>
       </w:r>
     </w:p>
     <w:p>
@@ -14621,7 +15057,7 @@
         <w:spacing w:after="90" w:line="290" w:lineRule="auto"/>
       </w:pPr>
       <w:r>
-        <w:t>Evidence files in the repository: docs/evidence/api_load.txt, processor_bench.txt, explain_analyze.txt, chaos.txt, dashboard.png, vehicle_drawer.png; fleetpulse/ml/metrics.json; docs/threat-model.md; docs/adr/*.md; docs/demo-script.md.</w:t>
+        <w:t>Evidence files in the repository: docs/evidence/api_load.txt, processor_bench.txt, alert_latency.txt, soak.txt, grafana.png, explain_analyze.txt, chaos.txt, dashboard.png, vehicle_drawer.png; fleetpulse/ml/metrics.json; docs/threat-model.md; docs/adr/*.md; docs/demo-script.md.</w:t>
       </w:r>
     </w:p>
     <w:p>
@@ -14638,7 +15074,7 @@
           <w:noProof/>
         </w:rPr>
         <w:drawing>
-          <wp:inline distT="0" distB="0" distL="0" distR="0" wp14:anchorId="35DF6044" wp14:editId="557CE79E">
+          <wp:inline distT="0" distB="0" distL="0" distR="0" wp14:anchorId="59275355" wp14:editId="54B4C0A4">
             <wp:extent cx="5943600" cy="2971800"/>
             <wp:effectExtent l="0" t="0" r="0" b="0"/>
             <wp:docPr id="5" name="Picture 5"/>
@@ -14820,7 +15256,7 @@
           <wp:extent cx="1336675" cy="265430"/>
           <wp:effectExtent l="0" t="0" r="0" b="1270"/>
           <wp:wrapSquare wrapText="bothSides"/>
-          <wp:docPr id="789132067" name="Picture 789132067" descr="A black background with orange letters&#10;&#10;AI-generated content may be incorrect."/>
+          <wp:docPr id="1948568041" name="Picture 1948568041" descr="A black background with orange letters&#10;&#10;AI-generated content may be incorrect."/>
           <wp:cNvGraphicFramePr>
             <a:graphicFrameLocks xmlns:a="http://schemas.openxmlformats.org/drawingml/2006/main" noChangeAspect="1"/>
           </wp:cNvGraphicFramePr>

</xml_diff>

<commit_message>
Shorter explainer script (~6.5 min); solution document demo timeline updated
</commit_message>
<xml_diff>
--- a/docs/solution/FleetPulse_Solution_Document.docx
+++ b/docs/solution/FleetPulse_Solution_Document.docx
@@ -103,7 +103,7 @@
           <w:b/>
           <w:bCs/>
         </w:rPr>
-        <w:t>Demo Video URL (explainer, ≤ 10 min): [Link]</w:t>
+        <w:t>Demo Video URL (explainer, ~6.5 min): [Link]</w:t>
       </w:r>
     </w:p>
     <w:p>
@@ -851,11 +851,7 @@
         <w:spacing w:before="60" w:after="200" w:line="300" w:lineRule="auto"/>
       </w:pPr>
       <w:r>
-        <w:t xml:space="preserve">“A fleet manager needs a way to know which vehicles will fail in the next week and act before they do, because breakdowns are discovered only when a driver is stranded, which today costs roughly </w:t>
-      </w:r>
-      <w:r>
-        <w:lastRenderedPageBreak/>
-        <w:t>US$2,400 per incident in towing, emergency repair and two days of lost vehicle utilisation (our working assumption, see 2.2).”</w:t>
+        <w:t>“A fleet manager needs a way to know which vehicles will fail in the next week and act before they do, because breakdowns are discovered only when a driver is stranded, which today costs roughly US$2,400 per incident in towing, emergency repair and two days of lost vehicle utilisation (our working assumption, see 2.2).”</w:t>
       </w:r>
     </w:p>
     <w:p>
@@ -1698,7 +1694,6 @@
     </w:p>
     <w:p>
       <w:r>
-        <w:lastRenderedPageBreak/>
         <w:t>Existing alternatives: aftermarket OBD dongles (hardware cost and install, one data format); OEM portals (one brand per portal, alerts after the fault); rule-only telematics (alerts on a code, no ranking of who fails next); Motorq Fuse (AI recommendations on OEM data, commercial). FleetPulse combines device-free multi-OEM ingestion, sub-5-second alerts and an explainable 7-day forecast in one view.</w:t>
       </w:r>
     </w:p>
@@ -2500,7 +2495,6 @@
         <w:spacing w:before="60" w:after="200" w:line="300" w:lineRule="auto"/>
       </w:pPr>
       <w:r>
-        <w:lastRenderedPageBreak/>
         <w:t>User journey: (1) a Borealis van reports coolant at 119 °C and code P0217 in OEM-specific JSON; (2) the processor normalises it, validates the VIN check digit, drops duplicates and evaluates sliding-window rules; (3) an OVERHEAT_TREND / CRITICAL_DTC alert is written idempotently and pushed over WebSocket, appearing on the dashboard ~0.2 s after the vehicle timestamp; (4) the manager opens the vehicle: 73% 7-day risk, reasons “overdue for service, coolant running hot, 12 V battery voltage low”, the coolant t</w:t>
       </w:r>
       <w:r>
@@ -2516,7 +2510,7 @@
           <w:noProof/>
         </w:rPr>
         <w:drawing>
-          <wp:inline distT="0" distB="0" distL="0" distR="0" wp14:anchorId="68EFC275" wp14:editId="5103FFB5">
+          <wp:inline distT="0" distB="0" distL="0" distR="0" wp14:anchorId="7EE7DF08" wp14:editId="20641F68">
             <wp:extent cx="5760720" cy="4492562"/>
             <wp:effectExtent l="0" t="0" r="0" b="0"/>
             <wp:docPr id="1" name="Picture 1"/>
@@ -2560,9 +2554,8 @@
         <w:rPr>
           <w:noProof/>
         </w:rPr>
-        <w:lastRenderedPageBreak/>
         <w:drawing>
-          <wp:inline distT="0" distB="0" distL="0" distR="0" wp14:anchorId="2175B09A" wp14:editId="3B04C25C">
+          <wp:inline distT="0" distB="0" distL="0" distR="0" wp14:anchorId="3C15A908" wp14:editId="26025FFD">
             <wp:extent cx="5760720" cy="4000500"/>
             <wp:effectExtent l="0" t="0" r="0" b="0"/>
             <wp:docPr id="2" name="Picture 2"/>
@@ -2822,7 +2815,6 @@
         <w:rPr>
           <w:b/>
         </w:rPr>
-        <w:lastRenderedPageBreak/>
         <w:t xml:space="preserve">1. Effectively-once without distributed transactions. </w:t>
       </w:r>
       <w:r>
@@ -2940,7 +2932,6 @@
                 <w:sz w:val="20"/>
                 <w:szCs w:val="20"/>
               </w:rPr>
-              <w:lastRenderedPageBreak/>
               <w:t>ID</w:t>
             </w:r>
           </w:p>
@@ -4147,7 +4138,6 @@
               <w:spacing w:line="260" w:lineRule="auto"/>
             </w:pPr>
             <w:r>
-              <w:lastRenderedPageBreak/>
               <w:t>F-06</w:t>
             </w:r>
           </w:p>
@@ -5297,7 +5287,6 @@
       </w:pPr>
       <w:bookmarkStart w:id="10" w:name="s11"/>
       <w:r>
-        <w:lastRenderedPageBreak/>
         <w:t>5. Solution Architecture (High-Level Design)</w:t>
       </w:r>
       <w:bookmarkEnd w:id="10"/>
@@ -5409,7 +5398,7 @@
           <w:noProof/>
         </w:rPr>
         <w:drawing>
-          <wp:inline distT="0" distB="0" distL="0" distR="0" wp14:anchorId="40A12906" wp14:editId="01AFB0B6">
+          <wp:inline distT="0" distB="0" distL="0" distR="0" wp14:anchorId="44293CB5" wp14:editId="7D0AD6C0">
             <wp:extent cx="5943600" cy="2971800"/>
             <wp:effectExtent l="0" t="0" r="0" b="0"/>
             <wp:docPr id="3" name="Picture 3"/>
@@ -5451,7 +5440,6 @@
       </w:pPr>
       <w:bookmarkStart w:id="12" w:name="s13"/>
       <w:r>
-        <w:lastRenderedPageBreak/>
         <w:t>5.2 Technology Stack &amp; Justification</w:t>
       </w:r>
       <w:bookmarkEnd w:id="12"/>
@@ -6254,7 +6242,6 @@
                 <w:sz w:val="20"/>
                 <w:szCs w:val="20"/>
               </w:rPr>
-              <w:lastRenderedPageBreak/>
               <w:t>Query</w:t>
             </w:r>
           </w:p>
@@ -6708,7 +6695,7 @@
           <w:noProof/>
         </w:rPr>
         <w:drawing>
-          <wp:inline distT="0" distB="0" distL="0" distR="0" wp14:anchorId="4C1AEE50" wp14:editId="403555BF">
+          <wp:inline distT="0" distB="0" distL="0" distR="0" wp14:anchorId="23DD6C47" wp14:editId="008FA242">
             <wp:extent cx="5943600" cy="2971800"/>
             <wp:effectExtent l="0" t="0" r="0" b="0"/>
             <wp:docPr id="4" name="Picture 4"/>
@@ -6840,11 +6827,7 @@
         <w:spacing w:before="60" w:after="200" w:line="300" w:lineRule="auto"/>
       </w:pPr>
       <w:r>
-        <w:t xml:space="preserve">Kubernetes namespace fleetpulse (pod-security restricted): api Deployment (3 replicas, HPA 3–20 on CPU, PDB minAvailable 2, zone topology spread), processor Deployment (6 replicas ≤ partitions; KEDA </w:t>
-      </w:r>
-      <w:r>
-        <w:lastRenderedPageBreak/>
-        <w:t>on consumer lag in production), risk-scoring CronJob every 5 minutes, default-deny NetworkPolicy, TLS Ingress via cert-manager. Containers run as non-root with read-only root filesystems and dropped capabilities. Secrets come from a K8s Secret synced from Vault / cloud secret manager (infra/k8s/fleetpulse.yaml).</w:t>
+        <w:t>Kubernetes namespace fleetpulse (pod-security restricted): api Deployment (3 replicas, HPA 3–20 on CPU, PDB minAvailable 2, zone topology spread), processor Deployment (6 replicas ≤ partitions; KEDA on consumer lag in production), risk-scoring CronJob every 5 minutes, default-deny NetworkPolicy, TLS Ingress via cert-manager. Containers run as non-root with read-only root filesystems and dropped capabilities. Secrets come from a K8s Secret synced from Vault / cloud secret manager (infra/k8s/fleetpulse.yaml).</w:t>
       </w:r>
     </w:p>
     <w:p>
@@ -7433,7 +7416,6 @@
       </w:pPr>
       <w:bookmarkStart w:id="17" w:name="s18"/>
       <w:r>
-        <w:lastRenderedPageBreak/>
         <w:t>6.2 Design Principles Applied</w:t>
       </w:r>
       <w:bookmarkEnd w:id="17"/>
@@ -8268,7 +8250,6 @@
           <w:b/>
           <w:bCs/>
         </w:rPr>
-        <w:lastRenderedPageBreak/>
         <w:t xml:space="preserve">Event Schemas: </w:t>
       </w:r>
       <w:r>
@@ -8523,7 +8504,6 @@
                 <w:sz w:val="20"/>
                 <w:szCs w:val="20"/>
               </w:rPr>
-              <w:lastRenderedPageBreak/>
               <w:t>Problem</w:t>
             </w:r>
           </w:p>
@@ -9780,7 +9760,6 @@
         <w:spacing w:before="60" w:after="200" w:line="300" w:lineRule="auto"/>
       </w:pPr>
       <w:r>
-        <w:lastRenderedPageBreak/>
         <w:t>Measured: hot path (parse → normalise → VIN → Bloom → rules) 200,000 events in 5.90 s = 33.9K events/s on one core (tests/load/processor_bench.py).</w:t>
       </w:r>
     </w:p>
@@ -9790,7 +9769,6 @@
       </w:pPr>
       <w:bookmarkStart w:id="21" w:name="s22"/>
       <w:r>
-        <w:lastRenderedPageBreak/>
         <w:t>7. Non-Functional Requirements &amp; Performance Benchmarks</w:t>
       </w:r>
       <w:bookmarkEnd w:id="21"/>
@@ -9852,7 +9830,6 @@
                 <w:sz w:val="20"/>
                 <w:szCs w:val="20"/>
               </w:rPr>
-              <w:lastRenderedPageBreak/>
               <w:t>NFR</w:t>
             </w:r>
           </w:p>
@@ -10213,7 +10190,6 @@
               <w:spacing w:line="260" w:lineRule="auto"/>
             </w:pPr>
             <w:r>
-              <w:lastRenderedPageBreak/>
               <w:t>API Latency</w:t>
             </w:r>
           </w:p>
@@ -10577,11 +10553,10 @@
         <w:spacing w:before="60" w:after="200" w:line="300" w:lineRule="auto"/>
       </w:pPr>
       <w:r>
-        <w:t xml:space="preserve">Original load test setup: everything on one 4-vCPU cloud VM under docker compose (Redpanda, Postgres 16, Redis, 2 processors, simulator, batch, API) with 100K vehicles at a 5,000 events/s base rate and 3x bursts for 10 s every 2 minutes. API load: tests/load/api_load.py (async httpx) against 4 uvicorn workers, rate limiter raised for the test. Processor CPU benchmark: tests/load/processor_bench.py. </w:t>
-      </w:r>
-      <w:r>
-        <w:lastRenderedPageBreak/>
-        <w:t>After hardening, everything was re-measured on a 16-vCPU laptop: alert latency with 4 processor replicas (docs/evidence/alert_latency.txt); end-to-end throughput with tests/load/pipeline_load.py (parallel producers, 3x bursts, zero-loss check); API latency with a multi-process client inside the compose network (api_load.txt); and a 45-minute soak (soak.txt). Raw outputs in docs/evidence/.</w:t>
+        <w:t>Original load test setup: everything on one 4-vCPU cloud VM under docker compose (Redpanda, Postgres 16, Redis, 2 processors, simulator, batch, API) with 100K vehicles at a 5,000 events/s base rate and 3x bursts for 10 s every 2 minutes. API load: tests/load/api_load.py (async httpx) against 4 uvicorn workers, rate limiter raised for the test. Processor CPU benchmark: tests/load/processor_bench.py. After hardening, everything was re-measured on a 16-vCPU laptop: alert latency with 4 processor replicas (docs</w:t>
+      </w:r>
+      <w:r>
+        <w:t>/evidence/alert_latency.txt); end-to-end throughput with tests/load/pipeline_load.py (parallel producers, 3x bursts, zero-loss check); API latency with a multi-process client inside the compose network (api_load.txt); and a 45-minute soak (soak.txt). Raw outputs in docs/evidence/.</w:t>
       </w:r>
     </w:p>
     <w:p>
@@ -10764,7 +10739,6 @@
                 <w:sz w:val="20"/>
                 <w:szCs w:val="20"/>
               </w:rPr>
-              <w:lastRenderedPageBreak/>
               <w:t>#</w:t>
             </w:r>
           </w:p>
@@ -11618,7 +11592,6 @@
       </w:pPr>
       <w:bookmarkStart w:id="23" w:name="s24"/>
       <w:r>
-        <w:lastRenderedPageBreak/>
         <w:t>9. Test Strategy</w:t>
       </w:r>
       <w:bookmarkEnd w:id="23"/>
@@ -12898,7 +12871,6 @@
           <w:b/>
           <w:bCs/>
         </w:rPr>
-        <w:lastRenderedPageBreak/>
         <w:t xml:space="preserve">Data &amp; Features: </w:t>
       </w:r>
       <w:r>
@@ -13611,7 +13583,6 @@
         <w:rPr>
           <w:b/>
         </w:rPr>
-        <w:lastRenderedPageBreak/>
         <w:t xml:space="preserve">ADRs (docs/adr): </w:t>
       </w:r>
       <w:r>
@@ -13725,7 +13696,6 @@
                 <w:sz w:val="20"/>
                 <w:szCs w:val="20"/>
               </w:rPr>
-              <w:lastRenderedPageBreak/>
               <w:t>Time</w:t>
             </w:r>
           </w:p>
@@ -13826,7 +13796,7 @@
               <w:spacing w:line="260" w:lineRule="auto"/>
             </w:pPr>
             <w:r>
-              <w:t>0:00 – 0:45</w:t>
+              <w:t>0:00 – 0:35</w:t>
             </w:r>
           </w:p>
         </w:tc>
@@ -13880,7 +13850,7 @@
               <w:spacing w:line="260" w:lineRule="auto"/>
             </w:pPr>
             <w:r>
-              <w:t>US$2,400 per breakdown, ~2,800 breakdowns a week at 100K vehicles, mixed ICE/EV fleets, one format per OEM</w:t>
+              <w:t>US$2,400 per breakdown, ~2,800 a week at 100K vehicles; FleetPulse predicts and flags faults in under a second</w:t>
             </w:r>
           </w:p>
         </w:tc>
@@ -13912,7 +13882,7 @@
               <w:spacing w:line="260" w:lineRule="auto"/>
             </w:pPr>
             <w:r>
-              <w:t>0:45 – 1:45</w:t>
+              <w:t>0:35 – 1:15</w:t>
             </w:r>
           </w:p>
         </w:tc>
@@ -13966,7 +13936,7 @@
               <w:spacing w:line="260" w:lineRule="auto"/>
             </w:pPr>
             <w:r>
-              <w:t>Simulator → Kafka → processors (normalise, VIN check, Bloom dedup, rules) → Postgres/Redis/pgvector; batch rollup + ML; FastAPI</w:t>
+              <w:t>Simulator → Kafka → processors → Postgres / Redis / pgvector; batch rollup + ML scoring</w:t>
             </w:r>
           </w:p>
         </w:tc>
@@ -13998,7 +13968,7 @@
               <w:spacing w:line="260" w:lineRule="auto"/>
             </w:pPr>
             <w:r>
-              <w:t>1:45 – 2:45</w:t>
+              <w:t>1:15 – 2:00</w:t>
             </w:r>
           </w:p>
         </w:tc>
@@ -14052,7 +14022,7 @@
               <w:spacing w:line="260" w:lineRule="auto"/>
             </w:pPr>
             <w:r>
-              <w:t>Manager login; live KPIs incl. alert latency (~0.2 s) and data freshness (~0.15 s); map of 8 depots; alerts over WebSocket</w:t>
+              <w:t>Manager login; alert latency (~0.2 s) and data freshness (~0.15 s) tiles; map; live critical alerts</w:t>
             </w:r>
           </w:p>
         </w:tc>
@@ -14084,7 +14054,7 @@
               <w:spacing w:line="260" w:lineRule="auto"/>
             </w:pPr>
             <w:r>
-              <w:t>2:45 – 3:45</w:t>
+              <w:t>2:00 – 3:05</w:t>
             </w:r>
           </w:p>
         </w:tc>
@@ -14111,7 +14081,7 @@
               <w:spacing w:line="260" w:lineRule="auto"/>
             </w:pPr>
             <w:r>
-              <w:t>Predicting breakdowns</w:t>
+              <w:t>Prediction + copilot</w:t>
             </w:r>
           </w:p>
         </w:tc>
@@ -14138,7 +14108,7 @@
               <w:spacing w:line="260" w:lineRule="auto"/>
             </w:pPr>
             <w:r>
-              <w:t>Top-risk vehicle: risk %, reasons, trends, alerts; model 0.88 vs 0.69 ROC-AUC, 4.2x precision; propose work order</w:t>
+              <w:t>Top-risk vehicle with reasons; 0.88 vs 0.69 ROC-AUC; savings estimate; prompt injection refused; audit</w:t>
             </w:r>
           </w:p>
         </w:tc>
@@ -14170,7 +14140,7 @@
               <w:spacing w:line="260" w:lineRule="auto"/>
             </w:pPr>
             <w:r>
-              <w:t>3:45 – 4:45</w:t>
+              <w:t>3:05 – 3:55</w:t>
             </w:r>
           </w:p>
         </w:tc>
@@ -14197,7 +14167,7 @@
               <w:spacing w:line="260" w:lineRule="auto"/>
             </w:pPr>
             <w:r>
-              <w:t>AI copilot</w:t>
+              <w:t>Crash and recover (live)</w:t>
             </w:r>
           </w:p>
         </w:tc>
@@ -14224,7 +14194,7 @@
               <w:spacing w:line="260" w:lineRule="auto"/>
             </w:pPr>
             <w:r>
-              <w:t>Tenant-scoped tool calls, savings estimate, prompt injection refused, human approval, audit log</w:t>
+              <w:t>Kill all processors + restart the broker; recovers in ~30 s, zero loss, no duplicates</w:t>
             </w:r>
           </w:p>
         </w:tc>
@@ -14256,7 +14226,7 @@
               <w:spacing w:line="260" w:lineRule="auto"/>
             </w:pPr>
             <w:r>
-              <w:t>4:45 – 5:20</w:t>
+              <w:t>3:55 – 4:25</w:t>
             </w:r>
           </w:p>
         </w:tc>
@@ -14283,7 +14253,7 @@
               <w:spacing w:line="260" w:lineRule="auto"/>
             </w:pPr>
             <w:r>
-              <w:t>Privacy</w:t>
+              <w:t>Observability</w:t>
             </w:r>
           </w:p>
         </w:tc>
@@ -14310,7 +14280,7 @@
               <w:spacing w:line="260" w:lineRule="auto"/>
             </w:pPr>
             <w:r>
-              <w:t>Analyst masked map and no actions; cross-tenant VIN returns 404; audited erasure (GDPR/DPDP)</w:t>
+              <w:t>Grafana pipeline dashboard showing the outage and recovery</w:t>
             </w:r>
           </w:p>
         </w:tc>
@@ -14342,7 +14312,7 @@
               <w:spacing w:line="260" w:lineRule="auto"/>
             </w:pPr>
             <w:r>
-              <w:t>5:20 – 6:00</w:t>
+              <w:t>4:25 – 5:50</w:t>
             </w:r>
           </w:p>
         </w:tc>
@@ -14369,7 +14339,7 @@
               <w:spacing w:line="260" w:lineRule="auto"/>
             </w:pPr>
             <w:r>
-              <w:t>Observability</w:t>
+              <w:t>Evidence</w:t>
             </w:r>
           </w:p>
         </w:tc>
@@ -14396,7 +14366,7 @@
               <w:spacing w:line="260" w:lineRule="auto"/>
             </w:pPr>
             <w:r>
-              <w:t>Grafana: events by outcome, ingest latency percentiles, alerts by rule, batch time, API p95, Kafka rate</w:t>
+              <w:t>Green CI (unit 98%, integration, contract, BDD, ZAP, Trivy, chaos, K8s on kind); 25K/s zero-loss load test; API p95 110 ms @50; 45-min soak</w:t>
             </w:r>
           </w:p>
         </w:tc>
@@ -14428,7 +14398,7 @@
               <w:spacing w:line="260" w:lineRule="auto"/>
             </w:pPr>
             <w:r>
-              <w:t>6:00 – 7:00</w:t>
+              <w:t>5:50 – 6:30</w:t>
             </w:r>
           </w:p>
         </w:tc>
@@ -14455,7 +14425,7 @@
               <w:spacing w:line="260" w:lineRule="auto"/>
             </w:pPr>
             <w:r>
-              <w:t>Resilience (live)</w:t>
+              <w:t>Close</w:t>
             </w:r>
           </w:p>
         </w:tc>
@@ -14482,179 +14452,7 @@
               <w:spacing w:line="260" w:lineRule="auto"/>
             </w:pPr>
             <w:r>
-              <w:t>Kill all processors + restart the broker; flow resumes in ~30 s, zero loss, no duplicates</w:t>
-            </w:r>
-          </w:p>
-        </w:tc>
-      </w:tr>
-      <w:tr>
-        <w:trPr>
-          <w:cantSplit/>
-        </w:trPr>
-        <w:tc>
-          <w:tcPr>
-            <w:tcW w:w="1489" w:type="dxa"/>
-            <w:tcBorders>
-              <w:top w:val="single" w:sz="4" w:space="0" w:color="BFBFBF"/>
-              <w:left w:val="single" w:sz="4" w:space="0" w:color="BFBFBF"/>
-              <w:bottom w:val="single" w:sz="4" w:space="0" w:color="BFBFBF"/>
-              <w:right w:val="single" w:sz="4" w:space="0" w:color="BFBFBF"/>
-            </w:tcBorders>
-            <w:tcMar>
-              <w:top w:w="80" w:type="dxa"/>
-              <w:left w:w="110" w:type="dxa"/>
-              <w:bottom w:w="80" w:type="dxa"/>
-              <w:right w:w="110" w:type="dxa"/>
-            </w:tcMar>
-          </w:tcPr>
-          <w:p>
-            <w:pPr>
-              <w:keepNext/>
-              <w:keepLines/>
-              <w:spacing w:line="260" w:lineRule="auto"/>
-            </w:pPr>
-            <w:r>
-              <w:t>7:00 – 8:45</w:t>
-            </w:r>
-          </w:p>
-        </w:tc>
-        <w:tc>
-          <w:tcPr>
-            <w:tcW w:w="1861" w:type="dxa"/>
-            <w:tcBorders>
-              <w:top w:val="single" w:sz="4" w:space="0" w:color="BFBFBF"/>
-              <w:left w:val="single" w:sz="4" w:space="0" w:color="BFBFBF"/>
-              <w:bottom w:val="single" w:sz="4" w:space="0" w:color="BFBFBF"/>
-              <w:right w:val="single" w:sz="4" w:space="0" w:color="BFBFBF"/>
-            </w:tcBorders>
-            <w:tcMar>
-              <w:top w:w="80" w:type="dxa"/>
-              <w:left w:w="110" w:type="dxa"/>
-              <w:bottom w:w="80" w:type="dxa"/>
-              <w:right w:w="110" w:type="dxa"/>
-            </w:tcMar>
-          </w:tcPr>
-          <w:p>
-            <w:pPr>
-              <w:keepNext/>
-              <w:keepLines/>
-              <w:spacing w:line="260" w:lineRule="auto"/>
-            </w:pPr>
-            <w:r>
-              <w:t>Evidence</w:t>
-            </w:r>
-          </w:p>
-        </w:tc>
-        <w:tc>
-          <w:tcPr>
-            <w:tcW w:w="5956" w:type="dxa"/>
-            <w:tcBorders>
-              <w:top w:val="single" w:sz="4" w:space="0" w:color="BFBFBF"/>
-              <w:left w:val="single" w:sz="4" w:space="0" w:color="BFBFBF"/>
-              <w:bottom w:val="single" w:sz="4" w:space="0" w:color="BFBFBF"/>
-              <w:right w:val="single" w:sz="4" w:space="0" w:color="BFBFBF"/>
-            </w:tcBorders>
-            <w:tcMar>
-              <w:top w:w="80" w:type="dxa"/>
-              <w:left w:w="110" w:type="dxa"/>
-              <w:bottom w:w="80" w:type="dxa"/>
-              <w:right w:w="110" w:type="dxa"/>
-            </w:tcMar>
-          </w:tcPr>
-          <w:p>
-            <w:pPr>
-              <w:keepNext/>
-              <w:keepLines/>
-              <w:spacing w:line="260" w:lineRule="auto"/>
-            </w:pPr>
-            <w:r>
-              <w:t>Green CI (unit 98%, integration, contract, BDD, ZAP, Trivy, chaos, K8s on kind); 25K/s zero-loss load test; API p95 110 ms @50; 45-min soak; 174 → 0.58 ms query</w:t>
-            </w:r>
-          </w:p>
-        </w:tc>
-      </w:tr>
-      <w:tr>
-        <w:trPr>
-          <w:cantSplit/>
-        </w:trPr>
-        <w:tc>
-          <w:tcPr>
-            <w:tcW w:w="1489" w:type="dxa"/>
-            <w:tcBorders>
-              <w:top w:val="single" w:sz="4" w:space="0" w:color="BFBFBF"/>
-              <w:left w:val="single" w:sz="4" w:space="0" w:color="BFBFBF"/>
-              <w:bottom w:val="single" w:sz="4" w:space="0" w:color="BFBFBF"/>
-              <w:right w:val="single" w:sz="4" w:space="0" w:color="BFBFBF"/>
-            </w:tcBorders>
-            <w:tcMar>
-              <w:top w:w="80" w:type="dxa"/>
-              <w:left w:w="110" w:type="dxa"/>
-              <w:bottom w:w="80" w:type="dxa"/>
-              <w:right w:w="110" w:type="dxa"/>
-            </w:tcMar>
-          </w:tcPr>
-          <w:p>
-            <w:pPr>
-              <w:keepNext/>
-              <w:keepLines/>
-              <w:spacing w:line="260" w:lineRule="auto"/>
-            </w:pPr>
-            <w:r>
-              <w:t>8:45 – 9:30</w:t>
-            </w:r>
-          </w:p>
-        </w:tc>
-        <w:tc>
-          <w:tcPr>
-            <w:tcW w:w="1861" w:type="dxa"/>
-            <w:tcBorders>
-              <w:top w:val="single" w:sz="4" w:space="0" w:color="BFBFBF"/>
-              <w:left w:val="single" w:sz="4" w:space="0" w:color="BFBFBF"/>
-              <w:bottom w:val="single" w:sz="4" w:space="0" w:color="BFBFBF"/>
-              <w:right w:val="single" w:sz="4" w:space="0" w:color="BFBFBF"/>
-            </w:tcBorders>
-            <w:tcMar>
-              <w:top w:w="80" w:type="dxa"/>
-              <w:left w:w="110" w:type="dxa"/>
-              <w:bottom w:w="80" w:type="dxa"/>
-              <w:right w:w="110" w:type="dxa"/>
-            </w:tcMar>
-          </w:tcPr>
-          <w:p>
-            <w:pPr>
-              <w:keepNext/>
-              <w:keepLines/>
-              <w:spacing w:line="260" w:lineRule="auto"/>
-            </w:pPr>
-            <w:r>
-              <w:t>Impact &amp; next steps</w:t>
-            </w:r>
-          </w:p>
-        </w:tc>
-        <w:tc>
-          <w:tcPr>
-            <w:tcW w:w="5956" w:type="dxa"/>
-            <w:tcBorders>
-              <w:top w:val="single" w:sz="4" w:space="0" w:color="BFBFBF"/>
-              <w:left w:val="single" w:sz="4" w:space="0" w:color="BFBFBF"/>
-              <w:bottom w:val="single" w:sz="4" w:space="0" w:color="BFBFBF"/>
-              <w:right w:val="single" w:sz="4" w:space="0" w:color="BFBFBF"/>
-            </w:tcBorders>
-            <w:tcMar>
-              <w:top w:w="80" w:type="dxa"/>
-              <w:left w:w="110" w:type="dxa"/>
-              <w:bottom w:w="80" w:type="dxa"/>
-              <w:right w:w="110" w:type="dxa"/>
-            </w:tcMar>
-          </w:tcPr>
-          <w:p>
-            <w:pPr>
-              <w:keepNext/>
-              <w:keepLines/>
-              <w:spacing w:line="260" w:lineRule="auto"/>
-            </w:pPr>
-            <w:r>
-              <w:t>Tens of thousands of US$ saved per week per fleet; ClickHouse for 100K/s, OIDC + mTLS, real-fleet retraining</w:t>
+              <w:t>Impact, next steps (ClickHouse for 100K/s, SSO, device certificates)</w:t>
             </w:r>
           </w:p>
         </w:tc>
@@ -14814,7 +14612,6 @@
       </w:pPr>
       <w:bookmarkStart w:id="29" w:name="s30"/>
       <w:r>
-        <w:lastRenderedPageBreak/>
         <w:t>15. Conclusion</w:t>
       </w:r>
       <w:bookmarkEnd w:id="29"/>
@@ -15000,7 +14797,6 @@
       </w:pPr>
       <w:bookmarkStart w:id="31" w:name="s32"/>
       <w:r>
-        <w:lastRenderedPageBreak/>
         <w:t>17. Appendix (if any)</w:t>
       </w:r>
       <w:bookmarkEnd w:id="31"/>
@@ -15074,7 +14870,7 @@
           <w:noProof/>
         </w:rPr>
         <w:drawing>
-          <wp:inline distT="0" distB="0" distL="0" distR="0" wp14:anchorId="59275355" wp14:editId="54B4C0A4">
+          <wp:inline distT="0" distB="0" distL="0" distR="0" wp14:anchorId="215075E0" wp14:editId="26C6D92F">
             <wp:extent cx="5943600" cy="2971800"/>
             <wp:effectExtent l="0" t="0" r="0" b="0"/>
             <wp:docPr id="5" name="Picture 5"/>
@@ -15256,7 +15052,7 @@
           <wp:extent cx="1336675" cy="265430"/>
           <wp:effectExtent l="0" t="0" r="0" b="1270"/>
           <wp:wrapSquare wrapText="bothSides"/>
-          <wp:docPr id="1948568041" name="Picture 1948568041" descr="A black background with orange letters&#10;&#10;AI-generated content may be incorrect."/>
+          <wp:docPr id="1918412743" name="Picture 1918412743" descr="A black background with orange letters&#10;&#10;AI-generated content may be incorrect."/>
           <wp:cNvGraphicFramePr>
             <a:graphicFrameLocks xmlns:a="http://schemas.openxmlformats.org/drawingml/2006/main" noChangeAspect="1"/>
           </wp:cNvGraphicFramePr>

</xml_diff>

<commit_message>
Explainer video linked in the solution document and README; final PDF
</commit_message>
<xml_diff>
--- a/docs/solution/FleetPulse_Solution_Document.docx
+++ b/docs/solution/FleetPulse_Solution_Document.docx
@@ -103,7 +103,7 @@
           <w:b/>
           <w:bCs/>
         </w:rPr>
-        <w:t>Demo Video URL (explainer, ~6.5 min): [Link]</w:t>
+        <w:t>Demo Video URL: https://drive.google.com/file/d/1R0No_tNViiExbQ-IPfvOw9y1ivHt7P9Z/view?usp=sharing</w:t>
       </w:r>
     </w:p>
     <w:p>
@@ -2510,7 +2510,7 @@
           <w:noProof/>
         </w:rPr>
         <w:drawing>
-          <wp:inline distT="0" distB="0" distL="0" distR="0" wp14:anchorId="7EE7DF08" wp14:editId="20641F68">
+          <wp:inline distT="0" distB="0" distL="0" distR="0" wp14:anchorId="41D8DAF7" wp14:editId="37551E1B">
             <wp:extent cx="5760720" cy="4492562"/>
             <wp:effectExtent l="0" t="0" r="0" b="0"/>
             <wp:docPr id="1" name="Picture 1"/>
@@ -2555,7 +2555,7 @@
           <w:noProof/>
         </w:rPr>
         <w:drawing>
-          <wp:inline distT="0" distB="0" distL="0" distR="0" wp14:anchorId="3C15A908" wp14:editId="26025FFD">
+          <wp:inline distT="0" distB="0" distL="0" distR="0" wp14:anchorId="5770CC9F" wp14:editId="1D66CF4C">
             <wp:extent cx="5760720" cy="4000500"/>
             <wp:effectExtent l="0" t="0" r="0" b="0"/>
             <wp:docPr id="2" name="Picture 2"/>
@@ -5398,7 +5398,7 @@
           <w:noProof/>
         </w:rPr>
         <w:drawing>
-          <wp:inline distT="0" distB="0" distL="0" distR="0" wp14:anchorId="44293CB5" wp14:editId="7D0AD6C0">
+          <wp:inline distT="0" distB="0" distL="0" distR="0" wp14:anchorId="0C2B60CB" wp14:editId="772CF87A">
             <wp:extent cx="5943600" cy="2971800"/>
             <wp:effectExtent l="0" t="0" r="0" b="0"/>
             <wp:docPr id="3" name="Picture 3"/>
@@ -6695,7 +6695,7 @@
           <w:noProof/>
         </w:rPr>
         <w:drawing>
-          <wp:inline distT="0" distB="0" distL="0" distR="0" wp14:anchorId="23DD6C47" wp14:editId="008FA242">
+          <wp:inline distT="0" distB="0" distL="0" distR="0" wp14:anchorId="13454B05" wp14:editId="645BCB77">
             <wp:extent cx="5943600" cy="2971800"/>
             <wp:effectExtent l="0" t="0" r="0" b="0"/>
             <wp:docPr id="4" name="Picture 4"/>
@@ -14473,7 +14473,7 @@
         <w:spacing w:after="90" w:line="290" w:lineRule="auto"/>
       </w:pPr>
       <w:r>
-        <w:t>Video Link: [URL] (script and shot list: docs/demo-script.md)</w:t>
+        <w:t>Video Link: https://drive.google.com/file/d/1R0No_tNViiExbQ-IPfvOw9y1ivHt7P9Z/view?usp=sharing (script: docs/demo-script.md)</w:t>
       </w:r>
     </w:p>
     <w:p>
@@ -14870,7 +14870,7 @@
           <w:noProof/>
         </w:rPr>
         <w:drawing>
-          <wp:inline distT="0" distB="0" distL="0" distR="0" wp14:anchorId="215075E0" wp14:editId="26C6D92F">
+          <wp:inline distT="0" distB="0" distL="0" distR="0" wp14:anchorId="30998D77" wp14:editId="0DD4E407">
             <wp:extent cx="5943600" cy="2971800"/>
             <wp:effectExtent l="0" t="0" r="0" b="0"/>
             <wp:docPr id="5" name="Picture 5"/>
@@ -15052,7 +15052,7 @@
           <wp:extent cx="1336675" cy="265430"/>
           <wp:effectExtent l="0" t="0" r="0" b="1270"/>
           <wp:wrapSquare wrapText="bothSides"/>
-          <wp:docPr id="1918412743" name="Picture 1918412743" descr="A black background with orange letters&#10;&#10;AI-generated content may be incorrect."/>
+          <wp:docPr id="535353629" name="Picture 535353629" descr="A black background with orange letters&#10;&#10;AI-generated content may be incorrect."/>
           <wp:cNvGraphicFramePr>
             <a:graphicFrameLocks xmlns:a="http://schemas.openxmlformats.org/drawingml/2006/main" noChangeAspect="1"/>
           </wp:cNvGraphicFramePr>

</xml_diff>

<commit_message>
Updated screenshots in README and solution document
</commit_message>
<xml_diff>
--- a/docs/solution/FleetPulse_Solution_Document.docx
+++ b/docs/solution/FleetPulse_Solution_Document.docx
@@ -851,7 +851,11 @@
         <w:spacing w:before="60" w:after="200" w:line="300" w:lineRule="auto"/>
       </w:pPr>
       <w:r>
-        <w:t>“A fleet manager needs a way to know which vehicles will fail in the next week and act before they do, because breakdowns are discovered only when a driver is stranded, which today costs roughly US$2,400 per incident in towing, emergency repair and two days of lost vehicle utilisation (our working assumption, see 2.2).”</w:t>
+        <w:t xml:space="preserve">“A fleet manager needs a way to know which vehicles will fail in the next week and act before they do, because breakdowns are discovered only when a driver is stranded, which today costs roughly </w:t>
+      </w:r>
+      <w:r>
+        <w:lastRenderedPageBreak/>
+        <w:t>US$2,400 per incident in towing, emergency repair and two days of lost vehicle utilisation (our working assumption, see 2.2).”</w:t>
       </w:r>
     </w:p>
     <w:p>
@@ -1694,6 +1698,7 @@
     </w:p>
     <w:p>
       <w:r>
+        <w:lastRenderedPageBreak/>
         <w:t>Existing alternatives: aftermarket OBD dongles (hardware cost and install, one data format); OEM portals (one brand per portal, alerts after the fault); rule-only telematics (alerts on a code, no ranking of who fails next); Motorq Fuse (AI recommendations on OEM data, commercial). FleetPulse combines device-free multi-OEM ingestion, sub-5-second alerts and an explainable 7-day forecast in one view.</w:t>
       </w:r>
     </w:p>
@@ -2495,6 +2500,7 @@
         <w:spacing w:before="60" w:after="200" w:line="300" w:lineRule="auto"/>
       </w:pPr>
       <w:r>
+        <w:lastRenderedPageBreak/>
         <w:t>User journey: (1) a Borealis van reports coolant at 119 °C and code P0217 in OEM-specific JSON; (2) the processor normalises it, validates the VIN check digit, drops duplicates and evaluates sliding-window rules; (3) an OVERHEAT_TREND / CRITICAL_DTC alert is written idempotently and pushed over WebSocket, appearing on the dashboard ~0.2 s after the vehicle timestamp; (4) the manager opens the vehicle: 73% 7-day risk, reasons “overdue for service, coolant running hot, 12 V battery voltage low”, the coolant t</w:t>
       </w:r>
       <w:r>
@@ -2510,8 +2516,8 @@
           <w:noProof/>
         </w:rPr>
         <w:drawing>
-          <wp:inline distT="0" distB="0" distL="0" distR="0" wp14:anchorId="41D8DAF7" wp14:editId="37551E1B">
-            <wp:extent cx="5760720" cy="4492562"/>
+          <wp:inline distT="0" distB="0" distL="0" distR="0" wp14:anchorId="4AA7C8A5" wp14:editId="21C933B1">
+            <wp:extent cx="5760720" cy="3239466"/>
             <wp:effectExtent l="0" t="0" r="0" b="0"/>
             <wp:docPr id="1" name="Picture 1"/>
             <wp:cNvGraphicFramePr>
@@ -2533,7 +2539,7 @@
                   <pic:spPr>
                     <a:xfrm>
                       <a:off x="0" y="0"/>
-                      <a:ext cx="5760720" cy="4492562"/>
+                      <a:ext cx="5760720" cy="3239466"/>
                     </a:xfrm>
                     <a:prstGeom prst="rect">
                       <a:avLst/>
@@ -2555,8 +2561,8 @@
           <w:noProof/>
         </w:rPr>
         <w:drawing>
-          <wp:inline distT="0" distB="0" distL="0" distR="0" wp14:anchorId="5770CC9F" wp14:editId="1D66CF4C">
-            <wp:extent cx="5760720" cy="4000500"/>
+          <wp:inline distT="0" distB="0" distL="0" distR="0" wp14:anchorId="3ED0C74C" wp14:editId="6A7A78B6">
+            <wp:extent cx="5760720" cy="3239466"/>
             <wp:effectExtent l="0" t="0" r="0" b="0"/>
             <wp:docPr id="2" name="Picture 2"/>
             <wp:cNvGraphicFramePr>
@@ -2578,7 +2584,7 @@
                   <pic:spPr>
                     <a:xfrm>
                       <a:off x="0" y="0"/>
-                      <a:ext cx="5760720" cy="4000500"/>
+                      <a:ext cx="5760720" cy="3239466"/>
                     </a:xfrm>
                     <a:prstGeom prst="rect">
                       <a:avLst/>
@@ -2635,6 +2641,7 @@
           <w:b/>
           <w:bCs/>
         </w:rPr>
+        <w:lastRenderedPageBreak/>
         <w:t xml:space="preserve">Pain Relieved: </w:t>
       </w:r>
       <w:r>
@@ -2932,6 +2939,7 @@
                 <w:sz w:val="20"/>
                 <w:szCs w:val="20"/>
               </w:rPr>
+              <w:lastRenderedPageBreak/>
               <w:t>ID</w:t>
             </w:r>
           </w:p>
@@ -4138,6 +4146,7 @@
               <w:spacing w:line="260" w:lineRule="auto"/>
             </w:pPr>
             <w:r>
+              <w:lastRenderedPageBreak/>
               <w:t>F-06</w:t>
             </w:r>
           </w:p>
@@ -5287,6 +5296,7 @@
       </w:pPr>
       <w:bookmarkStart w:id="10" w:name="s11"/>
       <w:r>
+        <w:lastRenderedPageBreak/>
         <w:t>5. Solution Architecture (High-Level Design)</w:t>
       </w:r>
       <w:bookmarkEnd w:id="10"/>
@@ -5398,7 +5408,7 @@
           <w:noProof/>
         </w:rPr>
         <w:drawing>
-          <wp:inline distT="0" distB="0" distL="0" distR="0" wp14:anchorId="0C2B60CB" wp14:editId="772CF87A">
+          <wp:inline distT="0" distB="0" distL="0" distR="0" wp14:anchorId="7775D09B" wp14:editId="7DD0B920">
             <wp:extent cx="5943600" cy="2971800"/>
             <wp:effectExtent l="0" t="0" r="0" b="0"/>
             <wp:docPr id="3" name="Picture 3"/>
@@ -5440,6 +5450,7 @@
       </w:pPr>
       <w:bookmarkStart w:id="12" w:name="s13"/>
       <w:r>
+        <w:lastRenderedPageBreak/>
         <w:t>5.2 Technology Stack &amp; Justification</w:t>
       </w:r>
       <w:bookmarkEnd w:id="12"/>
@@ -6242,6 +6253,7 @@
                 <w:sz w:val="20"/>
                 <w:szCs w:val="20"/>
               </w:rPr>
+              <w:lastRenderedPageBreak/>
               <w:t>Query</w:t>
             </w:r>
           </w:p>
@@ -6695,7 +6707,7 @@
           <w:noProof/>
         </w:rPr>
         <w:drawing>
-          <wp:inline distT="0" distB="0" distL="0" distR="0" wp14:anchorId="13454B05" wp14:editId="645BCB77">
+          <wp:inline distT="0" distB="0" distL="0" distR="0" wp14:anchorId="4B5AF357" wp14:editId="7B362E0A">
             <wp:extent cx="5943600" cy="2971800"/>
             <wp:effectExtent l="0" t="0" r="0" b="0"/>
             <wp:docPr id="4" name="Picture 4"/>
@@ -6827,7 +6839,11 @@
         <w:spacing w:before="60" w:after="200" w:line="300" w:lineRule="auto"/>
       </w:pPr>
       <w:r>
-        <w:t>Kubernetes namespace fleetpulse (pod-security restricted): api Deployment (3 replicas, HPA 3–20 on CPU, PDB minAvailable 2, zone topology spread), processor Deployment (6 replicas ≤ partitions; KEDA on consumer lag in production), risk-scoring CronJob every 5 minutes, default-deny NetworkPolicy, TLS Ingress via cert-manager. Containers run as non-root with read-only root filesystems and dropped capabilities. Secrets come from a K8s Secret synced from Vault / cloud secret manager (infra/k8s/fleetpulse.yaml).</w:t>
+        <w:t xml:space="preserve">Kubernetes namespace fleetpulse (pod-security restricted): api Deployment (3 replicas, HPA 3–20 on CPU, PDB minAvailable 2, zone topology spread), processor Deployment (6 replicas ≤ partitions; KEDA </w:t>
+      </w:r>
+      <w:r>
+        <w:lastRenderedPageBreak/>
+        <w:t>on consumer lag in production), risk-scoring CronJob every 5 minutes, default-deny NetworkPolicy, TLS Ingress via cert-manager. Containers run as non-root with read-only root filesystems and dropped capabilities. Secrets come from a K8s Secret synced from Vault / cloud secret manager (infra/k8s/fleetpulse.yaml).</w:t>
       </w:r>
     </w:p>
     <w:p>
@@ -7416,6 +7432,7 @@
       </w:pPr>
       <w:bookmarkStart w:id="17" w:name="s18"/>
       <w:r>
+        <w:lastRenderedPageBreak/>
         <w:t>6.2 Design Principles Applied</w:t>
       </w:r>
       <w:bookmarkEnd w:id="17"/>
@@ -8250,6 +8267,7 @@
           <w:b/>
           <w:bCs/>
         </w:rPr>
+        <w:lastRenderedPageBreak/>
         <w:t xml:space="preserve">Event Schemas: </w:t>
       </w:r>
       <w:r>
@@ -8504,6 +8522,7 @@
                 <w:sz w:val="20"/>
                 <w:szCs w:val="20"/>
               </w:rPr>
+              <w:lastRenderedPageBreak/>
               <w:t>Problem</w:t>
             </w:r>
           </w:p>
@@ -9760,6 +9779,7 @@
         <w:spacing w:before="60" w:after="200" w:line="300" w:lineRule="auto"/>
       </w:pPr>
       <w:r>
+        <w:lastRenderedPageBreak/>
         <w:t>Measured: hot path (parse → normalise → VIN → Bloom → rules) 200,000 events in 5.90 s = 33.9K events/s on one core (tests/load/processor_bench.py).</w:t>
       </w:r>
     </w:p>
@@ -9769,6 +9789,7 @@
       </w:pPr>
       <w:bookmarkStart w:id="21" w:name="s22"/>
       <w:r>
+        <w:lastRenderedPageBreak/>
         <w:t>7. Non-Functional Requirements &amp; Performance Benchmarks</w:t>
       </w:r>
       <w:bookmarkEnd w:id="21"/>
@@ -9830,6 +9851,7 @@
                 <w:sz w:val="20"/>
                 <w:szCs w:val="20"/>
               </w:rPr>
+              <w:lastRenderedPageBreak/>
               <w:t>NFR</w:t>
             </w:r>
           </w:p>
@@ -10190,6 +10212,7 @@
               <w:spacing w:line="260" w:lineRule="auto"/>
             </w:pPr>
             <w:r>
+              <w:lastRenderedPageBreak/>
               <w:t>API Latency</w:t>
             </w:r>
           </w:p>
@@ -10553,10 +10576,11 @@
         <w:spacing w:before="60" w:after="200" w:line="300" w:lineRule="auto"/>
       </w:pPr>
       <w:r>
-        <w:t>Original load test setup: everything on one 4-vCPU cloud VM under docker compose (Redpanda, Postgres 16, Redis, 2 processors, simulator, batch, API) with 100K vehicles at a 5,000 events/s base rate and 3x bursts for 10 s every 2 minutes. API load: tests/load/api_load.py (async httpx) against 4 uvicorn workers, rate limiter raised for the test. Processor CPU benchmark: tests/load/processor_bench.py. After hardening, everything was re-measured on a 16-vCPU laptop: alert latency with 4 processor replicas (docs</w:t>
-      </w:r>
-      <w:r>
-        <w:t>/evidence/alert_latency.txt); end-to-end throughput with tests/load/pipeline_load.py (parallel producers, 3x bursts, zero-loss check); API latency with a multi-process client inside the compose network (api_load.txt); and a 45-minute soak (soak.txt). Raw outputs in docs/evidence/.</w:t>
+        <w:t xml:space="preserve">Original load test setup: everything on one 4-vCPU cloud VM under docker compose (Redpanda, Postgres 16, Redis, 2 processors, simulator, batch, API) with 100K vehicles at a 5,000 events/s base rate and 3x bursts for 10 s every 2 minutes. API load: tests/load/api_load.py (async httpx) against 4 uvicorn workers, rate limiter raised for the test. Processor CPU benchmark: tests/load/processor_bench.py. </w:t>
+      </w:r>
+      <w:r>
+        <w:lastRenderedPageBreak/>
+        <w:t>After hardening, everything was re-measured on a 16-vCPU laptop: alert latency with 4 processor replicas (docs/evidence/alert_latency.txt); end-to-end throughput with tests/load/pipeline_load.py (parallel producers, 3x bursts, zero-loss check); API latency with a multi-process client inside the compose network (api_load.txt); and a 45-minute soak (soak.txt). Raw outputs in docs/evidence/.</w:t>
       </w:r>
     </w:p>
     <w:p>
@@ -10739,6 +10763,7 @@
                 <w:sz w:val="20"/>
                 <w:szCs w:val="20"/>
               </w:rPr>
+              <w:lastRenderedPageBreak/>
               <w:t>#</w:t>
             </w:r>
           </w:p>
@@ -11592,6 +11617,7 @@
       </w:pPr>
       <w:bookmarkStart w:id="23" w:name="s24"/>
       <w:r>
+        <w:lastRenderedPageBreak/>
         <w:t>9. Test Strategy</w:t>
       </w:r>
       <w:bookmarkEnd w:id="23"/>
@@ -12821,6 +12847,52 @@
         <w:spacing w:before="60" w:after="200" w:line="300" w:lineRule="auto"/>
       </w:pPr>
       <w:r>
+        <w:rPr>
+          <w:noProof/>
+        </w:rPr>
+        <w:lastRenderedPageBreak/>
+        <w:drawing>
+          <wp:inline distT="0" distB="0" distL="0" distR="0" wp14:anchorId="689122E0" wp14:editId="22F3E549">
+            <wp:extent cx="5760720" cy="3239466"/>
+            <wp:effectExtent l="0" t="0" r="0" b="0"/>
+            <wp:docPr id="5" name="Picture 5"/>
+            <wp:cNvGraphicFramePr>
+              <a:graphicFrameLocks xmlns:a="http://schemas.openxmlformats.org/drawingml/2006/main" noChangeAspect="1"/>
+            </wp:cNvGraphicFramePr>
+            <a:graphic xmlns:a="http://schemas.openxmlformats.org/drawingml/2006/main">
+              <a:graphicData uri="http://schemas.openxmlformats.org/drawingml/2006/picture">
+                <pic:pic xmlns:pic="http://schemas.openxmlformats.org/drawingml/2006/picture">
+                  <pic:nvPicPr>
+                    <pic:cNvPr id="0" name="grafana.png"/>
+                    <pic:cNvPicPr/>
+                  </pic:nvPicPr>
+                  <pic:blipFill>
+                    <a:blip r:embed="rId11"/>
+                    <a:stretch>
+                      <a:fillRect/>
+                    </a:stretch>
+                  </pic:blipFill>
+                  <pic:spPr>
+                    <a:xfrm>
+                      <a:off x="0" y="0"/>
+                      <a:ext cx="5760720" cy="3239466"/>
+                    </a:xfrm>
+                    <a:prstGeom prst="rect">
+                      <a:avLst/>
+                    </a:prstGeom>
+                  </pic:spPr>
+                </pic:pic>
+              </a:graphicData>
+            </a:graphic>
+          </wp:inline>
+        </w:drawing>
+      </w:r>
+    </w:p>
+    <w:p>
+      <w:pPr>
+        <w:spacing w:before="60" w:after="200" w:line="300" w:lineRule="auto"/>
+      </w:pPr>
+      <w:r>
         <w:t>Troubleshooting a latency spike: (1) Grafana: is fp_api_latency p95 up for one route or all? (2) If all, check pod CPU and the Postgres connection pool; if one route, run EXPLAIN ANALYZE on its query (as in 5.3). (3) For alert latency, compare fp_ingest_latency with consumer lag: rising lag means processors are saturated, so scale replicas up to the partition count; flat lag but slow batches (fp_batch_seconds) points to Postgres writes. (4) Correlate with simulator burst logs. OpenTelemetry tracing across s</w:t>
       </w:r>
       <w:r>
@@ -12962,7 +13034,11 @@
         <w:t xml:space="preserve">Data and features: </w:t>
       </w:r>
       <w:r>
-        <w:t>100,000 simulated vehicle-weeks from the same wear model as the live simulator; features: service-overdue ratio, age, odometer, max coolant (7 d), min 12 V (7 d), fault-code events (7 d), harsh brakes (7 d), EV / hybrid flags. Live features come from the vehicle_daily rollup, which the batch job maintains incrementally (only rows since the last watermark are read, each counted exactly once). Leakage check: the label is drawn from a hazard on the hidden wear, which is never a feature; only noisy symptoms are</w:t>
+        <w:t xml:space="preserve">100,000 simulated vehicle-weeks from the same wear model as the live simulator; features: service-overdue ratio, age, odometer, max coolant (7 d), min 12 V (7 d), fault-code events (7 d), harsh brakes (7 d), EV / hybrid flags. Live features come from the vehicle_daily rollup, which the batch job maintains incrementally (only rows since the last watermark are read, each counted exactly </w:t>
+      </w:r>
+      <w:r>
+        <w:lastRenderedPageBreak/>
+        <w:t>once). Leakage check: the label is drawn from a hazard on the hidden wear, which is never a feature; only noisy symptoms are</w:t>
       </w:r>
       <w:r>
         <w:t>.</w:t>
@@ -13623,6 +13699,7 @@
       </w:pPr>
       <w:bookmarkStart w:id="27" w:name="s28"/>
       <w:r>
+        <w:lastRenderedPageBreak/>
         <w:t>13. Demo Video (5 Minutes Maximum)</w:t>
       </w:r>
       <w:bookmarkEnd w:id="27"/>
@@ -14639,6 +14716,7 @@
         <w:spacing w:after="90" w:line="290" w:lineRule="auto"/>
       </w:pPr>
       <w:r>
+        <w:lastRenderedPageBreak/>
         <w:t>Strengths of the solution</w:t>
       </w:r>
     </w:p>
@@ -14853,7 +14931,11 @@
         <w:spacing w:after="90" w:line="290" w:lineRule="auto"/>
       </w:pPr>
       <w:r>
-        <w:t>Evidence files in the repository: docs/evidence/api_load.txt, processor_bench.txt, alert_latency.txt, soak.txt, grafana.png, explain_analyze.txt, chaos.txt, dashboard.png, vehicle_drawer.png; fleetpulse/ml/metrics.json; docs/threat-model.md; docs/adr/*.md; docs/demo-script.md.</w:t>
+        <w:t xml:space="preserve">Evidence files in the repository: docs/evidence/api_load.txt, processor_bench.txt, alert_latency.txt, soak.txt, grafana.png, explain_analyze.txt, chaos.txt, dashboard.png, </w:t>
+      </w:r>
+      <w:r>
+        <w:lastRenderedPageBreak/>
+        <w:t>vehicle_drawer.png; fleetpulse/ml/metrics.json; docs/threat-model.md; docs/adr/*.md; docs/demo-script.md.</w:t>
       </w:r>
     </w:p>
     <w:p>
@@ -14870,10 +14952,10 @@
           <w:noProof/>
         </w:rPr>
         <w:drawing>
-          <wp:inline distT="0" distB="0" distL="0" distR="0" wp14:anchorId="30998D77" wp14:editId="0DD4E407">
+          <wp:inline distT="0" distB="0" distL="0" distR="0" wp14:anchorId="01AFE94E" wp14:editId="54960943">
             <wp:extent cx="5943600" cy="2971800"/>
             <wp:effectExtent l="0" t="0" r="0" b="0"/>
-            <wp:docPr id="5" name="Picture 5"/>
+            <wp:docPr id="6" name="Picture 6"/>
             <wp:cNvGraphicFramePr>
               <a:graphicFrameLocks xmlns:a="http://schemas.openxmlformats.org/drawingml/2006/main" noChangeAspect="1"/>
             </wp:cNvGraphicFramePr>
@@ -14920,8 +15002,8 @@
       </w:r>
     </w:p>
     <w:sectPr>
-      <w:headerReference w:type="default" r:id="rId11"/>
-      <w:footerReference w:type="default" r:id="rId12"/>
+      <w:headerReference w:type="default" r:id="rId12"/>
+      <w:footerReference w:type="default" r:id="rId13"/>
       <w:pgSz w:w="11906" w:h="16838"/>
       <w:pgMar w:top="1440" w:right="1300" w:bottom="1300" w:left="1300" w:header="600" w:footer="600" w:gutter="0"/>
       <w:cols w:space="720"/>
@@ -15052,7 +15134,7 @@
           <wp:extent cx="1336675" cy="265430"/>
           <wp:effectExtent l="0" t="0" r="0" b="1270"/>
           <wp:wrapSquare wrapText="bothSides"/>
-          <wp:docPr id="535353629" name="Picture 535353629" descr="A black background with orange letters&#10;&#10;AI-generated content may be incorrect."/>
+          <wp:docPr id="1047092086" name="Picture 1047092086" descr="A black background with orange letters&#10;&#10;AI-generated content may be incorrect."/>
           <wp:cNvGraphicFramePr>
             <a:graphicFrameLocks xmlns:a="http://schemas.openxmlformats.org/drawingml/2006/main" noChangeAspect="1"/>
           </wp:cNvGraphicFramePr>

</xml_diff>

<commit_message>
Solution document: owner's manual edits (cover) and matching PDF
</commit_message>
<xml_diff>
--- a/docs/solution/FleetPulse_Solution_Document.docx
+++ b/docs/solution/FleetPulse_Solution_Document.docx
@@ -6,6 +6,23 @@
       <w:pPr>
         <w:spacing w:before="3200" w:after="120"/>
       </w:pPr>
+      <w:r>
+        <w:rPr>
+          <w:sz w:val="56"/>
+          <w:szCs w:val="56"/>
+        </w:rPr>
+        <w:t>Connected Vehicle Intelligence Hackathon</w:t>
+      </w:r>
+      <w:r>
+        <w:br/>
+      </w:r>
+      <w:r>
+        <w:br/>
+      </w:r>
+      <w:r>
+        <w:br/>
+      </w:r>
+      <w:proofErr w:type="spellStart"/>
       <w:r>
         <w:rPr>
           <w:b/>
@@ -13,109 +30,272 @@
           <w:sz w:val="56"/>
           <w:szCs w:val="56"/>
         </w:rPr>
-        <w:t>Connected Vehicle Intelligence Hackathon</w:t>
-      </w:r>
-    </w:p>
-    <w:p>
-      <w:pPr>
-        <w:spacing w:after="2200"/>
-      </w:pPr>
-      <w:r>
-        <w:rPr>
-          <w:sz w:val="44"/>
-          <w:szCs w:val="44"/>
-        </w:rPr>
-        <w:t>Solution Document Template</w:t>
-      </w:r>
-    </w:p>
-    <w:p>
-      <w:pPr>
-        <w:spacing w:after="60"/>
-      </w:pPr>
+        <w:t>FleetPulse</w:t>
+      </w:r>
+      <w:proofErr w:type="spellEnd"/>
       <w:r>
         <w:rPr>
           <w:b/>
           <w:bCs/>
+          <w:sz w:val="56"/>
+          <w:szCs w:val="56"/>
         </w:rPr>
-        <w:t xml:space="preserve">Submission Format: </w:t>
+        <w:t xml:space="preserve">: </w:t>
       </w:r>
       <w:r>
         <w:rPr>
-          <w:color w:val="595959"/>
+          <w:sz w:val="56"/>
+          <w:szCs w:val="56"/>
         </w:rPr>
-        <w:t>PDF (export of this document)</w:t>
-      </w:r>
-    </w:p>
-    <w:p>
-      <w:pPr>
-        <w:spacing w:after="60"/>
-      </w:pPr>
+        <w:t>predictive maintenance for mixed ICE / EV fleets</w:t>
+      </w:r>
       <w:r>
         <w:rPr>
           <w:b/>
           <w:bCs/>
+          <w:sz w:val="56"/>
+          <w:szCs w:val="56"/>
         </w:rPr>
-        <w:t>To be Submitted by: Jeevan Sarasram S S (solo entry)</w:t>
-      </w:r>
-    </w:p>
-    <w:p>
-      <w:pPr>
-        <w:spacing w:after="60"/>
-      </w:pPr>
+        <w:br/>
+      </w:r>
       <w:r>
         <w:rPr>
           <w:b/>
           <w:bCs/>
+          <w:sz w:val="56"/>
+          <w:szCs w:val="56"/>
         </w:rPr>
-        <w:t>Team Members &amp; Roles: Jeevan Sarasram S S (Reg. No. RA2311056010035), solo developer: problem framing, architecture, backend, data engineering, ML, DevOps and testing; js9882@srmist.edu.in, jeevansiva2005@gmail.com</w:t>
+        <w:br/>
       </w:r>
     </w:p>
     <w:p>
       <w:pPr>
         <w:spacing w:after="60"/>
+        <w:rPr>
+          <w:sz w:val="28"/>
+          <w:szCs w:val="28"/>
+        </w:rPr>
       </w:pPr>
       <w:r>
         <w:rPr>
           <w:b/>
           <w:bCs/>
+          <w:sz w:val="28"/>
+          <w:szCs w:val="28"/>
         </w:rPr>
-        <w:t>Problem Space Chosen: Predictive maintenance for mixed ICE / hybrid / EV fleets (with real-time critical-fault alerting)</w:t>
-      </w:r>
-    </w:p>
-    <w:p>
-      <w:pPr>
-        <w:spacing w:after="60"/>
-      </w:pPr>
+        <w:t xml:space="preserve">Submitted by: Jeevan </w:t>
+      </w:r>
+      <w:proofErr w:type="spellStart"/>
       <w:r>
         <w:rPr>
           <w:b/>
           <w:bCs/>
+          <w:sz w:val="28"/>
+          <w:szCs w:val="28"/>
         </w:rPr>
-        <w:t>Repository URL: https://github.com/JeevanSarasramSS/fleetpulse (tag v1.0-submission)</w:t>
-      </w:r>
-    </w:p>
-    <w:p>
-      <w:pPr>
-        <w:spacing w:after="60"/>
-      </w:pPr>
+        <w:t>Sarasram</w:t>
+      </w:r>
+      <w:proofErr w:type="spellEnd"/>
       <w:r>
         <w:rPr>
           <w:b/>
           <w:bCs/>
+          <w:sz w:val="28"/>
+          <w:szCs w:val="28"/>
         </w:rPr>
-        <w:t>Demo Video URL: https://drive.google.com/file/d/1R0No_tNViiExbQ-IPfvOw9y1ivHt7P9Z/view?usp=sharing</w:t>
-      </w:r>
-    </w:p>
-    <w:p>
-      <w:pPr>
-        <w:spacing w:after="60"/>
-      </w:pPr>
+        <w:t xml:space="preserve"> S </w:t>
+      </w:r>
+      <w:proofErr w:type="spellStart"/>
       <w:r>
         <w:rPr>
           <w:b/>
           <w:bCs/>
+          <w:sz w:val="28"/>
+          <w:szCs w:val="28"/>
         </w:rPr>
-        <w:t>Date of Submission: 01/10/2026</w:t>
+        <w:t>S</w:t>
+      </w:r>
+      <w:proofErr w:type="spellEnd"/>
+      <w:r>
+        <w:rPr>
+          <w:b/>
+          <w:bCs/>
+          <w:sz w:val="28"/>
+          <w:szCs w:val="28"/>
+        </w:rPr>
+        <w:t xml:space="preserve"> (solo entry)</w:t>
+      </w:r>
+    </w:p>
+    <w:p>
+      <w:pPr>
+        <w:spacing w:after="60"/>
+        <w:rPr>
+          <w:sz w:val="28"/>
+          <w:szCs w:val="28"/>
+        </w:rPr>
+      </w:pPr>
+      <w:r>
+        <w:rPr>
+          <w:b/>
+          <w:bCs/>
+          <w:sz w:val="28"/>
+          <w:szCs w:val="28"/>
+        </w:rPr>
+        <w:t xml:space="preserve">Team Members &amp; Roles: Jeevan </w:t>
+      </w:r>
+      <w:proofErr w:type="spellStart"/>
+      <w:r>
+        <w:rPr>
+          <w:b/>
+          <w:bCs/>
+          <w:sz w:val="28"/>
+          <w:szCs w:val="28"/>
+        </w:rPr>
+        <w:t>Sarasram</w:t>
+      </w:r>
+      <w:proofErr w:type="spellEnd"/>
+      <w:r>
+        <w:rPr>
+          <w:b/>
+          <w:bCs/>
+          <w:sz w:val="28"/>
+          <w:szCs w:val="28"/>
+        </w:rPr>
+        <w:t xml:space="preserve"> S </w:t>
+      </w:r>
+      <w:proofErr w:type="spellStart"/>
+      <w:r>
+        <w:rPr>
+          <w:b/>
+          <w:bCs/>
+          <w:sz w:val="28"/>
+          <w:szCs w:val="28"/>
+        </w:rPr>
+        <w:t>S</w:t>
+      </w:r>
+      <w:proofErr w:type="spellEnd"/>
+      <w:r>
+        <w:rPr>
+          <w:b/>
+          <w:bCs/>
+          <w:sz w:val="28"/>
+          <w:szCs w:val="28"/>
+        </w:rPr>
+        <w:t xml:space="preserve"> (Reg. No. RA2311056010035), solo developer: problem framing, architecture, backend, data engineering, ML, DevOps and testing; js9882@srmist.edu.in, jeevansiva2005@gmail.com</w:t>
+      </w:r>
+    </w:p>
+    <w:p>
+      <w:pPr>
+        <w:spacing w:after="60"/>
+        <w:rPr>
+          <w:sz w:val="28"/>
+          <w:szCs w:val="28"/>
+        </w:rPr>
+      </w:pPr>
+      <w:r>
+        <w:rPr>
+          <w:b/>
+          <w:bCs/>
+          <w:sz w:val="28"/>
+          <w:szCs w:val="28"/>
+        </w:rPr>
+        <w:t>Problem Space Chosen: Predictive maintenance for mixed ICE / hybrid / EV fleets (with real-time critical-fault alerting)</w:t>
+      </w:r>
+    </w:p>
+    <w:p>
+      <w:pPr>
+        <w:spacing w:after="60"/>
+        <w:rPr>
+          <w:sz w:val="28"/>
+          <w:szCs w:val="28"/>
+        </w:rPr>
+      </w:pPr>
+      <w:r>
+        <w:rPr>
+          <w:b/>
+          <w:bCs/>
+          <w:sz w:val="28"/>
+          <w:szCs w:val="28"/>
+        </w:rPr>
+        <w:t xml:space="preserve">Repository URL: </w:t>
+      </w:r>
+      <w:hyperlink r:id="rId7" w:history="1">
+        <w:r>
+          <w:rPr>
+            <w:rStyle w:val="Hyperlink"/>
+            <w:b/>
+            <w:bCs/>
+            <w:sz w:val="28"/>
+            <w:szCs w:val="28"/>
+          </w:rPr>
+          <w:t>https://github.com/JeevanSarasramSS/fleetpulse</w:t>
+        </w:r>
+      </w:hyperlink>
+    </w:p>
+    <w:p>
+      <w:pPr>
+        <w:spacing w:after="60"/>
+        <w:rPr>
+          <w:sz w:val="28"/>
+          <w:szCs w:val="28"/>
+        </w:rPr>
+      </w:pPr>
+      <w:r>
+        <w:rPr>
+          <w:b/>
+          <w:bCs/>
+          <w:sz w:val="28"/>
+          <w:szCs w:val="28"/>
+        </w:rPr>
+        <w:t xml:space="preserve">Demo Video URL: </w:t>
+      </w:r>
+      <w:hyperlink r:id="rId8" w:history="1">
+        <w:r>
+          <w:rPr>
+            <w:rStyle w:val="Hyperlink"/>
+            <w:b/>
+            <w:bCs/>
+            <w:sz w:val="28"/>
+            <w:szCs w:val="28"/>
+          </w:rPr>
+          <w:t>https://drive.google.com/file/d/1R0No_tNViiExbQ-IPfvOw9y1ivHt7P9Z/view?usp=sharing</w:t>
+        </w:r>
+      </w:hyperlink>
+    </w:p>
+    <w:p>
+      <w:pPr>
+        <w:spacing w:after="60"/>
+        <w:rPr>
+          <w:sz w:val="28"/>
+          <w:szCs w:val="28"/>
+        </w:rPr>
+      </w:pPr>
+      <w:r>
+        <w:rPr>
+          <w:b/>
+          <w:bCs/>
+          <w:sz w:val="28"/>
+          <w:szCs w:val="28"/>
+        </w:rPr>
+        <w:t>Date of Submission: 0</w:t>
+      </w:r>
+      <w:r>
+        <w:rPr>
+          <w:b/>
+          <w:bCs/>
+          <w:sz w:val="28"/>
+          <w:szCs w:val="28"/>
+        </w:rPr>
+        <w:t>2</w:t>
+      </w:r>
+      <w:r>
+        <w:rPr>
+          <w:b/>
+          <w:bCs/>
+          <w:sz w:val="28"/>
+          <w:szCs w:val="28"/>
+        </w:rPr>
+        <w:t>/10/2026</w:t>
       </w:r>
     </w:p>
     <w:p>
@@ -731,8 +911,13 @@
         </w:rPr>
         <w:t xml:space="preserve">Solution. </w:t>
       </w:r>
-      <w:r>
-        <w:t>FleetPulse streams telemetry from every vehicle, raises critical faults on the manager's screen within seconds, and every minute ranks the whole fleet by its probability of breaking down in the next 7 days, with the reasons and a dollar estimate. A fleet copilot answers questions over the same data and proposes work orders that a human approves.</w:t>
+      <w:proofErr w:type="spellStart"/>
+      <w:r>
+        <w:t>FleetPulse</w:t>
+      </w:r>
+      <w:proofErr w:type="spellEnd"/>
+      <w:r>
+        <w:t xml:space="preserve"> streams telemetry from every vehicle, raises critical faults on the manager's screen within seconds, and every minute ranks the whole fleet by its probability of breaking down in the next 7 days, with the reasons and a dollar estimate. A fleet copilot answers questions over the same data and proposes work orders that a human approves.</w:t>
       </w:r>
     </w:p>
     <w:p>
@@ -746,10 +931,31 @@
         <w:t xml:space="preserve">Results (measured on the submitted code). </w:t>
       </w:r>
       <w:r>
-        <w:t xml:space="preserve">100,000 simulated vehicles across 3 tenants and 2 OEM payload formats; load-tested end to end at up to ~25,000 events/s with 3x bursts and zero data loss (every unique event written), ~5,000 events/s in the default demo (CPU hot path 33.9K events/s per core); data freshness vehicle → dashboard ~0.15 s; critical alert vehicle → screen p50 0.17 s and p95 2.6 s even through a 3x burst (target &lt; 5 s); 100,000 vehicles scored in ~10 s; risk model ROC-AUC 0.878 vs 0.688 for the mileage-since-service baseline and </w:t>
-      </w:r>
-      <w:r>
-        <w:t>4.2x the baseline's precision on the top 2% of the fleet; API p95 110 ms at 50 concurrent users; slowest query 174 ms → 0.58 ms; recovery from killing the processors and restarting the broker in ~26 s with zero data loss; the production Kubernetes manifests deploy unchanged (config only) on a kind cluster in CI.</w:t>
+        <w:t xml:space="preserve">100,000 simulated vehicles across 3 tenants and 2 OEM payload formats; load-tested end to end at up to ~25,000 events/s with 3x bursts and zero data loss (every unique event written), ~5,000 events/s in the default demo (CPU hot path 33.9K events/s per core); data freshness vehicle → dashboard ~0.15 s; critical alert vehicle → screen p50 0.17 s and p95 2.6 s even through a 3x burst (target &lt; 5 s); 100,000 vehicles scored in ~10 s; risk model ROC-AUC 0.878 vs 0.688 for the mileage-since-service baseline and 4.2x the baseline's precision on the top 2% of the fleet; API p95 110 </w:t>
+      </w:r>
+      <w:proofErr w:type="spellStart"/>
+      <w:r>
+        <w:t>ms</w:t>
+      </w:r>
+      <w:proofErr w:type="spellEnd"/>
+      <w:r>
+        <w:t xml:space="preserve"> at 50 concurrent users; slowest query 174 </w:t>
+      </w:r>
+      <w:proofErr w:type="spellStart"/>
+      <w:r>
+        <w:t>ms</w:t>
+      </w:r>
+      <w:proofErr w:type="spellEnd"/>
+      <w:r>
+        <w:t xml:space="preserve"> → 0.58 </w:t>
+      </w:r>
+      <w:proofErr w:type="spellStart"/>
+      <w:r>
+        <w:t>ms</w:t>
+      </w:r>
+      <w:proofErr w:type="spellEnd"/>
+      <w:r>
+        <w:t>; recovery from killing the processors and restarting the broker in ~26 s with zero data loss; the production Kubernetes manifests deploy unchanged (config only) on a kind cluster in CI.</w:t>
       </w:r>
     </w:p>
     <w:p>
@@ -953,7 +1159,15 @@
         <w:t xml:space="preserve">Existing Alternatives: </w:t>
       </w:r>
       <w:r>
-        <w:t>Aftermarket dongles, OEM portals, Motorq Fuse, other telematics tools — and why they fall short</w:t>
+        <w:t xml:space="preserve">Aftermarket dongles, OEM portals, </w:t>
+      </w:r>
+      <w:proofErr w:type="spellStart"/>
+      <w:r>
+        <w:t>Motorq</w:t>
+      </w:r>
+      <w:proofErr w:type="spellEnd"/>
+      <w:r>
+        <w:t xml:space="preserve"> Fuse, other telematics tools — and why they fall short</w:t>
       </w:r>
     </w:p>
     <w:tbl>
@@ -1688,7 +1902,15 @@
     </w:tbl>
     <w:p>
       <w:r>
-        <w:t>Facts are taken from the brief and public sources; numbers we could not verify are marked as assumptions and are the inputs to our savings estimate, so they can be changed in one place (fleetpulse/agent/copilot.py).</w:t>
+        <w:t>Facts are taken from the brief and public sources; numbers we could not verify are marked as assumptions and are the inputs to our savings estimate, so they can be changed in one place (</w:t>
+      </w:r>
+      <w:proofErr w:type="spellStart"/>
+      <w:r>
+        <w:t>fleetpulse</w:t>
+      </w:r>
+      <w:proofErr w:type="spellEnd"/>
+      <w:r>
+        <w:t>/agent/copilot.py).</w:t>
       </w:r>
     </w:p>
     <w:p>
@@ -1699,7 +1921,23 @@
     <w:p>
       <w:r>
         <w:lastRenderedPageBreak/>
-        <w:t>Existing alternatives: aftermarket OBD dongles (hardware cost and install, one data format); OEM portals (one brand per portal, alerts after the fault); rule-only telematics (alerts on a code, no ranking of who fails next); Motorq Fuse (AI recommendations on OEM data, commercial). FleetPulse combines device-free multi-OEM ingestion, sub-5-second alerts and an explainable 7-day forecast in one view.</w:t>
+        <w:t xml:space="preserve">Existing alternatives: aftermarket OBD dongles (hardware cost and install, one data format); OEM portals (one brand per portal, alerts after the fault); rule-only telematics (alerts on a code, no ranking of who fails next); </w:t>
+      </w:r>
+      <w:proofErr w:type="spellStart"/>
+      <w:r>
+        <w:t>Motorq</w:t>
+      </w:r>
+      <w:proofErr w:type="spellEnd"/>
+      <w:r>
+        <w:t xml:space="preserve"> Fuse (AI recommendations on OEM data, commercial). </w:t>
+      </w:r>
+      <w:proofErr w:type="spellStart"/>
+      <w:r>
+        <w:t>FleetPulse</w:t>
+      </w:r>
+      <w:proofErr w:type="spellEnd"/>
+      <w:r>
+        <w:t xml:space="preserve"> combines device-free multi-OEM ingestion, sub-5-second alerts and an explainable 7-day forecast in one view.</w:t>
       </w:r>
     </w:p>
     <w:p>
@@ -2491,8 +2729,21 @@
       <w:pPr>
         <w:spacing w:before="60" w:after="200" w:line="300" w:lineRule="auto"/>
       </w:pPr>
-      <w:r>
-        <w:t>FleetPulse is a web dashboard backed by a streaming pipeline. Vehicles (here, the simulator) stream telemetry; FleetPulse normalises every OEM format into one event, detects faults in real time, scores every vehicle's 7-day breakdown risk each minute, and lets a fleet manager act from one screen.</w:t>
+      <w:proofErr w:type="spellStart"/>
+      <w:r>
+        <w:t>FleetPulse</w:t>
+      </w:r>
+      <w:proofErr w:type="spellEnd"/>
+      <w:r>
+        <w:t xml:space="preserve"> is a web dashboard backed by a streaming pipeline. Vehicles (here, the simulator) stream telemetry; </w:t>
+      </w:r>
+      <w:proofErr w:type="spellStart"/>
+      <w:r>
+        <w:t>FleetPulse</w:t>
+      </w:r>
+      <w:proofErr w:type="spellEnd"/>
+      <w:r>
+        <w:t xml:space="preserve"> normalises every OEM format into one event, detects faults in real time, scores every vehicle's 7-day breakdown risk each minute, and lets a fleet manager act from one screen.</w:t>
       </w:r>
     </w:p>
     <w:p>
@@ -2501,10 +2752,7 @@
       </w:pPr>
       <w:r>
         <w:lastRenderedPageBreak/>
-        <w:t>User journey: (1) a Borealis van reports coolant at 119 °C and code P0217 in OEM-specific JSON; (2) the processor normalises it, validates the VIN check digit, drops duplicates and evaluates sliding-window rules; (3) an OVERHEAT_TREND / CRITICAL_DTC alert is written idempotently and pushed over WebSocket, appearing on the dashboard ~0.2 s after the vehicle timestamp; (4) the manager opens the vehicle: 73% 7-day risk, reasons “overdue for service, coolant running hot, 12 V battery voltage low”, the coolant t</w:t>
-      </w:r>
-      <w:r>
-        <w:t>rend and recent alerts; (5) they click Propose work order (or ask the copilot); (6) the work order appears as proposed and a manager approves it; every step is in the audit log.</w:t>
+        <w:t>User journey: (1) a Borealis van reports coolant at 119 °C and code P0217 in OEM-specific JSON; (2) the processor normalises it, validates the VIN check digit, drops duplicates and evaluates sliding-window rules; (3) an OVERHEAT_TREND / CRITICAL_DTC alert is written idempotently and pushed over WebSocket, appearing on the dashboard ~0.2 s after the vehicle timestamp; (4) the manager opens the vehicle: 73% 7-day risk, reasons “overdue for service, coolant running hot, 12 V battery voltage low”, the coolant trend and recent alerts; (5) they click Propose work order (or ask the copilot); (6) the work order appears as proposed and a manager approves it; every step is in the audit log.</w:t>
       </w:r>
     </w:p>
     <w:p>
@@ -2531,7 +2779,7 @@
                     <pic:cNvPicPr/>
                   </pic:nvPicPr>
                   <pic:blipFill>
-                    <a:blip r:embed="rId7"/>
+                    <a:blip r:embed="rId9"/>
                     <a:stretch>
                       <a:fillRect/>
                     </a:stretch>
@@ -2576,7 +2824,7 @@
                     <pic:cNvPicPr/>
                   </pic:nvPicPr>
                   <pic:blipFill>
-                    <a:blip r:embed="rId8"/>
+                    <a:blip r:embed="rId10"/>
                     <a:stretch>
                       <a:fillRect/>
                     </a:stretch>
@@ -2599,6 +2847,65 @@
     </w:p>
     <w:p>
       <w:pPr>
+        <w:spacing w:before="60" w:after="200" w:line="300" w:lineRule="auto"/>
+      </w:pPr>
+      <w:r>
+        <w:rPr>
+          <w:noProof/>
+        </w:rPr>
+        <w:lastRenderedPageBreak/>
+        <w:drawing>
+          <wp:inline distT="0" distB="0" distL="0" distR="0" wp14:anchorId="2B44052D" wp14:editId="1FB48510">
+            <wp:extent cx="5909310" cy="3322955"/>
+            <wp:effectExtent l="0" t="0" r="0" b="0"/>
+            <wp:docPr id="1102323153" name="Picture 1"/>
+            <wp:cNvGraphicFramePr>
+              <a:graphicFrameLocks xmlns:a="http://schemas.openxmlformats.org/drawingml/2006/main" noChangeAspect="1"/>
+            </wp:cNvGraphicFramePr>
+            <a:graphic xmlns:a="http://schemas.openxmlformats.org/drawingml/2006/main">
+              <a:graphicData uri="http://schemas.openxmlformats.org/drawingml/2006/picture">
+                <pic:pic xmlns:pic="http://schemas.openxmlformats.org/drawingml/2006/picture">
+                  <pic:nvPicPr>
+                    <pic:cNvPr id="0" name="Picture 1"/>
+                    <pic:cNvPicPr>
+                      <a:picLocks noChangeAspect="1" noChangeArrowheads="1"/>
+                    </pic:cNvPicPr>
+                  </pic:nvPicPr>
+                  <pic:blipFill>
+                    <a:blip r:embed="rId11" cstate="print">
+                      <a:extLst>
+                        <a:ext uri="{28A0092B-C50C-407E-A947-70E740481C1C}">
+                          <a14:useLocalDpi xmlns:a14="http://schemas.microsoft.com/office/drawing/2010/main" val="0"/>
+                        </a:ext>
+                      </a:extLst>
+                    </a:blip>
+                    <a:srcRect/>
+                    <a:stretch>
+                      <a:fillRect/>
+                    </a:stretch>
+                  </pic:blipFill>
+                  <pic:spPr bwMode="auto">
+                    <a:xfrm>
+                      <a:off x="0" y="0"/>
+                      <a:ext cx="5909310" cy="3322955"/>
+                    </a:xfrm>
+                    <a:prstGeom prst="rect">
+                      <a:avLst/>
+                    </a:prstGeom>
+                    <a:noFill/>
+                    <a:ln>
+                      <a:noFill/>
+                    </a:ln>
+                  </pic:spPr>
+                </pic:pic>
+              </a:graphicData>
+            </a:graphic>
+          </wp:inline>
+        </w:drawing>
+      </w:r>
+    </w:p>
+    <w:p>
+      <w:pPr>
         <w:pStyle w:val="Heading2"/>
       </w:pPr>
       <w:bookmarkStart w:id="7" w:name="s8"/>
@@ -2641,7 +2948,6 @@
           <w:b/>
           <w:bCs/>
         </w:rPr>
-        <w:lastRenderedPageBreak/>
         <w:t xml:space="preserve">Pain Relieved: </w:t>
       </w:r>
       <w:r>
@@ -2825,7 +3131,35 @@
         <w:t xml:space="preserve">1. Effectively-once without distributed transactions. </w:t>
       </w:r>
       <w:r>
-        <w:t>At-least-once Kafka consumption with offsets committed only after the database transaction, plus idempotent sinks (unique (vin, seq, ts) on telemetry, a deterministic dedup_key per vehicle/rule/code/hour on alerts) and a Bloom filter fast path. Evidence: 1% duplicate and 2% out-of-order events are injected continuously; killing both processors and restarting the broker produced no duplicate alerts and the backlog drained at ~9K events/s.</w:t>
+        <w:t xml:space="preserve">At-least-once Kafka consumption with offsets committed only after the database transaction, plus idempotent sinks (unique (vin, </w:t>
+      </w:r>
+      <w:proofErr w:type="spellStart"/>
+      <w:r>
+        <w:t>seq</w:t>
+      </w:r>
+      <w:proofErr w:type="spellEnd"/>
+      <w:r>
+        <w:t xml:space="preserve">, </w:t>
+      </w:r>
+      <w:proofErr w:type="spellStart"/>
+      <w:r>
+        <w:t>ts</w:t>
+      </w:r>
+      <w:proofErr w:type="spellEnd"/>
+      <w:r>
+        <w:t xml:space="preserve">) on telemetry, a deterministic </w:t>
+      </w:r>
+      <w:proofErr w:type="spellStart"/>
+      <w:r>
+        <w:t>dedup_key</w:t>
+      </w:r>
+      <w:proofErr w:type="spellEnd"/>
+      <w:r>
+        <w:t xml:space="preserve"> per vehicle/rule/code/hour on alerts) and a Bloom filter fast path. </w:t>
+      </w:r>
+      <w:r>
+        <w:lastRenderedPageBreak/>
+        <w:t>Evidence: 1% duplicate and 2% out-of-order events are injected continuously; killing both processors and restarting the broker produced no duplicate alerts and the backlog drained at ~9K events/s.</w:t>
       </w:r>
     </w:p>
     <w:p>
@@ -2876,7 +3210,25 @@
           <w:sz w:val="20"/>
           <w:szCs w:val="20"/>
         </w:rPr>
-        <w:t>Every feature must be traceable to code. Priority uses MoSCoW (Must / Should / Could / Won’t). Status: Done / Partial / Planned. Give the demo video timestamp for Done features.</w:t>
+        <w:t xml:space="preserve">Every feature must be traceable to code. Priority uses </w:t>
+      </w:r>
+      <w:proofErr w:type="spellStart"/>
+      <w:r>
+        <w:rPr>
+          <w:color w:val="595959"/>
+          <w:sz w:val="20"/>
+          <w:szCs w:val="20"/>
+        </w:rPr>
+        <w:t>MoSCoW</w:t>
+      </w:r>
+      <w:proofErr w:type="spellEnd"/>
+      <w:r>
+        <w:rPr>
+          <w:color w:val="595959"/>
+          <w:sz w:val="20"/>
+          <w:szCs w:val="20"/>
+        </w:rPr>
+        <w:t xml:space="preserve"> (Must / Should / Could / Won’t). Status: Done / Partial / Planned. Give the demo video timestamp for Done features.</w:t>
       </w:r>
     </w:p>
     <w:tbl>
@@ -3338,7 +3690,15 @@
               <w:spacing w:line="260" w:lineRule="auto"/>
             </w:pPr>
             <w:r>
-              <w:t>[mm:ss]</w:t>
+              <w:t>[</w:t>
+            </w:r>
+            <w:proofErr w:type="spellStart"/>
+            <w:r>
+              <w:t>mm:ss</w:t>
+            </w:r>
+            <w:proofErr w:type="spellEnd"/>
+            <w:r>
+              <w:t>]</w:t>
             </w:r>
           </w:p>
         </w:tc>
@@ -3504,8 +3864,13 @@
               <w:keepLines/>
               <w:spacing w:line="260" w:lineRule="auto"/>
             </w:pPr>
-            <w:r>
-              <w:t>fleetpulse/simulator/</w:t>
+            <w:proofErr w:type="spellStart"/>
+            <w:r>
+              <w:t>fleetpulse</w:t>
+            </w:r>
+            <w:proofErr w:type="spellEnd"/>
+            <w:r>
+              <w:t>/simulator/</w:t>
             </w:r>
           </w:p>
         </w:tc>
@@ -3532,7 +3897,15 @@
               <w:spacing w:line="260" w:lineRule="auto"/>
             </w:pPr>
             <w:r>
-              <w:t>[mm:ss]</w:t>
+              <w:t>[</w:t>
+            </w:r>
+            <w:proofErr w:type="spellStart"/>
+            <w:r>
+              <w:t>mm:ss</w:t>
+            </w:r>
+            <w:proofErr w:type="spellEnd"/>
+            <w:r>
+              <w:t>]</w:t>
             </w:r>
           </w:p>
         </w:tc>
@@ -3698,8 +4071,13 @@
               <w:keepLines/>
               <w:spacing w:line="260" w:lineRule="auto"/>
             </w:pPr>
-            <w:r>
-              <w:t>fleetpulse/processor/</w:t>
+            <w:proofErr w:type="spellStart"/>
+            <w:r>
+              <w:t>fleetpulse</w:t>
+            </w:r>
+            <w:proofErr w:type="spellEnd"/>
+            <w:r>
+              <w:t>/processor/</w:t>
             </w:r>
           </w:p>
         </w:tc>
@@ -3726,7 +4104,15 @@
               <w:spacing w:line="260" w:lineRule="auto"/>
             </w:pPr>
             <w:r>
-              <w:t>[mm:ss]</w:t>
+              <w:t>[</w:t>
+            </w:r>
+            <w:proofErr w:type="spellStart"/>
+            <w:r>
+              <w:t>mm:ss</w:t>
+            </w:r>
+            <w:proofErr w:type="spellEnd"/>
+            <w:r>
+              <w:t>]</w:t>
             </w:r>
           </w:p>
         </w:tc>
@@ -3892,8 +4278,13 @@
               <w:keepLines/>
               <w:spacing w:line="260" w:lineRule="auto"/>
             </w:pPr>
-            <w:r>
-              <w:t>fleetpulse/ml/</w:t>
+            <w:proofErr w:type="spellStart"/>
+            <w:r>
+              <w:t>fleetpulse</w:t>
+            </w:r>
+            <w:proofErr w:type="spellEnd"/>
+            <w:r>
+              <w:t>/ml/</w:t>
             </w:r>
           </w:p>
         </w:tc>
@@ -3920,7 +4311,15 @@
               <w:spacing w:line="260" w:lineRule="auto"/>
             </w:pPr>
             <w:r>
-              <w:t>[mm:ss]</w:t>
+              <w:t>[</w:t>
+            </w:r>
+            <w:proofErr w:type="spellStart"/>
+            <w:r>
+              <w:t>mm:ss</w:t>
+            </w:r>
+            <w:proofErr w:type="spellEnd"/>
+            <w:r>
+              <w:t>]</w:t>
             </w:r>
           </w:p>
         </w:tc>
@@ -4087,7 +4486,15 @@
               <w:spacing w:line="260" w:lineRule="auto"/>
             </w:pPr>
             <w:r>
-              <w:t>web/index.html, /api/v1/live</w:t>
+              <w:t>web/index.html, /</w:t>
+            </w:r>
+            <w:proofErr w:type="spellStart"/>
+            <w:r>
+              <w:t>api</w:t>
+            </w:r>
+            <w:proofErr w:type="spellEnd"/>
+            <w:r>
+              <w:t>/v1/live</w:t>
             </w:r>
           </w:p>
         </w:tc>
@@ -4114,7 +4521,15 @@
               <w:spacing w:line="260" w:lineRule="auto"/>
             </w:pPr>
             <w:r>
-              <w:t>[mm:ss]</w:t>
+              <w:t>[</w:t>
+            </w:r>
+            <w:proofErr w:type="spellStart"/>
+            <w:r>
+              <w:t>mm:ss</w:t>
+            </w:r>
+            <w:proofErr w:type="spellEnd"/>
+            <w:r>
+              <w:t>]</w:t>
             </w:r>
           </w:p>
         </w:tc>
@@ -4281,8 +4696,13 @@
               <w:keepLines/>
               <w:spacing w:line="260" w:lineRule="auto"/>
             </w:pPr>
-            <w:r>
-              <w:t>fleetpulse/agent/</w:t>
+            <w:proofErr w:type="spellStart"/>
+            <w:r>
+              <w:t>fleetpulse</w:t>
+            </w:r>
+            <w:proofErr w:type="spellEnd"/>
+            <w:r>
+              <w:t>/agent/</w:t>
             </w:r>
           </w:p>
         </w:tc>
@@ -4309,7 +4729,15 @@
               <w:spacing w:line="260" w:lineRule="auto"/>
             </w:pPr>
             <w:r>
-              <w:t>[mm:ss]</w:t>
+              <w:t>[</w:t>
+            </w:r>
+            <w:proofErr w:type="spellStart"/>
+            <w:r>
+              <w:t>mm:ss</w:t>
+            </w:r>
+            <w:proofErr w:type="spellEnd"/>
+            <w:r>
+              <w:t>]</w:t>
             </w:r>
           </w:p>
         </w:tc>
@@ -4475,8 +4903,21 @@
               <w:keepLines/>
               <w:spacing w:line="260" w:lineRule="auto"/>
             </w:pPr>
-            <w:r>
-              <w:t>fleetpulse/api/, core/security.py</w:t>
+            <w:proofErr w:type="spellStart"/>
+            <w:r>
+              <w:t>fleetpulse</w:t>
+            </w:r>
+            <w:proofErr w:type="spellEnd"/>
+            <w:r>
+              <w:t>/</w:t>
+            </w:r>
+            <w:proofErr w:type="spellStart"/>
+            <w:r>
+              <w:t>api</w:t>
+            </w:r>
+            <w:proofErr w:type="spellEnd"/>
+            <w:r>
+              <w:t>/, core/security.py</w:t>
             </w:r>
           </w:p>
         </w:tc>
@@ -4503,7 +4944,15 @@
               <w:spacing w:line="260" w:lineRule="auto"/>
             </w:pPr>
             <w:r>
-              <w:t>[mm:ss]</w:t>
+              <w:t>[</w:t>
+            </w:r>
+            <w:proofErr w:type="spellStart"/>
+            <w:r>
+              <w:t>mm:ss</w:t>
+            </w:r>
+            <w:proofErr w:type="spellEnd"/>
+            <w:r>
+              <w:t>]</w:t>
             </w:r>
           </w:p>
         </w:tc>
@@ -4669,8 +5118,13 @@
               <w:keepLines/>
               <w:spacing w:line="260" w:lineRule="auto"/>
             </w:pPr>
-            <w:r>
-              <w:t>db/001_schema.sql, DELETE /drivers</w:t>
+            <w:proofErr w:type="spellStart"/>
+            <w:r>
+              <w:t>db</w:t>
+            </w:r>
+            <w:proofErr w:type="spellEnd"/>
+            <w:r>
+              <w:t>/001_schema.sql, DELETE /drivers</w:t>
             </w:r>
           </w:p>
         </w:tc>
@@ -4697,7 +5151,15 @@
               <w:spacing w:line="260" w:lineRule="auto"/>
             </w:pPr>
             <w:r>
-              <w:t>[mm:ss]</w:t>
+              <w:t>[</w:t>
+            </w:r>
+            <w:proofErr w:type="spellStart"/>
+            <w:r>
+              <w:t>mm:ss</w:t>
+            </w:r>
+            <w:proofErr w:type="spellEnd"/>
+            <w:r>
+              <w:t>]</w:t>
             </w:r>
           </w:p>
         </w:tc>
@@ -4863,9 +5325,11 @@
               <w:keepLines/>
               <w:spacing w:line="260" w:lineRule="auto"/>
             </w:pPr>
+            <w:proofErr w:type="spellStart"/>
             <w:r>
               <w:t>copilot.estimate_savings</w:t>
             </w:r>
+            <w:proofErr w:type="spellEnd"/>
           </w:p>
         </w:tc>
         <w:tc>
@@ -4891,7 +5355,15 @@
               <w:spacing w:line="260" w:lineRule="auto"/>
             </w:pPr>
             <w:r>
-              <w:t>[mm:ss]</w:t>
+              <w:t>[</w:t>
+            </w:r>
+            <w:proofErr w:type="spellStart"/>
+            <w:r>
+              <w:t>mm:ss</w:t>
+            </w:r>
+            <w:proofErr w:type="spellEnd"/>
+            <w:r>
+              <w:t>]</w:t>
             </w:r>
           </w:p>
         </w:tc>
@@ -4950,8 +5422,13 @@
               <w:spacing w:line="260" w:lineRule="auto"/>
             </w:pPr>
             <w:r>
-              <w:t>OIDC SSO and device mTLS</w:t>
-            </w:r>
+              <w:t xml:space="preserve">OIDC SSO and device </w:t>
+            </w:r>
+            <w:proofErr w:type="spellStart"/>
+            <w:r>
+              <w:t>mTLS</w:t>
+            </w:r>
+            <w:proofErr w:type="spellEnd"/>
           </w:p>
         </w:tc>
         <w:tc>
@@ -5143,8 +5620,13 @@
               <w:keepLines/>
               <w:spacing w:line="260" w:lineRule="auto"/>
             </w:pPr>
-            <w:r>
-              <w:t>ClickHouse/Parquet cold tier</w:t>
+            <w:proofErr w:type="spellStart"/>
+            <w:r>
+              <w:t>ClickHouse</w:t>
+            </w:r>
+            <w:proofErr w:type="spellEnd"/>
+            <w:r>
+              <w:t>/Parquet cold tier</w:t>
             </w:r>
           </w:p>
         </w:tc>
@@ -5348,7 +5830,15 @@
         <w:t xml:space="preserve">Container Diagram: </w:t>
       </w:r>
       <w:r>
-        <w:t>C4 level 2 — every service, data store and broker, with the protocol on each arrow (MQTT, HTTPS, gRPC, Kafka)</w:t>
+        <w:t xml:space="preserve">C4 level 2 — every service, data store and broker, with the protocol on each arrow (MQTT, HTTPS, </w:t>
+      </w:r>
+      <w:proofErr w:type="spellStart"/>
+      <w:r>
+        <w:t>gRPC</w:t>
+      </w:r>
+      <w:proofErr w:type="spellEnd"/>
+      <w:r>
+        <w:t>, Kafka)</w:t>
       </w:r>
     </w:p>
     <w:p>
@@ -5382,7 +5872,23 @@
         <w:t xml:space="preserve">System context (C4 L1): </w:t>
       </w:r>
       <w:r>
-        <w:t>users (fleet manager, analyst, admin) use the FleetPulse web app; FleetPulse ingests from OEM clouds/vehicles (simulated), optionally calls an LLM API (Anthropic) for copilot planning, and would authenticate through an OIDC provider in production.</w:t>
+        <w:t xml:space="preserve">users (fleet manager, analyst, admin) use the </w:t>
+      </w:r>
+      <w:proofErr w:type="spellStart"/>
+      <w:r>
+        <w:t>FleetPulse</w:t>
+      </w:r>
+      <w:proofErr w:type="spellEnd"/>
+      <w:r>
+        <w:t xml:space="preserve"> web app; </w:t>
+      </w:r>
+      <w:proofErr w:type="spellStart"/>
+      <w:r>
+        <w:t>FleetPulse</w:t>
+      </w:r>
+      <w:proofErr w:type="spellEnd"/>
+      <w:r>
+        <w:t xml:space="preserve"> ingests from OEM clouds/vehicles (simulated), optionally calls an LLM API (Anthropic) for copilot planning, and would authenticate through an OIDC provider in production.</w:t>
       </w:r>
     </w:p>
     <w:p>
@@ -5396,7 +5902,31 @@
         <w:t xml:space="preserve">Container view (C4 L2) and data flow: </w:t>
       </w:r>
       <w:r>
-        <w:t>see diagram. One telemetry event: vehicle → Kafka (~20 ms producer linger) → processor batch (0.1–0.2 s; alerts are written and pushed before the bulk telemetry upsert) → Redis pub/sub → WebSocket (&lt; 50 ms) → screen. Measured p50 0.17 s, p95 2.6 s vehicle timestamp to screen across a 3x burst.</w:t>
+        <w:t xml:space="preserve">see diagram. One telemetry event: vehicle → Kafka (~20 </w:t>
+      </w:r>
+      <w:proofErr w:type="spellStart"/>
+      <w:r>
+        <w:t>ms</w:t>
+      </w:r>
+      <w:proofErr w:type="spellEnd"/>
+      <w:r>
+        <w:t xml:space="preserve"> producer linger) → processor batch (0.1–0.2 s; alerts are written and pushed before the bulk telemetry </w:t>
+      </w:r>
+      <w:proofErr w:type="spellStart"/>
+      <w:r>
+        <w:t>upsert</w:t>
+      </w:r>
+      <w:proofErr w:type="spellEnd"/>
+      <w:r>
+        <w:t xml:space="preserve">) → Redis pub/sub → WebSocket (&lt; 50 </w:t>
+      </w:r>
+      <w:proofErr w:type="spellStart"/>
+      <w:r>
+        <w:t>ms</w:t>
+      </w:r>
+      <w:proofErr w:type="spellEnd"/>
+      <w:r>
+        <w:t>) → screen. Measured p50 0.17 s, p95 2.6 s vehicle timestamp to screen across a 3x burst.</w:t>
       </w:r>
     </w:p>
     <w:p>
@@ -5423,7 +5953,7 @@
                     <pic:cNvPicPr/>
                   </pic:nvPicPr>
                   <pic:blipFill>
-                    <a:blip r:embed="rId9"/>
+                    <a:blip r:embed="rId12"/>
                     <a:stretch>
                       <a:fillRect/>
                     </a:stretch>
@@ -5638,7 +6168,15 @@
               <w:spacing w:line="260" w:lineRule="auto"/>
             </w:pPr>
             <w:r>
-              <w:t>Kafka protocol (Redpanda locally, MSK/Confluent in cloud), key = VIN</w:t>
+              <w:t>Kafka protocol (</w:t>
+            </w:r>
+            <w:proofErr w:type="spellStart"/>
+            <w:r>
+              <w:t>Redpanda</w:t>
+            </w:r>
+            <w:proofErr w:type="spellEnd"/>
+            <w:r>
+              <w:t xml:space="preserve"> locally, MSK/Confluent in cloud), key = VIN</w:t>
             </w:r>
           </w:p>
         </w:tc>
@@ -5724,7 +6262,15 @@
               <w:spacing w:line="260" w:lineRule="auto"/>
             </w:pPr>
             <w:r>
-              <w:t>Python consumer with batch upserts; batch scorer + incremental rollup</w:t>
+              <w:t xml:space="preserve">Python consumer with batch </w:t>
+            </w:r>
+            <w:proofErr w:type="spellStart"/>
+            <w:r>
+              <w:t>upserts</w:t>
+            </w:r>
+            <w:proofErr w:type="spellEnd"/>
+            <w:r>
+              <w:t>; batch scorer + incremental rollup</w:t>
             </w:r>
           </w:p>
         </w:tc>
@@ -5751,7 +6297,15 @@
               <w:spacing w:line="260" w:lineRule="auto"/>
             </w:pPr>
             <w:r>
-              <w:t>Simple, testable and measured at 34K ev/s/core; Flink/Spark rejected as too heavy for the time box (next step at scale)</w:t>
+              <w:t xml:space="preserve">Simple, testable and measured at 34K </w:t>
+            </w:r>
+            <w:proofErr w:type="spellStart"/>
+            <w:r>
+              <w:t>ev</w:t>
+            </w:r>
+            <w:proofErr w:type="spellEnd"/>
+            <w:r>
+              <w:t>/s/core; Flink/Spark rejected as too heavy for the time box (next step at scale)</w:t>
             </w:r>
           </w:p>
         </w:tc>
@@ -5810,7 +6364,15 @@
               <w:spacing w:line="260" w:lineRule="auto"/>
             </w:pPr>
             <w:r>
-              <w:t>PostgreSQL 16 (3NF + partitions) · Redis 7 · pgvector HNSW</w:t>
+              <w:t xml:space="preserve">PostgreSQL 16 (3NF + partitions) · Redis 7 · </w:t>
+            </w:r>
+            <w:proofErr w:type="spellStart"/>
+            <w:r>
+              <w:t>pgvector</w:t>
+            </w:r>
+            <w:proofErr w:type="spellEnd"/>
+            <w:r>
+              <w:t xml:space="preserve"> HNSW</w:t>
             </w:r>
           </w:p>
         </w:tc>
@@ -5837,7 +6399,31 @@
               <w:spacing w:line="260" w:lineRule="auto"/>
             </w:pPr>
             <w:r>
-              <w:t>ACID core and analytics in one engine; Redis for sub-ms live state/geo; pgvector avoids another system. ClickHouse/Scylla deferred (ADR-0002)</w:t>
+              <w:t>ACID core and analytics in one engine; Redis for sub-</w:t>
+            </w:r>
+            <w:proofErr w:type="spellStart"/>
+            <w:r>
+              <w:t>ms</w:t>
+            </w:r>
+            <w:proofErr w:type="spellEnd"/>
+            <w:r>
+              <w:t xml:space="preserve"> live state/geo; </w:t>
+            </w:r>
+            <w:proofErr w:type="spellStart"/>
+            <w:r>
+              <w:t>pgvector</w:t>
+            </w:r>
+            <w:proofErr w:type="spellEnd"/>
+            <w:r>
+              <w:t xml:space="preserve"> avoids another system. </w:t>
+            </w:r>
+            <w:proofErr w:type="spellStart"/>
+            <w:r>
+              <w:t>ClickHouse</w:t>
+            </w:r>
+            <w:proofErr w:type="spellEnd"/>
+            <w:r>
+              <w:t>/Scylla deferred (ADR-0002)</w:t>
             </w:r>
           </w:p>
         </w:tc>
@@ -5895,8 +6481,21 @@
               <w:keepLines/>
               <w:spacing w:line="260" w:lineRule="auto"/>
             </w:pPr>
-            <w:r>
-              <w:t>FastAPI (async, OpenAPI) · single-page HTML/JS + Leaflet</w:t>
+            <w:proofErr w:type="spellStart"/>
+            <w:r>
+              <w:t>FastAPI</w:t>
+            </w:r>
+            <w:proofErr w:type="spellEnd"/>
+            <w:r>
+              <w:t xml:space="preserve"> (async, </w:t>
+            </w:r>
+            <w:proofErr w:type="spellStart"/>
+            <w:r>
+              <w:t>OpenAPI</w:t>
+            </w:r>
+            <w:proofErr w:type="spellEnd"/>
+            <w:r>
+              <w:t>) · single-page HTML/JS + Leaflet</w:t>
             </w:r>
           </w:p>
         </w:tc>
@@ -5982,7 +6581,15 @@
               <w:spacing w:line="260" w:lineRule="auto"/>
             </w:pPr>
             <w:r>
-              <w:t>scikit-learn HistGradientBoosting · Claude tool-use (optional)</w:t>
+              <w:t xml:space="preserve">scikit-learn </w:t>
+            </w:r>
+            <w:proofErr w:type="spellStart"/>
+            <w:r>
+              <w:t>HistGradientBoosting</w:t>
+            </w:r>
+            <w:proofErr w:type="spellEnd"/>
+            <w:r>
+              <w:t xml:space="preserve"> · Claude tool-use (optional)</w:t>
             </w:r>
           </w:p>
         </w:tc>
@@ -6133,7 +6740,15 @@
         <w:t xml:space="preserve">ER Diagram: </w:t>
       </w:r>
       <w:r>
-        <w:t>Relational core normalised to 3NF; list any deliberate denormalisation and why</w:t>
+        <w:t xml:space="preserve">Relational core normalised to 3NF; list any deliberate </w:t>
+      </w:r>
+      <w:proofErr w:type="spellStart"/>
+      <w:r>
+        <w:t>denormalisation</w:t>
+      </w:r>
+      <w:proofErr w:type="spellEnd"/>
+      <w:r>
+        <w:t xml:space="preserve"> and why</w:t>
       </w:r>
     </w:p>
     <w:p>
@@ -6288,33 +6903,9 @@
                 <w:sz w:val="20"/>
                 <w:szCs w:val="20"/>
               </w:rPr>
-              <w:t>Before (ms)</w:t>
-            </w:r>
-          </w:p>
-        </w:tc>
-        <w:tc>
-          <w:tcPr>
-            <w:tcW w:w="1210" w:type="dxa"/>
-            <w:tcBorders>
-              <w:top w:val="single" w:sz="4" w:space="0" w:color="BFBFBF"/>
-              <w:left w:val="single" w:sz="4" w:space="0" w:color="BFBFBF"/>
-              <w:bottom w:val="single" w:sz="4" w:space="0" w:color="BFBFBF"/>
-              <w:right w:val="single" w:sz="4" w:space="0" w:color="BFBFBF"/>
-            </w:tcBorders>
-            <w:shd w:val="clear" w:color="auto" w:fill="F2F2F2"/>
-            <w:tcMar>
-              <w:top w:w="80" w:type="dxa"/>
-              <w:left w:w="110" w:type="dxa"/>
-              <w:bottom w:w="80" w:type="dxa"/>
-              <w:right w:w="110" w:type="dxa"/>
-            </w:tcMar>
-          </w:tcPr>
-          <w:p>
-            <w:pPr>
-              <w:keepNext/>
-              <w:keepLines/>
-              <w:spacing w:line="260" w:lineRule="auto"/>
-            </w:pPr>
+              <w:t>Before (</w:t>
+            </w:r>
+            <w:proofErr w:type="spellStart"/>
             <w:r>
               <w:rPr>
                 <w:b/>
@@ -6322,7 +6913,71 @@
                 <w:sz w:val="20"/>
                 <w:szCs w:val="20"/>
               </w:rPr>
-              <w:t>After (ms)</w:t>
+              <w:t>ms</w:t>
+            </w:r>
+            <w:proofErr w:type="spellEnd"/>
+            <w:r>
+              <w:rPr>
+                <w:b/>
+                <w:bCs/>
+                <w:sz w:val="20"/>
+                <w:szCs w:val="20"/>
+              </w:rPr>
+              <w:t>)</w:t>
+            </w:r>
+          </w:p>
+        </w:tc>
+        <w:tc>
+          <w:tcPr>
+            <w:tcW w:w="1210" w:type="dxa"/>
+            <w:tcBorders>
+              <w:top w:val="single" w:sz="4" w:space="0" w:color="BFBFBF"/>
+              <w:left w:val="single" w:sz="4" w:space="0" w:color="BFBFBF"/>
+              <w:bottom w:val="single" w:sz="4" w:space="0" w:color="BFBFBF"/>
+              <w:right w:val="single" w:sz="4" w:space="0" w:color="BFBFBF"/>
+            </w:tcBorders>
+            <w:shd w:val="clear" w:color="auto" w:fill="F2F2F2"/>
+            <w:tcMar>
+              <w:top w:w="80" w:type="dxa"/>
+              <w:left w:w="110" w:type="dxa"/>
+              <w:bottom w:w="80" w:type="dxa"/>
+              <w:right w:w="110" w:type="dxa"/>
+            </w:tcMar>
+          </w:tcPr>
+          <w:p>
+            <w:pPr>
+              <w:keepNext/>
+              <w:keepLines/>
+              <w:spacing w:line="260" w:lineRule="auto"/>
+            </w:pPr>
+            <w:r>
+              <w:rPr>
+                <w:b/>
+                <w:bCs/>
+                <w:sz w:val="20"/>
+                <w:szCs w:val="20"/>
+              </w:rPr>
+              <w:t>After (</w:t>
+            </w:r>
+            <w:proofErr w:type="spellStart"/>
+            <w:r>
+              <w:rPr>
+                <w:b/>
+                <w:bCs/>
+                <w:sz w:val="20"/>
+                <w:szCs w:val="20"/>
+              </w:rPr>
+              <w:t>ms</w:t>
+            </w:r>
+            <w:proofErr w:type="spellEnd"/>
+            <w:r>
+              <w:rPr>
+                <w:b/>
+                <w:bCs/>
+                <w:sz w:val="20"/>
+                <w:szCs w:val="20"/>
+              </w:rPr>
+              <w:t>)</w:t>
             </w:r>
           </w:p>
         </w:tc>
@@ -6469,8 +7124,21 @@
               <w:spacing w:line="260" w:lineRule="auto"/>
             </w:pPr>
             <w:r>
-              <w:t>Composite index (vin, ts DESC) per daily partition + partition pruning on ts</w:t>
-            </w:r>
+              <w:t xml:space="preserve">Composite index (vin, </w:t>
+            </w:r>
+            <w:proofErr w:type="spellStart"/>
+            <w:r>
+              <w:t>ts</w:t>
+            </w:r>
+            <w:proofErr w:type="spellEnd"/>
+            <w:r>
+              <w:t xml:space="preserve"> DESC) per daily partition + partition pruning on </w:t>
+            </w:r>
+            <w:proofErr w:type="spellStart"/>
+            <w:r>
+              <w:t>ts</w:t>
+            </w:r>
+            <w:proofErr w:type="spellEnd"/>
           </w:p>
         </w:tc>
       </w:tr>
@@ -6582,7 +7250,15 @@
               <w:spacing w:line="260" w:lineRule="auto"/>
             </w:pPr>
             <w:r>
-              <w:t>Index (tenant_id, score DESC) → index scan with LIMIT, no sort</w:t>
+              <w:t>Index (</w:t>
+            </w:r>
+            <w:proofErr w:type="spellStart"/>
+            <w:r>
+              <w:t>tenant_id</w:t>
+            </w:r>
+            <w:proofErr w:type="spellEnd"/>
+            <w:r>
+              <w:t>, score DESC) → index scan with LIMIT, no sort</w:t>
             </w:r>
           </w:p>
         </w:tc>
@@ -6695,7 +7371,23 @@
               <w:spacing w:line="260" w:lineRule="auto"/>
             </w:pPr>
             <w:r>
-              <w:t>Partial index WHERE acked_at IS NULL + keyset on alert_id instead of OFFSET</w:t>
+              <w:t xml:space="preserve">Partial index WHERE </w:t>
+            </w:r>
+            <w:proofErr w:type="spellStart"/>
+            <w:r>
+              <w:t>acked_at</w:t>
+            </w:r>
+            <w:proofErr w:type="spellEnd"/>
+            <w:r>
+              <w:t xml:space="preserve"> IS NULL + keyset on </w:t>
+            </w:r>
+            <w:proofErr w:type="spellStart"/>
+            <w:r>
+              <w:t>alert_id</w:t>
+            </w:r>
+            <w:proofErr w:type="spellEnd"/>
+            <w:r>
+              <w:t xml:space="preserve"> instead of OFFSET</w:t>
             </w:r>
           </w:p>
         </w:tc>
@@ -6722,7 +7414,7 @@
                     <pic:cNvPicPr/>
                   </pic:nvPicPr>
                   <pic:blipFill>
-                    <a:blip r:embed="rId10"/>
+                    <a:blip r:embed="rId13"/>
                     <a:stretch>
                       <a:fillRect/>
                     </a:stretch>
@@ -6751,7 +7443,23 @@
         <w:t xml:space="preserve">Polyglot map: </w:t>
       </w:r>
       <w:r>
-        <w:t>Postgres 3NF core: tenants, users, subscriptions, fleets, vehicles, drivers, alerts, work orders, risk scores, audit (CP). Postgres partitioned telemetry and vehicle_daily rollup (writes buffered by Kafka, AP end to end). Redis: live state, GEO index, rate limits, pub/sub, cache (AP). pgvector: fault knowledge embeddings (CP).</w:t>
+        <w:t xml:space="preserve">Postgres 3NF core: tenants, users, subscriptions, fleets, vehicles, drivers, alerts, work orders, risk scores, audit (CP). Postgres partitioned telemetry and </w:t>
+      </w:r>
+      <w:proofErr w:type="spellStart"/>
+      <w:r>
+        <w:t>vehicle_daily</w:t>
+      </w:r>
+      <w:proofErr w:type="spellEnd"/>
+      <w:r>
+        <w:t xml:space="preserve"> rollup (writes buffered by Kafka, AP end to end). Redis: live state, GEO index, rate limits, pub/sub, cache (AP). </w:t>
+      </w:r>
+      <w:proofErr w:type="spellStart"/>
+      <w:r>
+        <w:t>pgvector</w:t>
+      </w:r>
+      <w:proofErr w:type="spellEnd"/>
+      <w:r>
+        <w:t>: fault knowledge embeddings (CP).</w:t>
       </w:r>
     </w:p>
     <w:p>
@@ -6762,21 +7470,71 @@
         <w:t xml:space="preserve">Capacity: </w:t>
       </w:r>
       <w:r>
-        <w:t>100K vehicles × 1 event/s = 100K events/s, ~0.5 KB JSON (~120 B per stored row) → 8.6 TB/day raw JSON, ~1 TB/day as rows; ~0.3 TB/day compressed in a columnar cold tier. Kafka partition key VIN (uniform hash, no hot spots); telemetry partitioned by hour with (vin, ts) indexes. Hot: Redis latest state (minutes) and raw Postgres partitions (2 h locally, configurable). Warm: Postgres/ClickHouse 90 days (~25 TB compressed at full scale). Cold: Parquet on S3 7 years (~US$0.023/GB-month → ~US$2.5K/month per PB-ye</w:t>
-      </w:r>
-      <w:r>
-        <w:t>ar).</w:t>
-      </w:r>
-    </w:p>
-    <w:p>
+        <w:t xml:space="preserve">100K vehicles × 1 event/s = 100K events/s, ~0.5 KB JSON (~120 B per stored row) → 8.6 TB/day raw JSON, ~1 TB/day as rows; ~0.3 TB/day compressed in a columnar cold tier. Kafka partition key VIN (uniform hash, no hot spots); telemetry partitioned by hour with (vin, </w:t>
+      </w:r>
+      <w:proofErr w:type="spellStart"/>
+      <w:r>
+        <w:t>ts</w:t>
+      </w:r>
+      <w:proofErr w:type="spellEnd"/>
+      <w:r>
+        <w:t>) indexes. Hot: Redis latest state (minutes) and raw Postgres partitions (2 h locally, configurable). Warm: Postgres/</w:t>
+      </w:r>
+      <w:proofErr w:type="spellStart"/>
+      <w:r>
+        <w:t>ClickHouse</w:t>
+      </w:r>
+      <w:proofErr w:type="spellEnd"/>
+      <w:r>
+        <w:t xml:space="preserve"> 90 days (~25 TB compressed at full scale). Cold: Parquet on S3 7 years (~US$0.023/GB-month → ~US$2.5K/month per PB-year).</w:t>
+      </w:r>
+    </w:p>
+    <w:p>
+      <w:proofErr w:type="spellStart"/>
       <w:r>
         <w:rPr>
           <w:b/>
         </w:rPr>
-        <w:t xml:space="preserve">Denormalisation: </w:t>
-      </w:r>
-      <w:r>
-        <w:t>alert.tenant_id and risk_score.tenant_id duplicate fleet.tenant_id to serve the hottest tenant-filtered queries from one index; consistency is guaranteed because both are written from the same vehicle→fleet lookup.</w:t>
+        <w:t>Denormalisation</w:t>
+      </w:r>
+      <w:proofErr w:type="spellEnd"/>
+      <w:r>
+        <w:rPr>
+          <w:b/>
+        </w:rPr>
+        <w:t xml:space="preserve">: </w:t>
+      </w:r>
+      <w:proofErr w:type="spellStart"/>
+      <w:r>
+        <w:t>alert.tenant_id</w:t>
+      </w:r>
+      <w:proofErr w:type="spellEnd"/>
+      <w:r>
+        <w:t xml:space="preserve"> and </w:t>
+      </w:r>
+      <w:proofErr w:type="spellStart"/>
+      <w:r>
+        <w:t>risk_score.tenant_id</w:t>
+      </w:r>
+      <w:proofErr w:type="spellEnd"/>
+      <w:r>
+        <w:t xml:space="preserve"> duplicate </w:t>
+      </w:r>
+      <w:proofErr w:type="spellStart"/>
+      <w:r>
+        <w:t>fleet.tenant_id</w:t>
+      </w:r>
+      <w:proofErr w:type="spellEnd"/>
+      <w:r>
+        <w:t xml:space="preserve"> to serve the hottest tenant-filtered queries from one index; consistency is guaranteed because both are written from the same </w:t>
+      </w:r>
+      <w:proofErr w:type="spellStart"/>
+      <w:r>
+        <w:t>vehicle→fleet</w:t>
+      </w:r>
+      <w:proofErr w:type="spellEnd"/>
+      <w:r>
+        <w:t xml:space="preserve"> lookup.</w:t>
       </w:r>
     </w:p>
     <w:p>
@@ -6839,11 +7597,59 @@
         <w:spacing w:before="60" w:after="200" w:line="300" w:lineRule="auto"/>
       </w:pPr>
       <w:r>
-        <w:t xml:space="preserve">Kubernetes namespace fleetpulse (pod-security restricted): api Deployment (3 replicas, HPA 3–20 on CPU, PDB minAvailable 2, zone topology spread), processor Deployment (6 replicas ≤ partitions; KEDA </w:t>
+        <w:t xml:space="preserve">Kubernetes namespace </w:t>
+      </w:r>
+      <w:proofErr w:type="spellStart"/>
+      <w:r>
+        <w:t>fleetpulse</w:t>
+      </w:r>
+      <w:proofErr w:type="spellEnd"/>
+      <w:r>
+        <w:t xml:space="preserve"> (pod-security restricted): </w:t>
+      </w:r>
+      <w:proofErr w:type="spellStart"/>
+      <w:r>
+        <w:t>api</w:t>
+      </w:r>
+      <w:proofErr w:type="spellEnd"/>
+      <w:r>
+        <w:t xml:space="preserve"> Deployment (3 replicas, HPA 3–20 on CPU, PDB </w:t>
+      </w:r>
+      <w:proofErr w:type="spellStart"/>
+      <w:r>
+        <w:t>minAvailable</w:t>
+      </w:r>
+      <w:proofErr w:type="spellEnd"/>
+      <w:r>
+        <w:t xml:space="preserve"> 2, zone topology spread), processor Deployment (6 replicas ≤ partitions; KEDA </w:t>
       </w:r>
       <w:r>
         <w:lastRenderedPageBreak/>
-        <w:t>on consumer lag in production), risk-scoring CronJob every 5 minutes, default-deny NetworkPolicy, TLS Ingress via cert-manager. Containers run as non-root with read-only root filesystems and dropped capabilities. Secrets come from a K8s Secret synced from Vault / cloud secret manager (infra/k8s/fleetpulse.yaml).</w:t>
+        <w:t xml:space="preserve">on consumer lag in production), risk-scoring </w:t>
+      </w:r>
+      <w:proofErr w:type="spellStart"/>
+      <w:r>
+        <w:t>CronJob</w:t>
+      </w:r>
+      <w:proofErr w:type="spellEnd"/>
+      <w:r>
+        <w:t xml:space="preserve"> every 5 minutes, default-deny </w:t>
+      </w:r>
+      <w:proofErr w:type="spellStart"/>
+      <w:r>
+        <w:t>NetworkPolicy</w:t>
+      </w:r>
+      <w:proofErr w:type="spellEnd"/>
+      <w:r>
+        <w:t>, TLS Ingress via cert-manager. Containers run as non-root with read-only root filesystems and dropped capabilities. Secrets come from a K8s Secret synced from Vault / cloud secret manager (infra/k8s/</w:t>
+      </w:r>
+      <w:proofErr w:type="spellStart"/>
+      <w:r>
+        <w:t>fleetpulse.yaml</w:t>
+      </w:r>
+      <w:proofErr w:type="spellEnd"/>
+      <w:r>
+        <w:t>).</w:t>
       </w:r>
     </w:p>
     <w:p>
@@ -6851,10 +7657,39 @@
         <w:spacing w:before="60" w:after="200" w:line="300" w:lineRule="auto"/>
       </w:pPr>
       <w:r>
-        <w:t>Portability proof: a CI job deploys these exact manifests on a kind Kubernetes cluster through a kustomize overlay that changes configuration only (image, Secret, replica counts; Ingress omitted), under the restricted Pod Security profile, then smoke-tests login and live streaming through the Service. Cloud-agnostic approach: the application only reads KAFKA_BOOTSTRAP, PG_DSN, REDIS_URL and JWT_SECRET from the environment (12-factor). Terraform for AWS (infra/terraform/aws: VPC, EKS, MSK, RDS Multi-AZ, Elas</w:t>
-      </w:r>
-      <w:r>
-        <w:t>tiCache, all encrypted) provisions the backing services; the same manifests run on GKE/AKS with Confluent/Event Hubs, Cloud SQL/Flexible Server and Memorystore/Azure Cache, or locally on kind/k3d and docker compose, with no code change.</w:t>
+        <w:t xml:space="preserve">Portability proof: a CI job deploys these exact manifests on a kind Kubernetes cluster through a </w:t>
+      </w:r>
+      <w:proofErr w:type="spellStart"/>
+      <w:r>
+        <w:t>kustomize</w:t>
+      </w:r>
+      <w:proofErr w:type="spellEnd"/>
+      <w:r>
+        <w:t xml:space="preserve"> overlay that changes configuration only (image, Secret, replica counts; Ingress omitted), under the restricted Pod Security profile, then smoke-tests login and live streaming through the Service. Cloud-agnostic approach: the application only reads KAFKA_BOOTSTRAP, PG_DSN, REDIS_URL and JWT_SECRET from the environment (12-factor). Terraform for AWS (infra/terraform/</w:t>
+      </w:r>
+      <w:proofErr w:type="spellStart"/>
+      <w:r>
+        <w:t>aws</w:t>
+      </w:r>
+      <w:proofErr w:type="spellEnd"/>
+      <w:r>
+        <w:t xml:space="preserve">: VPC, EKS, MSK, RDS Multi-AZ, </w:t>
+      </w:r>
+      <w:proofErr w:type="spellStart"/>
+      <w:r>
+        <w:t>ElastiCache</w:t>
+      </w:r>
+      <w:proofErr w:type="spellEnd"/>
+      <w:r>
+        <w:t xml:space="preserve">, all encrypted) provisions the backing services; the same manifests run on GKE/AKS with Confluent/Event Hubs, Cloud SQL/Flexible Server and </w:t>
+      </w:r>
+      <w:proofErr w:type="spellStart"/>
+      <w:r>
+        <w:t>Memorystore</w:t>
+      </w:r>
+      <w:proofErr w:type="spellEnd"/>
+      <w:r>
+        <w:t>/Azure Cache, or locally on kind/k3d and docker compose, with no code change.</w:t>
       </w:r>
     </w:p>
     <w:p>
@@ -7119,8 +7954,29 @@
               <w:keepLines/>
               <w:spacing w:line="260" w:lineRule="auto"/>
             </w:pPr>
-            <w:r>
-              <w:t>fleetpulse/api: HTTP, WebSocket, validation (Pydantic), auth, RBAC, DTO mapping</w:t>
+            <w:proofErr w:type="spellStart"/>
+            <w:r>
+              <w:t>fleetpulse</w:t>
+            </w:r>
+            <w:proofErr w:type="spellEnd"/>
+            <w:r>
+              <w:t>/</w:t>
+            </w:r>
+            <w:proofErr w:type="spellStart"/>
+            <w:r>
+              <w:t>api</w:t>
+            </w:r>
+            <w:proofErr w:type="spellEnd"/>
+            <w:r>
+              <w:t>: HTTP, WebSocket, validation (</w:t>
+            </w:r>
+            <w:proofErr w:type="spellStart"/>
+            <w:r>
+              <w:t>Pydantic</w:t>
+            </w:r>
+            <w:proofErr w:type="spellEnd"/>
+            <w:r>
+              <w:t>), auth, RBAC, DTO mapping</w:t>
             </w:r>
           </w:p>
         </w:tc>
@@ -7291,8 +8147,13 @@
               <w:keepLines/>
               <w:spacing w:line="260" w:lineRule="auto"/>
             </w:pPr>
-            <w:r>
-              <w:t>fleetpulse/core + processor/rules.py: canonical event, VIN/DTC rules, algorithms, alert rules (pure Python, no I/O)</w:t>
+            <w:proofErr w:type="spellStart"/>
+            <w:r>
+              <w:t>fleetpulse</w:t>
+            </w:r>
+            <w:proofErr w:type="spellEnd"/>
+            <w:r>
+              <w:t>/core + processor/rules.py: canonical event, VIN/DTC rules, algorithms, alert rules (pure Python, no I/O)</w:t>
             </w:r>
           </w:p>
         </w:tc>
@@ -7377,8 +8238,13 @@
               <w:keepLines/>
               <w:spacing w:line="260" w:lineRule="auto"/>
             </w:pPr>
-            <w:r>
-              <w:t>api/deps.py, Kafka/Postgres/Redis clients, SQL</w:t>
+            <w:proofErr w:type="spellStart"/>
+            <w:r>
+              <w:t>api</w:t>
+            </w:r>
+            <w:proofErr w:type="spellEnd"/>
+            <w:r>
+              <w:t>/deps.py, Kafka/Postgres/Redis clients, SQL</w:t>
             </w:r>
           </w:p>
         </w:tc>
@@ -7413,12 +8279,76 @@
     </w:tbl>
     <w:p>
       <w:r>
-        <w:t>Style: layered with ports-and-adapters at the edges. The domain (core, rules) is pure Python with no I/O, so it is unit-tested to 99% coverage and reused by the processor, the batch scorer and the API. Dependencies point inward: api → application → domain; infrastructure implements adapters (OEM adapters, Kafka, Postgres, Redis).</w:t>
-      </w:r>
-    </w:p>
-    <w:p>
-      <w:r>
-        <w:t>Folder structure: fleetpulse/{core, simulator, processor, ml, agent, api} · web/ · db/ · infra/{k8s, terraform/aws, grafana} · tests/{unit, integration, contract, acceptance, load} · docs/{adr, diagrams, evidence, solution} · .github/workflows/</w:t>
+        <w:t xml:space="preserve">Style: layered with ports-and-adapters at the edges. The domain (core, rules) is pure Python with no I/O, so it is unit-tested to 99% coverage and reused by the processor, the batch scorer and the API. Dependencies point inward: </w:t>
+      </w:r>
+      <w:proofErr w:type="spellStart"/>
+      <w:r>
+        <w:t>api</w:t>
+      </w:r>
+      <w:proofErr w:type="spellEnd"/>
+      <w:r>
+        <w:t xml:space="preserve"> → application → domain; infrastructure implements adapters (OEM adapters, Kafka, Postgres, Redis).</w:t>
+      </w:r>
+    </w:p>
+    <w:p>
+      <w:r>
+        <w:t xml:space="preserve">Folder structure: </w:t>
+      </w:r>
+      <w:proofErr w:type="spellStart"/>
+      <w:r>
+        <w:t>fleetpulse</w:t>
+      </w:r>
+      <w:proofErr w:type="spellEnd"/>
+      <w:r>
+        <w:t xml:space="preserve">/{core, simulator, processor, ml, agent, </w:t>
+      </w:r>
+      <w:proofErr w:type="spellStart"/>
+      <w:r>
+        <w:t>api</w:t>
+      </w:r>
+      <w:proofErr w:type="spellEnd"/>
+      <w:r>
+        <w:t xml:space="preserve">} · web/ · </w:t>
+      </w:r>
+      <w:proofErr w:type="spellStart"/>
+      <w:r>
+        <w:t>db</w:t>
+      </w:r>
+      <w:proofErr w:type="spellEnd"/>
+      <w:r>
+        <w:t>/ · infra/{k8s, terraform/</w:t>
+      </w:r>
+      <w:proofErr w:type="spellStart"/>
+      <w:r>
+        <w:t>aws</w:t>
+      </w:r>
+      <w:proofErr w:type="spellEnd"/>
+      <w:r>
+        <w:t xml:space="preserve">, </w:t>
+      </w:r>
+      <w:proofErr w:type="spellStart"/>
+      <w:r>
+        <w:t>grafana</w:t>
+      </w:r>
+      <w:proofErr w:type="spellEnd"/>
+      <w:r>
+        <w:t>} · tests/{unit, integration, contract, acceptance, load} · docs/{</w:t>
+      </w:r>
+      <w:proofErr w:type="spellStart"/>
+      <w:r>
+        <w:t>adr</w:t>
+      </w:r>
+      <w:proofErr w:type="spellEnd"/>
+      <w:r>
+        <w:t>, diagrams, evidence, solution} · .</w:t>
+      </w:r>
+      <w:proofErr w:type="spellStart"/>
+      <w:r>
+        <w:t>github</w:t>
+      </w:r>
+      <w:proofErr w:type="spellEnd"/>
+      <w:r>
+        <w:t>/workflows/</w:t>
       </w:r>
     </w:p>
     <w:p>
@@ -7460,7 +8390,15 @@
         <w:spacing w:after="90" w:line="290" w:lineRule="auto"/>
       </w:pPr>
       <w:r>
-        <w:t>12-Factor App: all config from environment (fleetpulse/config.py); stateless API and processors (state in Kafka offsets, Postgres, Redis); disposable containers with SIGTERM handling; one image, many process types.</w:t>
+        <w:t>12-Factor App: all config from environment (</w:t>
+      </w:r>
+      <w:proofErr w:type="spellStart"/>
+      <w:r>
+        <w:t>fleetpulse</w:t>
+      </w:r>
+      <w:proofErr w:type="spellEnd"/>
+      <w:r>
+        <w:t>/config.py); stateless API and processors (state in Kafka offsets, Postgres, Redis); disposable containers with SIGTERM handling; one image, many process types.</w:t>
       </w:r>
     </w:p>
     <w:p>
@@ -7473,7 +8411,15 @@
         <w:spacing w:after="90" w:line="290" w:lineRule="auto"/>
       </w:pPr>
       <w:r>
-        <w:t>Idempotency, Fail-Fast, Least Privilege, DRY, KISS: idempotent sinks and alert dedup keys; schema and VIN validation fail fast into the DLQ; non-root read-only containers and role-scoped endpoints; shared feature code for training and scoring (DRY); one Python image instead of five stacks (KISS).</w:t>
+        <w:t xml:space="preserve">Idempotency, Fail-Fast, Least Privilege, DRY, KISS: idempotent sinks and alert </w:t>
+      </w:r>
+      <w:proofErr w:type="spellStart"/>
+      <w:r>
+        <w:t>dedup</w:t>
+      </w:r>
+      <w:proofErr w:type="spellEnd"/>
+      <w:r>
+        <w:t xml:space="preserve"> keys; schema and VIN validation fail fast into the DLQ; non-root read-only containers and role-scoped endpoints; shared feature code for training and scoring (DRY); one Python image instead of five stacks (KISS).</w:t>
       </w:r>
     </w:p>
     <w:p>
@@ -7696,7 +8642,23 @@
               <w:spacing w:line="260" w:lineRule="auto"/>
             </w:pPr>
             <w:r>
-              <w:t>fleetpulse/core/normalise.py (AuroraAdapter, BorealisAdapter)</w:t>
+              <w:t>fleetpulse/core/normalise.py (</w:t>
+            </w:r>
+            <w:proofErr w:type="spellStart"/>
+            <w:r>
+              <w:t>AuroraAdapter</w:t>
+            </w:r>
+            <w:proofErr w:type="spellEnd"/>
+            <w:r>
+              <w:t xml:space="preserve">, </w:t>
+            </w:r>
+            <w:proofErr w:type="spellStart"/>
+            <w:r>
+              <w:t>BorealisAdapter</w:t>
+            </w:r>
+            <w:proofErr w:type="spellEnd"/>
+            <w:r>
+              <w:t>)</w:t>
             </w:r>
           </w:p>
         </w:tc>
@@ -7868,7 +8830,15 @@
               <w:spacing w:line="260" w:lineRule="auto"/>
             </w:pPr>
             <w:r>
-              <w:t>processor/run.py, unique keys in db/001_schema.sql</w:t>
+              <w:t xml:space="preserve">processor/run.py, unique keys in </w:t>
+            </w:r>
+            <w:proofErr w:type="spellStart"/>
+            <w:r>
+              <w:t>db</w:t>
+            </w:r>
+            <w:proofErr w:type="spellEnd"/>
+            <w:r>
+              <w:t>/001_schema.sql</w:t>
             </w:r>
           </w:p>
         </w:tc>
@@ -7927,7 +8897,15 @@
               <w:spacing w:line="260" w:lineRule="auto"/>
             </w:pPr>
             <w:r>
-              <w:t>Writes go through Kafka/processor; reads from Redis hot state, the incremental vehicle_daily rollup and the risk table</w:t>
+              <w:t xml:space="preserve">Writes go through Kafka/processor; reads from Redis hot state, the incremental </w:t>
+            </w:r>
+            <w:proofErr w:type="spellStart"/>
+            <w:r>
+              <w:t>vehicle_daily</w:t>
+            </w:r>
+            <w:proofErr w:type="spellEnd"/>
+            <w:r>
+              <w:t xml:space="preserve"> rollup and the risk table</w:t>
             </w:r>
           </w:p>
         </w:tc>
@@ -8126,7 +9104,15 @@
               <w:spacing w:line="260" w:lineRule="auto"/>
             </w:pPr>
             <w:r>
-              <w:t>Redis PUBLISH in processor, /ws/alerts in API</w:t>
+              <w:t>Redis PUBLISH in processor, /</w:t>
+            </w:r>
+            <w:proofErr w:type="spellStart"/>
+            <w:r>
+              <w:t>ws</w:t>
+            </w:r>
+            <w:proofErr w:type="spellEnd"/>
+            <w:r>
+              <w:t>/alerts in API</w:t>
             </w:r>
           </w:p>
         </w:tc>
@@ -8185,7 +9171,15 @@
               <w:spacing w:line="260" w:lineRule="auto"/>
             </w:pPr>
             <w:r>
-              <w:t>Rate limiter fails open; map falls back from Esri to OpenStreetMap tiles and works without any tile CDN; pollers survive API restarts; copilot falls back from LLM</w:t>
+              <w:t xml:space="preserve">Rate limiter fails open; map falls back from Esri to OpenStreetMap tiles and works without any tile CDN; </w:t>
+            </w:r>
+            <w:proofErr w:type="spellStart"/>
+            <w:r>
+              <w:t>pollers</w:t>
+            </w:r>
+            <w:proofErr w:type="spellEnd"/>
+            <w:r>
+              <w:t xml:space="preserve"> survive API restarts; copilot falls back from LLM</w:t>
             </w:r>
           </w:p>
         </w:tc>
@@ -8211,8 +9205,13 @@
               <w:keepLines/>
               <w:spacing w:line="260" w:lineRule="auto"/>
             </w:pPr>
-            <w:r>
-              <w:t>api/deps.py, web/index.html, agent/copilot.py</w:t>
+            <w:proofErr w:type="spellStart"/>
+            <w:r>
+              <w:t>api</w:t>
+            </w:r>
+            <w:proofErr w:type="spellEnd"/>
+            <w:r>
+              <w:t>/deps.py, web/index.html, agent/copilot.py</w:t>
             </w:r>
           </w:p>
         </w:tc>
@@ -8249,8 +9248,21 @@
         </w:rPr>
         <w:t xml:space="preserve">API Contract: </w:t>
       </w:r>
-      <w:r>
-        <w:t>OpenAPI / AsyncAPI link; versioning, pagination, error format, rate limits</w:t>
+      <w:proofErr w:type="spellStart"/>
+      <w:r>
+        <w:t>OpenAPI</w:t>
+      </w:r>
+      <w:proofErr w:type="spellEnd"/>
+      <w:r>
+        <w:t xml:space="preserve"> / </w:t>
+      </w:r>
+      <w:proofErr w:type="spellStart"/>
+      <w:r>
+        <w:t>AsyncAPI</w:t>
+      </w:r>
+      <w:proofErr w:type="spellEnd"/>
+      <w:r>
+        <w:t xml:space="preserve"> link; versioning, pagination, error format, rate limits</w:t>
       </w:r>
     </w:p>
     <w:p>
@@ -8271,7 +9283,15 @@
         <w:t xml:space="preserve">Event Schemas: </w:t>
       </w:r>
       <w:r>
-        <w:t>Topics, keys, schema format (Avro / Protobuf / JSON Schema), schema evolution</w:t>
+        <w:t xml:space="preserve">Topics, keys, schema format (Avro / </w:t>
+      </w:r>
+      <w:proofErr w:type="spellStart"/>
+      <w:r>
+        <w:t>Protobuf</w:t>
+      </w:r>
+      <w:proofErr w:type="spellEnd"/>
+      <w:r>
+        <w:t xml:space="preserve"> / JSON Schema), schema evolution</w:t>
       </w:r>
     </w:p>
     <w:p>
@@ -8304,8 +9324,61 @@
         </w:rPr>
         <w:t xml:space="preserve">API contract: </w:t>
       </w:r>
-      <w:r>
-        <w:t>OpenAPI 3 generated by FastAPI at /openapi.json (Swagger UI at /docs). Versioned under /api/v1. Keyset (cursor) pagination with opaque base64 cursors on vehicles and alerts. Errors are RFC 7807 application/problem+json. Rate limit 600 requests/min per user, HTTP 429 with Retry-After. WebSocket /ws/alerts?token=… streams tenant-scoped alerts.</w:t>
+      <w:proofErr w:type="spellStart"/>
+      <w:r>
+        <w:t>OpenAPI</w:t>
+      </w:r>
+      <w:proofErr w:type="spellEnd"/>
+      <w:r>
+        <w:t xml:space="preserve"> 3 generated by </w:t>
+      </w:r>
+      <w:proofErr w:type="spellStart"/>
+      <w:r>
+        <w:t>FastAPI</w:t>
+      </w:r>
+      <w:proofErr w:type="spellEnd"/>
+      <w:r>
+        <w:t xml:space="preserve"> at /</w:t>
+      </w:r>
+      <w:proofErr w:type="spellStart"/>
+      <w:r>
+        <w:t>openapi.json</w:t>
+      </w:r>
+      <w:proofErr w:type="spellEnd"/>
+      <w:r>
+        <w:t xml:space="preserve"> (Swagger UI at /docs). Versioned under /</w:t>
+      </w:r>
+      <w:proofErr w:type="spellStart"/>
+      <w:r>
+        <w:t>api</w:t>
+      </w:r>
+      <w:proofErr w:type="spellEnd"/>
+      <w:r>
+        <w:t>/v1. Keyset (cursor) pagination with opaque base64 cursors on vehicles and alerts. Errors are RFC 7807 application/</w:t>
+      </w:r>
+      <w:proofErr w:type="spellStart"/>
+      <w:r>
+        <w:t>problem+json</w:t>
+      </w:r>
+      <w:proofErr w:type="spellEnd"/>
+      <w:r>
+        <w:t>. Rate limit 600 requests/min per user, HTTP 429 with Retry-After. WebSocket /</w:t>
+      </w:r>
+      <w:proofErr w:type="spellStart"/>
+      <w:r>
+        <w:t>ws</w:t>
+      </w:r>
+      <w:proofErr w:type="spellEnd"/>
+      <w:r>
+        <w:t>/</w:t>
+      </w:r>
+      <w:proofErr w:type="spellStart"/>
+      <w:r>
+        <w:t>alerts?token</w:t>
+      </w:r>
+      <w:proofErr w:type="spellEnd"/>
+      <w:r>
+        <w:t>=… streams tenant-scoped alerts.</w:t>
       </w:r>
     </w:p>
     <w:p>
@@ -8319,7 +9392,47 @@
         <w:t xml:space="preserve">Event schemas: </w:t>
       </w:r>
       <w:r>
-        <w:t>topic telemetry.raw (12 partitions, key = VIN, retention 24 h); telemetry.dlq (reason header); alerts. Payloads are JSON in two OEM shapes (Aurora: flat ISO-time metric; Borealis: nested epoch imperial with a raw fault string), mapped to one CanonicalEvent dataclass. Evolution: a new OEM or version is a new adapter class registered in ADAPTERS; unknown shapes go to the DLQ rather than blocking a partition. Avro/Protobuf with a schema registry is the production next step.</w:t>
+        <w:t xml:space="preserve">topic </w:t>
+      </w:r>
+      <w:proofErr w:type="spellStart"/>
+      <w:r>
+        <w:t>telemetry.raw</w:t>
+      </w:r>
+      <w:proofErr w:type="spellEnd"/>
+      <w:r>
+        <w:t xml:space="preserve"> (12 partitions, key = VIN, retention 24 h); </w:t>
+      </w:r>
+      <w:proofErr w:type="spellStart"/>
+      <w:r>
+        <w:t>telemetry.dlq</w:t>
+      </w:r>
+      <w:proofErr w:type="spellEnd"/>
+      <w:r>
+        <w:t xml:space="preserve"> (reason header); alerts. Payloads are JSON in two OEM shapes (Aurora: flat ISO-time metric; Borealis: nested epoch imperial with a raw fault string), mapped to one </w:t>
+      </w:r>
+      <w:proofErr w:type="spellStart"/>
+      <w:r>
+        <w:t>CanonicalEvent</w:t>
+      </w:r>
+      <w:proofErr w:type="spellEnd"/>
+      <w:r>
+        <w:t xml:space="preserve"> </w:t>
+      </w:r>
+      <w:proofErr w:type="spellStart"/>
+      <w:r>
+        <w:t>dataclass</w:t>
+      </w:r>
+      <w:proofErr w:type="spellEnd"/>
+      <w:r>
+        <w:t>. Evolution: a new OEM or version is a new adapter class registered in ADAPTERS; unknown shapes go to the DLQ rather than blocking a partition. Avro/</w:t>
+      </w:r>
+      <w:proofErr w:type="spellStart"/>
+      <w:r>
+        <w:t>Protobuf</w:t>
+      </w:r>
+      <w:proofErr w:type="spellEnd"/>
+      <w:r>
+        <w:t xml:space="preserve"> with a schema registry is the production next step.</w:t>
       </w:r>
     </w:p>
     <w:p>
@@ -8332,8 +9445,69 @@
         </w:rPr>
         <w:t xml:space="preserve">Flow 1 (happy path, critical fault): </w:t>
       </w:r>
-      <w:r>
-        <w:t>simulator.produce(key=VIN) → processor.consume(batch≤5000) → normalise → is_valid_vin → bloom.add(vin:seq) → ReorderBuffer.observe → RuleEngine.evaluate → INSERT telemetry … ON CONFLICT DO NOTHING; INSERT alert … ON CONFLICT (dedup_key) DO NOTHING RETURNING → Redis HSET/GEOADD/PUBLISH → commit offsets → API WebSocket → dashboard.</w:t>
+      <w:proofErr w:type="spellStart"/>
+      <w:r>
+        <w:t>simulator.produce</w:t>
+      </w:r>
+      <w:proofErr w:type="spellEnd"/>
+      <w:r>
+        <w:t xml:space="preserve">(key=VIN) → </w:t>
+      </w:r>
+      <w:proofErr w:type="spellStart"/>
+      <w:r>
+        <w:t>processor.consume</w:t>
+      </w:r>
+      <w:proofErr w:type="spellEnd"/>
+      <w:r>
+        <w:t xml:space="preserve">(batch≤5000) → normalise → </w:t>
+      </w:r>
+      <w:proofErr w:type="spellStart"/>
+      <w:r>
+        <w:t>is_valid_vin</w:t>
+      </w:r>
+      <w:proofErr w:type="spellEnd"/>
+      <w:r>
+        <w:t xml:space="preserve"> → </w:t>
+      </w:r>
+      <w:proofErr w:type="spellStart"/>
+      <w:r>
+        <w:t>bloom.add</w:t>
+      </w:r>
+      <w:proofErr w:type="spellEnd"/>
+      <w:r>
+        <w:t>(</w:t>
+      </w:r>
+      <w:proofErr w:type="spellStart"/>
+      <w:r>
+        <w:t>vin:seq</w:t>
+      </w:r>
+      <w:proofErr w:type="spellEnd"/>
+      <w:r>
+        <w:t xml:space="preserve">) → </w:t>
+      </w:r>
+      <w:proofErr w:type="spellStart"/>
+      <w:r>
+        <w:t>ReorderBuffer.observe</w:t>
+      </w:r>
+      <w:proofErr w:type="spellEnd"/>
+      <w:r>
+        <w:t xml:space="preserve"> → </w:t>
+      </w:r>
+      <w:proofErr w:type="spellStart"/>
+      <w:r>
+        <w:t>RuleEngine.evaluate</w:t>
+      </w:r>
+      <w:proofErr w:type="spellEnd"/>
+      <w:r>
+        <w:t xml:space="preserve"> → INSERT telemetry … ON CONFLICT DO NOTHING; INSERT alert … ON CONFLICT (</w:t>
+      </w:r>
+      <w:proofErr w:type="spellStart"/>
+      <w:r>
+        <w:t>dedup_key</w:t>
+      </w:r>
+      <w:proofErr w:type="spellEnd"/>
+      <w:r>
+        <w:t>) DO NOTHING RETURNING → Redis HSET/GEOADD/PUBLISH → commit offsets → API WebSocket → dashboard.</w:t>
       </w:r>
     </w:p>
     <w:p>
@@ -8347,7 +9521,23 @@
         <w:t xml:space="preserve">Flow 2 (failure: duplicate + broker down): </w:t>
       </w:r>
       <w:r>
-        <w:t>the device retries an event (duplicate) → Bloom filter drops it; if the Bloom state was lost in a crash, the unique index and dedup_key absorb the replay. If the broker is down, the producer buffers and applies back-pressure (BufferError → poll and retry); processors block on consume and resume from the last committed offset. Measured: processors killed and broker restarted at 13:02:10, consumption resumed and drained the backlog at ~9K events/s against ~5.9K/s input.</w:t>
+        <w:t xml:space="preserve">the device retries an event (duplicate) → Bloom filter drops it; if the Bloom state was lost in a crash, the unique index and </w:t>
+      </w:r>
+      <w:proofErr w:type="spellStart"/>
+      <w:r>
+        <w:t>dedup_key</w:t>
+      </w:r>
+      <w:proofErr w:type="spellEnd"/>
+      <w:r>
+        <w:t xml:space="preserve"> absorb the replay. If the broker is down, the producer buffers and applies back-pressure (</w:t>
+      </w:r>
+      <w:proofErr w:type="spellStart"/>
+      <w:r>
+        <w:t>BufferError</w:t>
+      </w:r>
+      <w:proofErr w:type="spellEnd"/>
+      <w:r>
+        <w:t xml:space="preserve"> → poll and retry); processors block on consume and resume from the last committed offset. Measured: processors killed and broker restarted at 13:02:10, consumption resumed and drained the backlog at ~9K events/s against ~5.9K/s input.</w:t>
       </w:r>
     </w:p>
     <w:p>
@@ -9771,7 +10961,79 @@
         <w:spacing w:before="60" w:after="200" w:line="300" w:lineRule="auto"/>
       </w:pPr>
       <w:r>
-        <w:t>Pseudocode (processor batch): for m in batch: e ← adapter(m); if !valid(e.vin) → DLQ; if bloom.add(e.vin:e.seq) → skip; inOrder ← order.observe(e); rows += e; alerts += rules(e); if inOrder: latest[e.vin] ← e. Then one transaction: upsert rows, insert alerts RETURNING new; then Redis pipeline; then commit offsets.</w:t>
+        <w:t xml:space="preserve">Pseudocode (processor batch): </w:t>
+      </w:r>
+      <w:proofErr w:type="spellStart"/>
+      <w:r>
+        <w:t>for m</w:t>
+      </w:r>
+      <w:proofErr w:type="spellEnd"/>
+      <w:r>
+        <w:t xml:space="preserve"> in batch: e ← adapter(m); if !valid(</w:t>
+      </w:r>
+      <w:proofErr w:type="spellStart"/>
+      <w:r>
+        <w:t>e.vin</w:t>
+      </w:r>
+      <w:proofErr w:type="spellEnd"/>
+      <w:r>
+        <w:t xml:space="preserve">) → DLQ; if </w:t>
+      </w:r>
+      <w:proofErr w:type="spellStart"/>
+      <w:r>
+        <w:t>bloom.add</w:t>
+      </w:r>
+      <w:proofErr w:type="spellEnd"/>
+      <w:r>
+        <w:t>(</w:t>
+      </w:r>
+      <w:proofErr w:type="spellStart"/>
+      <w:r>
+        <w:t>e.vin:e.seq</w:t>
+      </w:r>
+      <w:proofErr w:type="spellEnd"/>
+      <w:r>
+        <w:t xml:space="preserve">) → skip; </w:t>
+      </w:r>
+      <w:proofErr w:type="spellStart"/>
+      <w:r>
+        <w:t>inOrder</w:t>
+      </w:r>
+      <w:proofErr w:type="spellEnd"/>
+      <w:r>
+        <w:t xml:space="preserve"> ← </w:t>
+      </w:r>
+      <w:proofErr w:type="spellStart"/>
+      <w:r>
+        <w:t>order.observe</w:t>
+      </w:r>
+      <w:proofErr w:type="spellEnd"/>
+      <w:r>
+        <w:t xml:space="preserve">(e); rows += e; alerts += rules(e); if </w:t>
+      </w:r>
+      <w:proofErr w:type="spellStart"/>
+      <w:r>
+        <w:t>inOrder</w:t>
+      </w:r>
+      <w:proofErr w:type="spellEnd"/>
+      <w:r>
+        <w:t>: latest[</w:t>
+      </w:r>
+      <w:proofErr w:type="spellStart"/>
+      <w:r>
+        <w:t>e.vin</w:t>
+      </w:r>
+      <w:proofErr w:type="spellEnd"/>
+      <w:r>
+        <w:t xml:space="preserve">] ← e. Then one transaction: </w:t>
+      </w:r>
+      <w:proofErr w:type="spellStart"/>
+      <w:r>
+        <w:t>upsert</w:t>
+      </w:r>
+      <w:proofErr w:type="spellEnd"/>
+      <w:r>
+        <w:t xml:space="preserve"> rows, insert alerts RETURNING new; then Redis pipeline; then commit offsets.</w:t>
       </w:r>
     </w:p>
     <w:p>
@@ -10240,8 +11502,21 @@
               <w:spacing w:line="260" w:lineRule="auto"/>
             </w:pPr>
             <w:r>
-              <w:t>p95 &lt; 200 ms; p99 &lt; 500 ms</w:t>
-            </w:r>
+              <w:t xml:space="preserve">p95 &lt; 200 </w:t>
+            </w:r>
+            <w:proofErr w:type="spellStart"/>
+            <w:r>
+              <w:t>ms</w:t>
+            </w:r>
+            <w:proofErr w:type="spellEnd"/>
+            <w:r>
+              <w:t xml:space="preserve">; p99 &lt; 500 </w:t>
+            </w:r>
+            <w:proofErr w:type="spellStart"/>
+            <w:r>
+              <w:t>ms</w:t>
+            </w:r>
+            <w:proofErr w:type="spellEnd"/>
           </w:p>
         </w:tc>
         <w:tc>
@@ -10267,7 +11542,39 @@
               <w:spacing w:line="260" w:lineRule="auto"/>
             </w:pPr>
             <w:r>
-              <w:t>p95 18 ms @10, p95 110 ms / p99 132 ms @50, p95 224 ms @100 concurrent users, with the pipeline running on the same box</w:t>
+              <w:t xml:space="preserve">p95 18 </w:t>
+            </w:r>
+            <w:proofErr w:type="spellStart"/>
+            <w:r>
+              <w:t>ms</w:t>
+            </w:r>
+            <w:proofErr w:type="spellEnd"/>
+            <w:r>
+              <w:t xml:space="preserve"> @10, p95 110 </w:t>
+            </w:r>
+            <w:proofErr w:type="spellStart"/>
+            <w:r>
+              <w:t>ms</w:t>
+            </w:r>
+            <w:proofErr w:type="spellEnd"/>
+            <w:r>
+              <w:t xml:space="preserve"> / p99 132 </w:t>
+            </w:r>
+            <w:proofErr w:type="spellStart"/>
+            <w:r>
+              <w:t>ms</w:t>
+            </w:r>
+            <w:proofErr w:type="spellEnd"/>
+            <w:r>
+              <w:t xml:space="preserve"> @50, p95 224 </w:t>
+            </w:r>
+            <w:proofErr w:type="spellStart"/>
+            <w:r>
+              <w:t>ms</w:t>
+            </w:r>
+            <w:proofErr w:type="spellEnd"/>
+            <w:r>
+              <w:t xml:space="preserve"> @100 concurrent users, with the pipeline running on the same box</w:t>
             </w:r>
           </w:p>
         </w:tc>
@@ -10576,7 +11883,31 @@
         <w:spacing w:before="60" w:after="200" w:line="300" w:lineRule="auto"/>
       </w:pPr>
       <w:r>
-        <w:t xml:space="preserve">Original load test setup: everything on one 4-vCPU cloud VM under docker compose (Redpanda, Postgres 16, Redis, 2 processors, simulator, batch, API) with 100K vehicles at a 5,000 events/s base rate and 3x bursts for 10 s every 2 minutes. API load: tests/load/api_load.py (async httpx) against 4 uvicorn workers, rate limiter raised for the test. Processor CPU benchmark: tests/load/processor_bench.py. </w:t>
+        <w:t>Original load test setup: everything on one 4-vCPU cloud VM under docker compose (</w:t>
+      </w:r>
+      <w:proofErr w:type="spellStart"/>
+      <w:r>
+        <w:t>Redpanda</w:t>
+      </w:r>
+      <w:proofErr w:type="spellEnd"/>
+      <w:r>
+        <w:t xml:space="preserve">, Postgres 16, Redis, 2 processors, simulator, batch, API) with 100K vehicles at a 5,000 events/s base rate and 3x bursts for 10 s every 2 minutes. API load: tests/load/api_load.py (async </w:t>
+      </w:r>
+      <w:proofErr w:type="spellStart"/>
+      <w:r>
+        <w:t>httpx</w:t>
+      </w:r>
+      <w:proofErr w:type="spellEnd"/>
+      <w:r>
+        <w:t xml:space="preserve">) against 4 </w:t>
+      </w:r>
+      <w:proofErr w:type="spellStart"/>
+      <w:r>
+        <w:t>uvicorn</w:t>
+      </w:r>
+      <w:proofErr w:type="spellEnd"/>
+      <w:r>
+        <w:t xml:space="preserve"> workers, rate limiter raised for the test. Processor CPU benchmark: tests/load/processor_bench.py. </w:t>
       </w:r>
       <w:r>
         <w:lastRenderedPageBreak/>
@@ -10588,7 +11919,55 @@
         <w:spacing w:before="60" w:after="200" w:line="300" w:lineRule="auto"/>
       </w:pPr>
       <w:r>
-        <w:t>Results: API 2,000 requests at 10 concurrent: 326 rps, p50 25 ms, p95 71 ms, p99 110 ms (all 200). At 50 concurrent on the same shared box: p95 456 ms, p99 576 ms: the CPU is shared with the pipeline, and the fix is horizontal (API HPA, read replicas). Processor ~2.5K events/s per replica including Postgres writes; consumer lag drained after chaos at ~9K events/s.</w:t>
+        <w:t xml:space="preserve">Results: API 2,000 requests at 10 concurrent: 326 </w:t>
+      </w:r>
+      <w:proofErr w:type="spellStart"/>
+      <w:r>
+        <w:t>rps</w:t>
+      </w:r>
+      <w:proofErr w:type="spellEnd"/>
+      <w:r>
+        <w:t xml:space="preserve">, p50 25 </w:t>
+      </w:r>
+      <w:proofErr w:type="spellStart"/>
+      <w:r>
+        <w:t>ms</w:t>
+      </w:r>
+      <w:proofErr w:type="spellEnd"/>
+      <w:r>
+        <w:t xml:space="preserve">, p95 71 </w:t>
+      </w:r>
+      <w:proofErr w:type="spellStart"/>
+      <w:r>
+        <w:t>ms</w:t>
+      </w:r>
+      <w:proofErr w:type="spellEnd"/>
+      <w:r>
+        <w:t xml:space="preserve">, p99 110 </w:t>
+      </w:r>
+      <w:proofErr w:type="spellStart"/>
+      <w:r>
+        <w:t>ms</w:t>
+      </w:r>
+      <w:proofErr w:type="spellEnd"/>
+      <w:r>
+        <w:t xml:space="preserve"> (all 200). At 50 concurrent on the same shared box: p95 456 </w:t>
+      </w:r>
+      <w:proofErr w:type="spellStart"/>
+      <w:r>
+        <w:t>ms</w:t>
+      </w:r>
+      <w:proofErr w:type="spellEnd"/>
+      <w:r>
+        <w:t xml:space="preserve">, p99 576 </w:t>
+      </w:r>
+      <w:proofErr w:type="spellStart"/>
+      <w:r>
+        <w:t>ms</w:t>
+      </w:r>
+      <w:proofErr w:type="spellEnd"/>
+      <w:r>
+        <w:t>: the CPU is shared with the pipeline, and the fix is horizontal (API HPA, read replicas). Processor ~2.5K events/s per replica including Postgres writes; consumer lag drained after chaos at ~9K events/s.</w:t>
       </w:r>
     </w:p>
     <w:p>
@@ -10657,8 +12036,13 @@
         </w:rPr>
         <w:t xml:space="preserve">Device Identity &amp; Encryption: </w:t>
       </w:r>
-      <w:r>
-        <w:t>mTLS, TLS in transit, encryption at rest, secrets management</w:t>
+      <w:proofErr w:type="spellStart"/>
+      <w:r>
+        <w:t>mTLS</w:t>
+      </w:r>
+      <w:proofErr w:type="spellEnd"/>
+      <w:r>
+        <w:t>, TLS in transit, encryption at rest, secrets management</w:t>
       </w:r>
     </w:p>
     <w:p>
@@ -10952,7 +12336,15 @@
               <w:spacing w:line="260" w:lineRule="auto"/>
             </w:pPr>
             <w:r>
-              <w:t>VIN check digit + unknown-VIN DLQ; per-device mTLS at the edge</w:t>
+              <w:t xml:space="preserve">VIN check digit + unknown-VIN DLQ; per-device </w:t>
+            </w:r>
+            <w:proofErr w:type="spellStart"/>
+            <w:r>
+              <w:t>mTLS</w:t>
+            </w:r>
+            <w:proofErr w:type="spellEnd"/>
+            <w:r>
+              <w:t xml:space="preserve"> at the edge</w:t>
             </w:r>
           </w:p>
         </w:tc>
@@ -10979,7 +12371,15 @@
               <w:spacing w:line="260" w:lineRule="auto"/>
             </w:pPr>
             <w:r>
-              <w:t>Done / mTLS planned</w:t>
+              <w:t xml:space="preserve">Done / </w:t>
+            </w:r>
+            <w:proofErr w:type="spellStart"/>
+            <w:r>
+              <w:t>mTLS</w:t>
+            </w:r>
+            <w:proofErr w:type="spellEnd"/>
+            <w:r>
+              <w:t xml:space="preserve"> planned</w:t>
             </w:r>
           </w:p>
         </w:tc>
@@ -11065,7 +12465,31 @@
               <w:spacing w:line="260" w:lineRule="auto"/>
             </w:pPr>
             <w:r>
-              <w:t>Bloom + unique (vin, seq, ts); alert dedup_key; per-VIN sequence</w:t>
+              <w:t xml:space="preserve">Bloom + unique (vin, </w:t>
+            </w:r>
+            <w:proofErr w:type="spellStart"/>
+            <w:r>
+              <w:t>seq</w:t>
+            </w:r>
+            <w:proofErr w:type="spellEnd"/>
+            <w:r>
+              <w:t xml:space="preserve">, </w:t>
+            </w:r>
+            <w:proofErr w:type="spellStart"/>
+            <w:r>
+              <w:t>ts</w:t>
+            </w:r>
+            <w:proofErr w:type="spellEnd"/>
+            <w:r>
+              <w:t xml:space="preserve">); alert </w:t>
+            </w:r>
+            <w:proofErr w:type="spellStart"/>
+            <w:r>
+              <w:t>dedup_key</w:t>
+            </w:r>
+            <w:proofErr w:type="spellEnd"/>
+            <w:r>
+              <w:t>; per-VIN sequence</w:t>
             </w:r>
           </w:p>
         </w:tc>
@@ -11178,7 +12602,15 @@
               <w:spacing w:line="260" w:lineRule="auto"/>
             </w:pPr>
             <w:r>
-              <w:t>Append-only audit_log (DB trigger) on reads, acks, approvals, erasure, logins, agent tools</w:t>
+              <w:t xml:space="preserve">Append-only </w:t>
+            </w:r>
+            <w:proofErr w:type="spellStart"/>
+            <w:r>
+              <w:t>audit_log</w:t>
+            </w:r>
+            <w:proofErr w:type="spellEnd"/>
+            <w:r>
+              <w:t xml:space="preserve"> (DB trigger) on reads, acks, approvals, erasure, logins, agent tools</w:t>
             </w:r>
           </w:p>
         </w:tc>
@@ -11563,10 +12995,40 @@
         <w:rPr>
           <w:b/>
         </w:rPr>
-        <w:t xml:space="preserve">AuthN/AuthZ: </w:t>
-      </w:r>
-      <w:r>
-        <w:t>JWT (HS256, 2 h expiry, issuer check) issued after PBKDF2-SHA256 (200K iterations) password verification; RBAC roles admin / fleet_manager / analyst enforced per endpoint; tenant isolation on every query. Production design: OIDC (Keycloak or cloud IdP) issuing RS256 tokens, same claims.</w:t>
+        <w:t>AuthN/</w:t>
+      </w:r>
+      <w:proofErr w:type="spellStart"/>
+      <w:r>
+        <w:rPr>
+          <w:b/>
+        </w:rPr>
+        <w:t>AuthZ</w:t>
+      </w:r>
+      <w:proofErr w:type="spellEnd"/>
+      <w:r>
+        <w:rPr>
+          <w:b/>
+        </w:rPr>
+        <w:t xml:space="preserve">: </w:t>
+      </w:r>
+      <w:r>
+        <w:t xml:space="preserve">JWT (HS256, 2 h expiry, issuer check) issued after PBKDF2-SHA256 (200K iterations) password verification; RBAC roles admin / </w:t>
+      </w:r>
+      <w:proofErr w:type="spellStart"/>
+      <w:r>
+        <w:t>fleet_manager</w:t>
+      </w:r>
+      <w:proofErr w:type="spellEnd"/>
+      <w:r>
+        <w:t xml:space="preserve"> / analyst enforced per endpoint; tenant isolation on every query. Production design: OIDC (</w:t>
+      </w:r>
+      <w:proofErr w:type="spellStart"/>
+      <w:r>
+        <w:t>Keycloak</w:t>
+      </w:r>
+      <w:proofErr w:type="spellEnd"/>
+      <w:r>
+        <w:t xml:space="preserve"> or cloud IdP) issuing RS256 tokens, same claims.</w:t>
       </w:r>
     </w:p>
     <w:p>
@@ -11580,7 +13042,39 @@
         <w:t xml:space="preserve">Device identity &amp; encryption: </w:t>
       </w:r>
       <w:r>
-        <w:t>designed for per-device X.509 mTLS at the MQTT/Kafka edge; TLS 1.3 at ingress (cert-manager); RDS, ElastiCache and MSK encrypted at rest (AES-256 KMS) and in transit (Terraform); secrets via K8s Secret synced from Vault; .env.example only in git. Security headers (nosniff, frame deny, no-referrer, no-store) on every response.</w:t>
+        <w:t xml:space="preserve">designed for per-device X.509 </w:t>
+      </w:r>
+      <w:proofErr w:type="spellStart"/>
+      <w:r>
+        <w:t>mTLS</w:t>
+      </w:r>
+      <w:proofErr w:type="spellEnd"/>
+      <w:r>
+        <w:t xml:space="preserve"> at the MQTT/Kafka edge; TLS 1.3 at ingress (cert-manager); RDS, </w:t>
+      </w:r>
+      <w:proofErr w:type="spellStart"/>
+      <w:r>
+        <w:t>ElastiCache</w:t>
+      </w:r>
+      <w:proofErr w:type="spellEnd"/>
+      <w:r>
+        <w:t xml:space="preserve"> and MSK encrypted at rest (AES-256 KMS) and in transit (Terraform); secrets via K8s Secret synced from Vault; .</w:t>
+      </w:r>
+      <w:proofErr w:type="spellStart"/>
+      <w:r>
+        <w:t>env.example</w:t>
+      </w:r>
+      <w:proofErr w:type="spellEnd"/>
+      <w:r>
+        <w:t xml:space="preserve"> only in git. Security headers (</w:t>
+      </w:r>
+      <w:proofErr w:type="spellStart"/>
+      <w:r>
+        <w:t>nosniff</w:t>
+      </w:r>
+      <w:proofErr w:type="spellEnd"/>
+      <w:r>
+        <w:t>, frame deny, no-referrer, no-store) on every response.</w:t>
       </w:r>
     </w:p>
     <w:p>
@@ -11594,7 +13088,15 @@
         <w:t xml:space="preserve">Privacy (GDPR, DPDP Act 2023): </w:t>
       </w:r>
       <w:r>
-        <w:t>analysts see only geohash-5 (~5 km) masked positions; driver PII lives in one table and is erased by DELETE /api/v1/drivers/{id} (PII nulled, operational rows kept, audit row written); telemetry retention is a partition drop (24 h in Kafka, 7–90 days warm, then cold); Mumbai region for Indian data residency.</w:t>
+        <w:t>analysts see only geohash-5 (~5 km) masked positions; driver PII lives in one table and is erased by DELETE /</w:t>
+      </w:r>
+      <w:proofErr w:type="spellStart"/>
+      <w:r>
+        <w:t>api</w:t>
+      </w:r>
+      <w:proofErr w:type="spellEnd"/>
+      <w:r>
+        <w:t>/v1/drivers/{id} (PII nulled, operational rows kept, audit row written); telemetry retention is a partition drop (24 h in Kafka, 7–90 days warm, then cold); Mumbai region for Indian data residency.</w:t>
       </w:r>
     </w:p>
     <w:p>
@@ -11874,9 +13376,19 @@
               <w:keepLines/>
               <w:spacing w:line="260" w:lineRule="auto"/>
             </w:pPr>
-            <w:r>
-              <w:t>pytest, pytest-cov</w:t>
-            </w:r>
+            <w:proofErr w:type="spellStart"/>
+            <w:r>
+              <w:t>pytest</w:t>
+            </w:r>
+            <w:proofErr w:type="spellEnd"/>
+            <w:r>
+              <w:t xml:space="preserve">, </w:t>
+            </w:r>
+            <w:proofErr w:type="spellStart"/>
+            <w:r>
+              <w:t>pytest-cov</w:t>
+            </w:r>
+            <w:proofErr w:type="spellEnd"/>
           </w:p>
         </w:tc>
         <w:tc>
@@ -11929,7 +13441,15 @@
               <w:spacing w:line="260" w:lineRule="auto"/>
             </w:pPr>
             <w:r>
-              <w:t>98% line coverage on all domain modules (algorithms, rules, guardrails, features, fleet generator); I/O entrypoints covered by the live-stack suites</w:t>
+              <w:t xml:space="preserve">98% line coverage on all domain modules (algorithms, rules, guardrails, features, fleet generator); I/O </w:t>
+            </w:r>
+            <w:proofErr w:type="spellStart"/>
+            <w:r>
+              <w:t>entrypoints</w:t>
+            </w:r>
+            <w:proofErr w:type="spellEnd"/>
+            <w:r>
+              <w:t xml:space="preserve"> covered by the live-stack suites</w:t>
             </w:r>
           </w:p>
         </w:tc>
@@ -12014,9 +13534,27 @@
               <w:keepLines/>
               <w:spacing w:line="260" w:lineRule="auto"/>
             </w:pPr>
-            <w:r>
-              <w:t>pytest + httpx against docker compose; consumer-driven contracts (dashboard as consumer) verified against the live API and its OpenAPI</w:t>
-            </w:r>
+            <w:proofErr w:type="spellStart"/>
+            <w:r>
+              <w:t>pytest</w:t>
+            </w:r>
+            <w:proofErr w:type="spellEnd"/>
+            <w:r>
+              <w:t xml:space="preserve"> + </w:t>
+            </w:r>
+            <w:proofErr w:type="spellStart"/>
+            <w:r>
+              <w:t>httpx</w:t>
+            </w:r>
+            <w:proofErr w:type="spellEnd"/>
+            <w:r>
+              <w:t xml:space="preserve"> against docker compose; consumer-driven contracts (dashboard as consumer) verified against the live API and its </w:t>
+            </w:r>
+            <w:proofErr w:type="spellStart"/>
+            <w:r>
+              <w:t>OpenAPI</w:t>
+            </w:r>
+            <w:proofErr w:type="spellEnd"/>
           </w:p>
         </w:tc>
         <w:tc>
@@ -12154,8 +13692,13 @@
               <w:keepLines/>
               <w:spacing w:line="260" w:lineRule="auto"/>
             </w:pPr>
-            <w:r>
-              <w:t>pytest-bdd Gherkin features (tests/acceptance/features)</w:t>
+            <w:proofErr w:type="spellStart"/>
+            <w:r>
+              <w:t>pytest-bdd</w:t>
+            </w:r>
+            <w:proofErr w:type="spellEnd"/>
+            <w:r>
+              <w:t xml:space="preserve"> Gherkin features (tests/acceptance/features)</w:t>
             </w:r>
           </w:p>
         </w:tc>
@@ -12349,7 +13892,23 @@
               <w:spacing w:line="260" w:lineRule="auto"/>
             </w:pPr>
             <w:r>
-              <w:t>Zero loss at 25.7K ev/s offered; API p95 110 ms @50; soak 15.8M events, freshness p50 0.19 s, burst backlog grows after ~25 min (p95 7.9 s) as the hourly partition outgrows cache</w:t>
+              <w:t xml:space="preserve">Zero loss at 25.7K </w:t>
+            </w:r>
+            <w:proofErr w:type="spellStart"/>
+            <w:r>
+              <w:t>ev</w:t>
+            </w:r>
+            <w:proofErr w:type="spellEnd"/>
+            <w:r>
+              <w:t xml:space="preserve">/s offered; API p95 110 </w:t>
+            </w:r>
+            <w:proofErr w:type="spellStart"/>
+            <w:r>
+              <w:t>ms</w:t>
+            </w:r>
+            <w:proofErr w:type="spellEnd"/>
+            <w:r>
+              <w:t xml:space="preserve"> @50; soak 15.8M events, freshness p50 0.19 s, burst backlog grows after ~25 min (p95 7.9 s) as the hourly partition outgrows cache</w:t>
             </w:r>
           </w:p>
         </w:tc>
@@ -12434,8 +13993,21 @@
               <w:keepLines/>
               <w:spacing w:line="260" w:lineRule="auto"/>
             </w:pPr>
-            <w:r>
-              <w:t>Semgrep, Bandit, pip-audit, Trivy, OWASP ZAP baseline</w:t>
+            <w:proofErr w:type="spellStart"/>
+            <w:r>
+              <w:t>Semgrep</w:t>
+            </w:r>
+            <w:proofErr w:type="spellEnd"/>
+            <w:r>
+              <w:t xml:space="preserve">, Bandit, pip-audit, </w:t>
+            </w:r>
+            <w:proofErr w:type="spellStart"/>
+            <w:r>
+              <w:t>Trivy</w:t>
+            </w:r>
+            <w:proofErr w:type="spellEnd"/>
+            <w:r>
+              <w:t>, OWASP ZAP baseline</w:t>
             </w:r>
           </w:p>
         </w:tc>
@@ -12489,7 +14061,15 @@
               <w:spacing w:line="260" w:lineRule="auto"/>
             </w:pPr>
             <w:r>
-              <w:t>Bandit clean (0 medium/high); ZAP and Trivy reports in the CI run</w:t>
+              <w:t xml:space="preserve">Bandit clean (0 medium/high); ZAP and </w:t>
+            </w:r>
+            <w:proofErr w:type="spellStart"/>
+            <w:r>
+              <w:t>Trivy</w:t>
+            </w:r>
+            <w:proofErr w:type="spellEnd"/>
+            <w:r>
+              <w:t xml:space="preserve"> reports in the CI run</w:t>
             </w:r>
           </w:p>
         </w:tc>
@@ -12760,7 +14340,23 @@
         <w:t xml:space="preserve">Sample: </w:t>
       </w:r>
       <w:r>
-        <w:t>Borealis payload {vehicleId, epoch, signals:{speedMph:10, coolantTempF:212, lvBatteryVolts:11.5}, faultString:'DTC:P0217;DTC:C0035'} → canonical {speed_kmh:16.09, coolant_c:100.0, dtcs:[P0217, C0035]} → alerts CRITICAL_DTC P0217 (sev 5), DTC C0035, LOW_12V.</w:t>
+        <w:t>Borealis payload {</w:t>
+      </w:r>
+      <w:proofErr w:type="spellStart"/>
+      <w:r>
+        <w:t>vehicleId</w:t>
+      </w:r>
+      <w:proofErr w:type="spellEnd"/>
+      <w:r>
+        <w:t xml:space="preserve">, epoch, signals:{speedMph:10, coolantTempF:212, lvBatteryVolts:11.5}, faultString:'DTC:P0217;DTC:C0035'} → canonical {speed_kmh:16.09, coolant_c:100.0, </w:t>
+      </w:r>
+      <w:proofErr w:type="spellStart"/>
+      <w:r>
+        <w:t>dtcs</w:t>
+      </w:r>
+      <w:proofErr w:type="spellEnd"/>
+      <w:r>
+        <w:t>:[P0217, C0035]} → alerts CRITICAL_DTC P0217 (sev 5), DTC C0035, LOW_12V.</w:t>
       </w:r>
     </w:p>
     <w:p>
@@ -12778,7 +14374,39 @@
         <w:t xml:space="preserve">Reports: </w:t>
       </w:r>
       <w:r>
-        <w:t>coverage (pytest --cov, uploaded by CI), docs/evidence/api_load.txt, processor_bench.txt, explain_analyze.txt, chaos.txt; Semgrep/Bandit/pip-audit/Trivy/ZAP output and the e2e JUnit report in the GitHub Actions run.</w:t>
+        <w:t>coverage (</w:t>
+      </w:r>
+      <w:proofErr w:type="spellStart"/>
+      <w:r>
+        <w:t>pytest</w:t>
+      </w:r>
+      <w:proofErr w:type="spellEnd"/>
+      <w:r>
+        <w:t xml:space="preserve"> --</w:t>
+      </w:r>
+      <w:proofErr w:type="spellStart"/>
+      <w:r>
+        <w:t>cov</w:t>
+      </w:r>
+      <w:proofErr w:type="spellEnd"/>
+      <w:r>
+        <w:t xml:space="preserve">, uploaded by CI), docs/evidence/api_load.txt, processor_bench.txt, explain_analyze.txt, chaos.txt; </w:t>
+      </w:r>
+      <w:proofErr w:type="spellStart"/>
+      <w:r>
+        <w:t>Semgrep</w:t>
+      </w:r>
+      <w:proofErr w:type="spellEnd"/>
+      <w:r>
+        <w:t>/Bandit/pip-audit/</w:t>
+      </w:r>
+      <w:proofErr w:type="spellStart"/>
+      <w:r>
+        <w:t>Trivy</w:t>
+      </w:r>
+      <w:proofErr w:type="spellEnd"/>
+      <w:r>
+        <w:t>/ZAP output and the e2e JUnit report in the GitHub Actions run.</w:t>
       </w:r>
     </w:p>
     <w:p>
@@ -12836,10 +14464,79 @@
         <w:spacing w:before="60" w:after="200" w:line="300" w:lineRule="auto"/>
       </w:pPr>
       <w:r>
-        <w:t xml:space="preserve">Every service exposes Prometheus metrics: fp_events_total{outcome=ok|late|duplicate|dlq}, fp_ingest_latency_seconds (vehicle timestamp → processed), fp_alerts_total{rule}, fp_batch_seconds, fp_api_latency_seconds{route}. docker compose --profile observability starts Prometheus and Grafana with a provisioned “FleetPulse pipeline” dashboard (events/s by outcome, ingest latency p50/p95/p99, alerts by rule, batch time, API p95 by route, Kafka ingest rate). Consumer lag comes from rpk group describe / the Kafka </w:t>
-      </w:r>
-      <w:r>
-        <w:t>exporter. Logs are structured stdout collected by the platform (Loki/ELK). The dashboard itself shows live events/s and measured alert latency.</w:t>
+        <w:t xml:space="preserve">Every service exposes Prometheus metrics: </w:t>
+      </w:r>
+      <w:proofErr w:type="spellStart"/>
+      <w:r>
+        <w:t>fp_events_total</w:t>
+      </w:r>
+      <w:proofErr w:type="spellEnd"/>
+      <w:r>
+        <w:t>{outcome=</w:t>
+      </w:r>
+      <w:proofErr w:type="spellStart"/>
+      <w:r>
+        <w:t>ok|late|duplicate|dlq</w:t>
+      </w:r>
+      <w:proofErr w:type="spellEnd"/>
+      <w:r>
+        <w:t xml:space="preserve">}, </w:t>
+      </w:r>
+      <w:proofErr w:type="spellStart"/>
+      <w:r>
+        <w:t>fp_ingest_latency_seconds</w:t>
+      </w:r>
+      <w:proofErr w:type="spellEnd"/>
+      <w:r>
+        <w:t xml:space="preserve"> (vehicle timestamp → processed), </w:t>
+      </w:r>
+      <w:proofErr w:type="spellStart"/>
+      <w:r>
+        <w:t>fp_alerts_total</w:t>
+      </w:r>
+      <w:proofErr w:type="spellEnd"/>
+      <w:r>
+        <w:t xml:space="preserve">{rule}, </w:t>
+      </w:r>
+      <w:proofErr w:type="spellStart"/>
+      <w:r>
+        <w:t>fp_batch_seconds</w:t>
+      </w:r>
+      <w:proofErr w:type="spellEnd"/>
+      <w:r>
+        <w:t xml:space="preserve">, </w:t>
+      </w:r>
+      <w:proofErr w:type="spellStart"/>
+      <w:r>
+        <w:t>fp_api_latency_seconds</w:t>
+      </w:r>
+      <w:proofErr w:type="spellEnd"/>
+      <w:r>
+        <w:t>{route}. docker compose --profile observability starts Prometheus and Grafana with a provisioned “</w:t>
+      </w:r>
+      <w:proofErr w:type="spellStart"/>
+      <w:r>
+        <w:t>FleetPulse</w:t>
+      </w:r>
+      <w:proofErr w:type="spellEnd"/>
+      <w:r>
+        <w:t xml:space="preserve"> pipeline” dashboard (events/s by outcome, ingest latency p50/p95/p99, alerts by rule, batch time, API p95 by route, Kafka ingest rate). Consumer lag comes from </w:t>
+      </w:r>
+      <w:proofErr w:type="spellStart"/>
+      <w:r>
+        <w:t>rpk</w:t>
+      </w:r>
+      <w:proofErr w:type="spellEnd"/>
+      <w:r>
+        <w:t xml:space="preserve"> group describe / the Kafka exporter. Logs are structured </w:t>
+      </w:r>
+      <w:proofErr w:type="spellStart"/>
+      <w:r>
+        <w:t>stdout</w:t>
+      </w:r>
+      <w:proofErr w:type="spellEnd"/>
+      <w:r>
+        <w:t xml:space="preserve"> collected by the platform (Loki/ELK). The dashboard itself shows live events/s and measured alert latency.</w:t>
       </w:r>
     </w:p>
     <w:p>
@@ -12867,7 +14564,7 @@
                     <pic:cNvPicPr/>
                   </pic:nvPicPr>
                   <pic:blipFill>
-                    <a:blip r:embed="rId11"/>
+                    <a:blip r:embed="rId14"/>
                     <a:stretch>
                       <a:fillRect/>
                     </a:stretch>
@@ -12893,10 +14590,39 @@
         <w:spacing w:before="60" w:after="200" w:line="300" w:lineRule="auto"/>
       </w:pPr>
       <w:r>
-        <w:t>Troubleshooting a latency spike: (1) Grafana: is fp_api_latency p95 up for one route or all? (2) If all, check pod CPU and the Postgres connection pool; if one route, run EXPLAIN ANALYZE on its query (as in 5.3). (3) For alert latency, compare fp_ingest_latency with consumer lag: rising lag means processors are saturated, so scale replicas up to the partition count; flat lag but slow batches (fp_batch_seconds) points to Postgres writes. (4) Correlate with simulator burst logs. OpenTelemetry tracing across s</w:t>
-      </w:r>
-      <w:r>
-        <w:t>ervices is the next step.</w:t>
+        <w:t xml:space="preserve">Troubleshooting a latency spike: (1) Grafana: is </w:t>
+      </w:r>
+      <w:proofErr w:type="spellStart"/>
+      <w:r>
+        <w:t>fp_api_latency</w:t>
+      </w:r>
+      <w:proofErr w:type="spellEnd"/>
+      <w:r>
+        <w:t xml:space="preserve"> p95 up for one route or all? (2) If all, check pod CPU and the Postgres connection pool; if one route, run EXPLAIN ANALYZE on its query (as in 5.3). (3) For alert latency, compare </w:t>
+      </w:r>
+      <w:proofErr w:type="spellStart"/>
+      <w:r>
+        <w:t>fp_ingest_latency</w:t>
+      </w:r>
+      <w:proofErr w:type="spellEnd"/>
+      <w:r>
+        <w:t xml:space="preserve"> with consumer lag: rising lag means processors are saturated, so scale replicas up to the partition count; flat lag but slow batches (</w:t>
+      </w:r>
+      <w:proofErr w:type="spellStart"/>
+      <w:r>
+        <w:t>fp_batch_seconds</w:t>
+      </w:r>
+      <w:proofErr w:type="spellEnd"/>
+      <w:r>
+        <w:t xml:space="preserve">) points to Postgres writes. (4) Correlate with simulator burst logs. </w:t>
+      </w:r>
+      <w:proofErr w:type="spellStart"/>
+      <w:r>
+        <w:t>OpenTelemetry</w:t>
+      </w:r>
+      <w:proofErr w:type="spellEnd"/>
+      <w:r>
+        <w:t xml:space="preserve"> tracing across services is the next step.</w:t>
       </w:r>
     </w:p>
     <w:p>
@@ -13034,14 +14760,19 @@
         <w:t xml:space="preserve">Data and features: </w:t>
       </w:r>
       <w:r>
-        <w:t xml:space="preserve">100,000 simulated vehicle-weeks from the same wear model as the live simulator; features: service-overdue ratio, age, odometer, max coolant (7 d), min 12 V (7 d), fault-code events (7 d), harsh brakes (7 d), EV / hybrid flags. Live features come from the vehicle_daily rollup, which the batch job maintains incrementally (only rows since the last watermark are read, each counted exactly </w:t>
+        <w:t xml:space="preserve">100,000 simulated vehicle-weeks from the same wear model as the live simulator; features: service-overdue ratio, age, odometer, max coolant (7 d), min 12 V (7 d), fault-code events (7 d), harsh brakes (7 d), EV / hybrid flags. Live features come from the </w:t>
+      </w:r>
+      <w:proofErr w:type="spellStart"/>
+      <w:r>
+        <w:t>vehicle_daily</w:t>
+      </w:r>
+      <w:proofErr w:type="spellEnd"/>
+      <w:r>
+        <w:t xml:space="preserve"> rollup, which the batch job maintains incrementally (only rows since the last watermark are read, each counted exactly </w:t>
       </w:r>
       <w:r>
         <w:lastRenderedPageBreak/>
-        <w:t>once). Leakage check: the label is drawn from a hazard on the hidden wear, which is never a feature; only noisy symptoms are</w:t>
-      </w:r>
-      <w:r>
-        <w:t>.</w:t>
+        <w:t>once). Leakage check: the label is drawn from a hazard on the hidden wear, which is never a feature; only noisy symptoms are.</w:t>
       </w:r>
     </w:p>
     <w:p>
@@ -13055,7 +14786,23 @@
         <w:t xml:space="preserve">Model: </w:t>
       </w:r>
       <w:r>
-        <w:t>scikit-learn HistGradientBoostingClassifier (200 iterations); per-vehicle explanations from importance-weighted deviation from the fleet median. Vector store: pgvector HNSW over a fault/repair knowledge base, embedded with a dependency-free hashed n-gram embedding so it runs offline.</w:t>
+        <w:t xml:space="preserve">scikit-learn </w:t>
+      </w:r>
+      <w:proofErr w:type="spellStart"/>
+      <w:r>
+        <w:t>HistGradientBoostingClassifier</w:t>
+      </w:r>
+      <w:proofErr w:type="spellEnd"/>
+      <w:r>
+        <w:t xml:space="preserve"> (200 iterations); per-vehicle explanations from importance-weighted deviation from the fleet median. Vector store: </w:t>
+      </w:r>
+      <w:proofErr w:type="spellStart"/>
+      <w:r>
+        <w:t>pgvector</w:t>
+      </w:r>
+      <w:proofErr w:type="spellEnd"/>
+      <w:r>
+        <w:t xml:space="preserve"> HNSW over a fault/repair knowledge base, embedded with a dependency-free hashed n-gram embedding so it runs offline.</w:t>
       </w:r>
     </w:p>
     <w:tbl>
@@ -13578,7 +15325,63 @@
         <w:t xml:space="preserve">Agent: </w:t>
       </w:r>
       <w:r>
-        <w:t>six tools (top_risk, vehicle_summary, open_alerts, search_knowledge, estimate_savings, propose_work_order), all filtered by the caller's tenant. Planner: Claude tool-use if ANTHROPIC_API_KEY is set, else a deterministic intent router. Guardrails: injection screen, max 6 tool calls, VIN grounding check, propose-only actions requiring human approval, every tool call audited as agent:&lt;user&gt;. Cost/latency: deterministic mode ~20–40 ms and US$0; LLM mode is a few model calls per question.</w:t>
+        <w:t>six tools (</w:t>
+      </w:r>
+      <w:proofErr w:type="spellStart"/>
+      <w:r>
+        <w:t>top_risk</w:t>
+      </w:r>
+      <w:proofErr w:type="spellEnd"/>
+      <w:r>
+        <w:t xml:space="preserve">, </w:t>
+      </w:r>
+      <w:proofErr w:type="spellStart"/>
+      <w:r>
+        <w:t>vehicle_summary</w:t>
+      </w:r>
+      <w:proofErr w:type="spellEnd"/>
+      <w:r>
+        <w:t xml:space="preserve">, </w:t>
+      </w:r>
+      <w:proofErr w:type="spellStart"/>
+      <w:r>
+        <w:t>open_alerts</w:t>
+      </w:r>
+      <w:proofErr w:type="spellEnd"/>
+      <w:r>
+        <w:t xml:space="preserve">, </w:t>
+      </w:r>
+      <w:proofErr w:type="spellStart"/>
+      <w:r>
+        <w:t>search_knowledge</w:t>
+      </w:r>
+      <w:proofErr w:type="spellEnd"/>
+      <w:r>
+        <w:t xml:space="preserve">, </w:t>
+      </w:r>
+      <w:proofErr w:type="spellStart"/>
+      <w:r>
+        <w:t>estimate_savings</w:t>
+      </w:r>
+      <w:proofErr w:type="spellEnd"/>
+      <w:r>
+        <w:t xml:space="preserve">, </w:t>
+      </w:r>
+      <w:proofErr w:type="spellStart"/>
+      <w:r>
+        <w:t>propose_work_order</w:t>
+      </w:r>
+      <w:proofErr w:type="spellEnd"/>
+      <w:r>
+        <w:t xml:space="preserve">), all filtered by the caller's tenant. Planner: Claude tool-use if ANTHROPIC_API_KEY is set, else a deterministic intent router. Guardrails: injection screen, max 6 tool calls, VIN grounding check, propose-only actions requiring human approval, every tool call audited as agent:&lt;user&gt;. Cost/latency: deterministic mode ~20–40 </w:t>
+      </w:r>
+      <w:proofErr w:type="spellStart"/>
+      <w:r>
+        <w:t>ms</w:t>
+      </w:r>
+      <w:proofErr w:type="spellEnd"/>
+      <w:r>
+        <w:t xml:space="preserve"> and US$0; LLM mode is a few model calls per question.</w:t>
       </w:r>
     </w:p>
     <w:p>
@@ -13659,10 +15462,32 @@
         <w:rPr>
           <w:b/>
         </w:rPr>
-        <w:t xml:space="preserve">ADRs (docs/adr): </w:t>
-      </w:r>
-      <w:r>
-        <w:t>0001 Kafka as telemetry backbone (replay, per-VIN ordering, DLQ); 0002 polyglot persistence (Postgres 3NF + day-partitioned telemetry + pgvector, Redis for hot state); 0003 CAP/PACELC per data class and effectively-once delivery; 0004 single Python image with batch hot path and a deterministic-first copilot.</w:t>
+        <w:t>ADRs (docs/</w:t>
+      </w:r>
+      <w:proofErr w:type="spellStart"/>
+      <w:r>
+        <w:rPr>
+          <w:b/>
+        </w:rPr>
+        <w:t>adr</w:t>
+      </w:r>
+      <w:proofErr w:type="spellEnd"/>
+      <w:r>
+        <w:rPr>
+          <w:b/>
+        </w:rPr>
+        <w:t xml:space="preserve">): </w:t>
+      </w:r>
+      <w:r>
+        <w:t xml:space="preserve">0001 Kafka as telemetry backbone (replay, per-VIN ordering, DLQ); 0002 polyglot persistence (Postgres 3NF + day-partitioned telemetry + </w:t>
+      </w:r>
+      <w:proofErr w:type="spellStart"/>
+      <w:r>
+        <w:t>pgvector</w:t>
+      </w:r>
+      <w:proofErr w:type="spellEnd"/>
+      <w:r>
+        <w:t>, Redis for hot state); 0003 CAP/PACELC per data class and effectively-once delivery; 0004 single Python image with batch hot path and a deterministic-first copilot.</w:t>
       </w:r>
     </w:p>
     <w:p>
@@ -13676,7 +15501,15 @@
         <w:t xml:space="preserve">Risks and shortcuts: </w:t>
       </w:r>
       <w:r>
-        <w:t>100K events/s not proven end to end: on one laptop the pipeline sustains ~24K events/s with zero loss and Kafka absorbs 69K/s, with a single Postgres primary as the ceiling; 100K/s needs the telemetry store beyond one Postgres primary (ADR-0002). mTLS, OIDC and Vault are designed, not running. The model is validated on simulated data only. Terraform is unapplied. Bloom state is per process and lost on restart (DB constraints keep correctness).</w:t>
+        <w:t xml:space="preserve">100K events/s not proven end to end: on one laptop the pipeline sustains ~24K events/s with zero loss and Kafka absorbs 69K/s, with a single Postgres primary as the ceiling; 100K/s needs the telemetry store beyond one Postgres primary (ADR-0002). </w:t>
+      </w:r>
+      <w:proofErr w:type="spellStart"/>
+      <w:r>
+        <w:t>mTLS</w:t>
+      </w:r>
+      <w:proofErr w:type="spellEnd"/>
+      <w:r>
+        <w:t>, OIDC and Vault are designed, not running. The model is validated on simulated data only. Terraform is unapplied. Bloom state is per process and lost on restart (DB constraints keep correctness).</w:t>
       </w:r>
     </w:p>
     <w:p>
@@ -13690,7 +15523,23 @@
         <w:t xml:space="preserve">Next three steps to pilot: </w:t>
       </w:r>
       <w:r>
-        <w:t>(1) move raw telemetry to ClickHouse or Scylla with Parquet cold storage and run a 100K events/s k6/Kafka load test on EKS; (2) Avro + schema registry and mTLS device identity; (3) retrain on a real pilot fleet's maintenance history and add survival-analysis time-to-failure.</w:t>
+        <w:t xml:space="preserve">(1) move raw telemetry to </w:t>
+      </w:r>
+      <w:proofErr w:type="spellStart"/>
+      <w:r>
+        <w:t>ClickHouse</w:t>
+      </w:r>
+      <w:proofErr w:type="spellEnd"/>
+      <w:r>
+        <w:t xml:space="preserve"> or Scylla with Parquet cold storage and run a 100K events/s k6/Kafka load test on EKS; (2) Avro + schema registry and </w:t>
+      </w:r>
+      <w:proofErr w:type="spellStart"/>
+      <w:r>
+        <w:t>mTLS</w:t>
+      </w:r>
+      <w:proofErr w:type="spellEnd"/>
+      <w:r>
+        <w:t xml:space="preserve"> device identity; (3) retrain on a real pilot fleet's maintenance history and add survival-analysis time-to-failure.</w:t>
       </w:r>
     </w:p>
     <w:p>
@@ -13927,7 +15776,15 @@
               <w:spacing w:line="260" w:lineRule="auto"/>
             </w:pPr>
             <w:r>
-              <w:t>US$2,400 per breakdown, ~2,800 a week at 100K vehicles; FleetPulse predicts and flags faults in under a second</w:t>
+              <w:t xml:space="preserve">US$2,400 per breakdown, ~2,800 a week at 100K vehicles; </w:t>
+            </w:r>
+            <w:proofErr w:type="spellStart"/>
+            <w:r>
+              <w:t>FleetPulse</w:t>
+            </w:r>
+            <w:proofErr w:type="spellEnd"/>
+            <w:r>
+              <w:t xml:space="preserve"> predicts and flags faults in under a second</w:t>
             </w:r>
           </w:p>
         </w:tc>
@@ -14013,7 +15870,15 @@
               <w:spacing w:line="260" w:lineRule="auto"/>
             </w:pPr>
             <w:r>
-              <w:t>Simulator → Kafka → processors → Postgres / Redis / pgvector; batch rollup + ML scoring</w:t>
+              <w:t xml:space="preserve">Simulator → Kafka → processors → Postgres / Redis / </w:t>
+            </w:r>
+            <w:proofErr w:type="spellStart"/>
+            <w:r>
+              <w:t>pgvector</w:t>
+            </w:r>
+            <w:proofErr w:type="spellEnd"/>
+            <w:r>
+              <w:t>; batch rollup + ML scoring</w:t>
             </w:r>
           </w:p>
         </w:tc>
@@ -14443,7 +16308,23 @@
               <w:spacing w:line="260" w:lineRule="auto"/>
             </w:pPr>
             <w:r>
-              <w:t>Green CI (unit 98%, integration, contract, BDD, ZAP, Trivy, chaos, K8s on kind); 25K/s zero-loss load test; API p95 110 ms @50; 45-min soak</w:t>
+              <w:t xml:space="preserve">Green CI (unit 98%, integration, contract, BDD, ZAP, </w:t>
+            </w:r>
+            <w:proofErr w:type="spellStart"/>
+            <w:r>
+              <w:t>Trivy</w:t>
+            </w:r>
+            <w:proofErr w:type="spellEnd"/>
+            <w:r>
+              <w:t xml:space="preserve">, chaos, K8s on kind); 25K/s zero-loss load test; API p95 110 </w:t>
+            </w:r>
+            <w:proofErr w:type="spellStart"/>
+            <w:r>
+              <w:t>ms</w:t>
+            </w:r>
+            <w:proofErr w:type="spellEnd"/>
+            <w:r>
+              <w:t xml:space="preserve"> @50; 45-min soak</w:t>
             </w:r>
           </w:p>
         </w:tc>
@@ -14529,7 +16410,15 @@
               <w:spacing w:line="260" w:lineRule="auto"/>
             </w:pPr>
             <w:r>
-              <w:t>Impact, next steps (ClickHouse for 100K/s, SSO, device certificates)</w:t>
+              <w:t>Impact, next steps (</w:t>
+            </w:r>
+            <w:proofErr w:type="spellStart"/>
+            <w:r>
+              <w:t>ClickHouse</w:t>
+            </w:r>
+            <w:proofErr w:type="spellEnd"/>
+            <w:r>
+              <w:t xml:space="preserve"> for 100K/s, SSO, device certificates)</w:t>
             </w:r>
           </w:p>
         </w:tc>
@@ -14660,7 +16549,15 @@
         <w:t xml:space="preserve">Hygiene: </w:t>
       </w:r>
       <w:r>
-        <w:t>No secrets committed, .env.example provided, commits from all members</w:t>
+        <w:t>No secrets committed, .</w:t>
+      </w:r>
+      <w:proofErr w:type="spellStart"/>
+      <w:r>
+        <w:t>env.example</w:t>
+      </w:r>
+      <w:proofErr w:type="spellEnd"/>
+      <w:r>
+        <w:t xml:space="preserve"> provided, commits from all members</w:t>
       </w:r>
     </w:p>
     <w:p>
@@ -14837,8 +16734,109 @@
         </w:rPr>
         <w:t xml:space="preserve">Open-source components: </w:t>
       </w:r>
-      <w:r>
-        <w:t>FastAPI (MIT), Uvicorn (BSD), Pydantic (MIT), psycopg 3 (LGPL), redis-py (MIT), confluent-kafka / librdkafka (Apache-2.0 / BSD), scikit-learn (BSD), NumPy (BSD), joblib (BSD), PyJWT (MIT), prometheus-client (Apache-2.0), anthropic SDK (MIT), Leaflet (BSD-2), pytest-bdd (MIT), Esri World Dark Gray Canvas map tiles (Esri terms, attributed in the UI), PostgreSQL (PostgreSQL licence), pgvector (PostgreSQL licence), Redis 7 (BSD), Redpanda (BSL, dev only), Prometheus and Grafana (Apache-2.0 / AGPL).</w:t>
+      <w:proofErr w:type="spellStart"/>
+      <w:r>
+        <w:t>FastAPI</w:t>
+      </w:r>
+      <w:proofErr w:type="spellEnd"/>
+      <w:r>
+        <w:t xml:space="preserve"> (MIT), </w:t>
+      </w:r>
+      <w:proofErr w:type="spellStart"/>
+      <w:r>
+        <w:t>Uvicorn</w:t>
+      </w:r>
+      <w:proofErr w:type="spellEnd"/>
+      <w:r>
+        <w:t xml:space="preserve"> (BSD), </w:t>
+      </w:r>
+      <w:proofErr w:type="spellStart"/>
+      <w:r>
+        <w:t>Pydantic</w:t>
+      </w:r>
+      <w:proofErr w:type="spellEnd"/>
+      <w:r>
+        <w:t xml:space="preserve"> (MIT), </w:t>
+      </w:r>
+      <w:proofErr w:type="spellStart"/>
+      <w:r>
+        <w:t>psycopg</w:t>
+      </w:r>
+      <w:proofErr w:type="spellEnd"/>
+      <w:r>
+        <w:t xml:space="preserve"> 3 (LGPL), </w:t>
+      </w:r>
+      <w:proofErr w:type="spellStart"/>
+      <w:r>
+        <w:t>redis-py</w:t>
+      </w:r>
+      <w:proofErr w:type="spellEnd"/>
+      <w:r>
+        <w:t xml:space="preserve"> (MIT), confluent-</w:t>
+      </w:r>
+      <w:proofErr w:type="spellStart"/>
+      <w:r>
+        <w:t>kafka</w:t>
+      </w:r>
+      <w:proofErr w:type="spellEnd"/>
+      <w:r>
+        <w:t xml:space="preserve"> / </w:t>
+      </w:r>
+      <w:proofErr w:type="spellStart"/>
+      <w:r>
+        <w:t>librdkafka</w:t>
+      </w:r>
+      <w:proofErr w:type="spellEnd"/>
+      <w:r>
+        <w:t xml:space="preserve"> (Apache-2.0 / BSD), scikit-learn (BSD), NumPy (BSD), </w:t>
+      </w:r>
+      <w:proofErr w:type="spellStart"/>
+      <w:r>
+        <w:t>joblib</w:t>
+      </w:r>
+      <w:proofErr w:type="spellEnd"/>
+      <w:r>
+        <w:t xml:space="preserve"> (BSD), </w:t>
+      </w:r>
+      <w:proofErr w:type="spellStart"/>
+      <w:r>
+        <w:t>PyJWT</w:t>
+      </w:r>
+      <w:proofErr w:type="spellEnd"/>
+      <w:r>
+        <w:t xml:space="preserve"> (MIT), </w:t>
+      </w:r>
+      <w:proofErr w:type="spellStart"/>
+      <w:r>
+        <w:t>prometheus</w:t>
+      </w:r>
+      <w:proofErr w:type="spellEnd"/>
+      <w:r>
+        <w:t xml:space="preserve">-client (Apache-2.0), anthropic SDK (MIT), Leaflet (BSD-2), </w:t>
+      </w:r>
+      <w:proofErr w:type="spellStart"/>
+      <w:r>
+        <w:t>pytest-bdd</w:t>
+      </w:r>
+      <w:proofErr w:type="spellEnd"/>
+      <w:r>
+        <w:t xml:space="preserve"> (MIT), Esri World Dark Gray Canvas map tiles (Esri terms, attributed in the UI), PostgreSQL (PostgreSQL licence), </w:t>
+      </w:r>
+      <w:proofErr w:type="spellStart"/>
+      <w:r>
+        <w:t>pgvector</w:t>
+      </w:r>
+      <w:proofErr w:type="spellEnd"/>
+      <w:r>
+        <w:t xml:space="preserve"> (PostgreSQL licence), Redis 7 (BSD), </w:t>
+      </w:r>
+      <w:proofErr w:type="spellStart"/>
+      <w:r>
+        <w:t>Redpanda</w:t>
+      </w:r>
+      <w:proofErr w:type="spellEnd"/>
+      <w:r>
+        <w:t xml:space="preserve"> (BSL, dev only), Prometheus and Grafana (Apache-2.0 / AGPL).</w:t>
       </w:r>
     </w:p>
     <w:p>
@@ -14935,7 +16933,31 @@
       </w:r>
       <w:r>
         <w:lastRenderedPageBreak/>
-        <w:t>vehicle_drawer.png; fleetpulse/ml/metrics.json; docs/threat-model.md; docs/adr/*.md; docs/demo-script.md.</w:t>
+        <w:t xml:space="preserve">vehicle_drawer.png; </w:t>
+      </w:r>
+      <w:proofErr w:type="spellStart"/>
+      <w:r>
+        <w:t>fleetpulse</w:t>
+      </w:r>
+      <w:proofErr w:type="spellEnd"/>
+      <w:r>
+        <w:t>/ml/</w:t>
+      </w:r>
+      <w:proofErr w:type="spellStart"/>
+      <w:r>
+        <w:t>metrics.json</w:t>
+      </w:r>
+      <w:proofErr w:type="spellEnd"/>
+      <w:r>
+        <w:t>; docs/threat-model.md; docs/</w:t>
+      </w:r>
+      <w:proofErr w:type="spellStart"/>
+      <w:r>
+        <w:t>adr</w:t>
+      </w:r>
+      <w:proofErr w:type="spellEnd"/>
+      <w:r>
+        <w:t>/*.md; docs/demo-script.md.</w:t>
       </w:r>
     </w:p>
     <w:p>
@@ -14967,7 +16989,7 @@
                     <pic:cNvPicPr/>
                   </pic:nvPicPr>
                   <pic:blipFill>
-                    <a:blip r:embed="rId10"/>
+                    <a:blip r:embed="rId13"/>
                     <a:stretch>
                       <a:fillRect/>
                     </a:stretch>
@@ -14998,12 +17020,28 @@
         <w:spacing w:after="90" w:line="290" w:lineRule="auto"/>
       </w:pPr>
       <w:r>
-        <w:t>References: Connected Vehicle Intelligence Hackathon problem statement (Talenciaglobal, 2026); SAE J2012 (DTC definitions); ISO 3779 / NHTSA 49 CFR 565 (VIN check digit); Kafka documentation (idempotent producer, consumer groups); PostgreSQL 16 declarative partitioning; pgvector HNSW.</w:t>
+        <w:t>References: Connected Vehicle Intelligence Hackathon problem statement (</w:t>
+      </w:r>
+      <w:proofErr w:type="spellStart"/>
+      <w:r>
+        <w:t>Talenciaglobal</w:t>
+      </w:r>
+      <w:proofErr w:type="spellEnd"/>
+      <w:r>
+        <w:t xml:space="preserve">, 2026); SAE J2012 (DTC definitions); ISO 3779 / NHTSA 49 CFR 565 (VIN check digit); Kafka documentation (idempotent producer, consumer groups); PostgreSQL 16 declarative partitioning; </w:t>
+      </w:r>
+      <w:proofErr w:type="spellStart"/>
+      <w:r>
+        <w:t>pgvector</w:t>
+      </w:r>
+      <w:proofErr w:type="spellEnd"/>
+      <w:r>
+        <w:t xml:space="preserve"> HNSW.</w:t>
       </w:r>
     </w:p>
     <w:sectPr>
-      <w:headerReference w:type="default" r:id="rId12"/>
-      <w:footerReference w:type="default" r:id="rId13"/>
+      <w:headerReference w:type="default" r:id="rId15"/>
+      <w:footerReference w:type="default" r:id="rId16"/>
       <w:pgSz w:w="11906" w:h="16838"/>
       <w:pgMar w:top="1440" w:right="1300" w:bottom="1300" w:left="1300" w:header="600" w:footer="600" w:gutter="0"/>
       <w:cols w:space="720"/>
@@ -16064,6 +18102,18 @@
     <w:uiPriority w:val="99"/>
     <w:rsid w:val="000142AF"/>
   </w:style>
+  <w:style w:type="character" w:styleId="UnresolvedMention">
+    <w:name w:val="Unresolved Mention"/>
+    <w:basedOn w:val="DefaultParagraphFont"/>
+    <w:uiPriority w:val="99"/>
+    <w:semiHidden/>
+    <w:unhideWhenUsed/>
+    <w:rsid w:val="00675D24"/>
+    <w:rPr>
+      <w:color w:val="605E5C"/>
+      <w:shd w:val="clear" w:color="auto" w:fill="E1DFDD"/>
+    </w:rPr>
+  </w:style>
 </w:styles>
 </file>
 

</xml_diff>